<commit_message>
Completar casos de uso
</commit_message>
<xml_diff>
--- a/Documentos/Entregas TP/Lista Casos de Usos.docx
+++ b/Documentos/Entregas TP/Lista Casos de Usos.docx
@@ -5,32 +5,29 @@
     <w:p>
       <w:pPr>
         <w:pStyle w:val="Title"/>
-        <w:jc w:val="center"/>
       </w:pPr>
       <w:r>
-        <w:t>Sistema de Turnos para Lavadero</w:t>
+        <w:t>Sistema de turnos para lavadero</w:t>
       </w:r>
     </w:p>
     <w:p>
       <w:pPr>
-        <w:jc w:val="center"/>
+        <w:pStyle w:val="Subtitle"/>
       </w:pPr>
       <w:r>
-        <w:rPr>
-          <w:rFonts w:ascii="Arial" w:hAnsi="Arial"/>
-          <w:b/>
-          <w:sz w:val="26"/>
-        </w:rPr>
-        <w:t>Actores alcance y Casos de Uso</w:t>
+        <w:t>Actores alcance y casos de uso</w:t>
       </w:r>
     </w:p>
-    <w:p/>
     <w:p>
-      <w:pPr>
-        <w:jc w:val="both"/>
-      </w:pPr>
       <w:r>
-        <w:t>Este documento define el límite funcional inicial del sistema. Los actores, permisos, reglas y Casos de Uso aquí resumidos son coherentes con las especificaciones técnicas individuales almacenadas en la carpeta Documentos/Entregas TP.</w:t>
+        <w:t>Grupo 9 · Tomás Martín Ponce y Juan Jesús Baigorria</w:t>
+        <w:br/>
+        <w:t>Prácticas Profesionalizantes I · TSDS · 2026</w:t>
+      </w:r>
+    </w:p>
+    <w:p>
+      <w:r>
+        <w:t>Este documento resume el alcance y los trece casos de uso del sistema. Las especificaciones detalladas, los contratos HTTP y las pruebas asociadas se encuentran en los archivos Markdown de Documentos/Entregas TP.</w:t>
       </w:r>
     </w:p>
     <w:p>
@@ -43,41 +40,36 @@
     </w:p>
     <w:tbl>
       <w:tblPr>
-        <w:tblStyle w:val="TableGrid"/>
         <w:tblW w:type="auto" w:w="0"/>
         <w:jc w:val="center"/>
+        <w:tblLayout w:type="fixed"/>
         <w:tblLook w:firstColumn="1" w:firstRow="1" w:lastColumn="0" w:lastRow="0" w:noHBand="0" w:noVBand="1" w:val="04A0"/>
       </w:tblPr>
       <w:tblGrid>
-        <w:gridCol w:w="5040"/>
-        <w:gridCol w:w="5040"/>
+        <w:gridCol w:w="1872"/>
+        <w:gridCol w:w="8064"/>
       </w:tblGrid>
       <w:tr>
-        <w:trPr>
-          <w:tblHeader w:val="true"/>
-        </w:trPr>
         <w:tc>
           <w:tcPr>
-            <w:tcW w:type="dxa" w:w="2232"/>
+            <w:tcW w:type="dxa" w:w="1872"/>
             <w:vAlign w:val="center"/>
-            <w:tcMar>
-              <w:top w:w="100" w:type="dxa"/>
-              <w:start w:w="120" w:type="dxa"/>
-              <w:bottom w:w="100" w:type="dxa"/>
-              <w:end w:w="120" w:type="dxa"/>
-            </w:tcMar>
-            <w:shd w:fill="1F4E78"/>
+            <w:shd w:fill="E7EBEF"/>
+            <w:tcBorders>
+              <w:top w:val="single" w:sz="4" w:color="D9D9D9"/>
+              <w:left w:val="single" w:sz="4" w:color="D9D9D9"/>
+              <w:bottom w:val="single" w:sz="4" w:color="D9D9D9"/>
+              <w:right w:val="single" w:sz="4" w:color="D9D9D9"/>
+            </w:tcBorders>
           </w:tcPr>
           <w:p>
             <w:pPr>
-              <w:spacing w:after="40" w:before="40"/>
+              <w:spacing w:before="80" w:after="80"/>
             </w:pPr>
             <w:r>
               <w:rPr>
-                <w:rFonts w:ascii="Arial" w:hAnsi="Arial"/>
                 <w:b/>
-                <w:color w:val="FFFFFF"/>
-                <w:sz w:val="19"/>
+                <w:sz w:val="20"/>
               </w:rPr>
               <w:t>Actor</w:t>
             </w:r>
@@ -85,26 +77,24 @@
         </w:tc>
         <w:tc>
           <w:tcPr>
-            <w:tcW w:type="dxa" w:w="7848"/>
+            <w:tcW w:type="dxa" w:w="8064"/>
             <w:vAlign w:val="center"/>
-            <w:tcMar>
-              <w:top w:w="100" w:type="dxa"/>
-              <w:start w:w="120" w:type="dxa"/>
-              <w:bottom w:w="100" w:type="dxa"/>
-              <w:end w:w="120" w:type="dxa"/>
-            </w:tcMar>
-            <w:shd w:fill="1F4E78"/>
+            <w:shd w:fill="E7EBEF"/>
+            <w:tcBorders>
+              <w:top w:val="single" w:sz="4" w:color="D9D9D9"/>
+              <w:left w:val="single" w:sz="4" w:color="D9D9D9"/>
+              <w:bottom w:val="single" w:sz="4" w:color="D9D9D9"/>
+              <w:right w:val="single" w:sz="4" w:color="D9D9D9"/>
+            </w:tcBorders>
           </w:tcPr>
           <w:p>
             <w:pPr>
-              <w:spacing w:after="40" w:before="40"/>
+              <w:spacing w:before="80" w:after="80"/>
             </w:pPr>
             <w:r>
               <w:rPr>
-                <w:rFonts w:ascii="Arial" w:hAnsi="Arial"/>
                 <w:b/>
-                <w:color w:val="FFFFFF"/>
-                <w:sz w:val="19"/>
+                <w:sz w:val="20"/>
               </w:rPr>
               <w:t>Responsabilidades</w:t>
             </w:r>
@@ -114,23 +104,24 @@
       <w:tr>
         <w:tc>
           <w:tcPr>
-            <w:tcW w:type="dxa" w:w="2232"/>
+            <w:tcW w:type="dxa" w:w="1872"/>
             <w:vAlign w:val="center"/>
-            <w:tcMar>
-              <w:top w:w="100" w:type="dxa"/>
-              <w:start w:w="120" w:type="dxa"/>
-              <w:bottom w:w="100" w:type="dxa"/>
-              <w:end w:w="120" w:type="dxa"/>
-            </w:tcMar>
+            <w:shd w:fill="FFFFFF"/>
+            <w:tcBorders>
+              <w:top w:val="single" w:sz="4" w:color="D9D9D9"/>
+              <w:left w:val="single" w:sz="4" w:color="D9D9D9"/>
+              <w:bottom w:val="single" w:sz="4" w:color="D9D9D9"/>
+              <w:right w:val="single" w:sz="4" w:color="D9D9D9"/>
+            </w:tcBorders>
           </w:tcPr>
           <w:p>
             <w:pPr>
-              <w:spacing w:after="40" w:before="40"/>
+              <w:spacing w:before="80" w:after="80"/>
             </w:pPr>
             <w:r>
               <w:rPr>
-                <w:rFonts w:ascii="Arial" w:hAnsi="Arial"/>
-                <w:sz w:val="19"/>
+                <w:b w:val="0"/>
+                <w:sz w:val="20"/>
               </w:rPr>
               <w:t>Cliente</w:t>
             </w:r>
@@ -138,25 +129,26 @@
         </w:tc>
         <w:tc>
           <w:tcPr>
-            <w:tcW w:type="dxa" w:w="7848"/>
+            <w:tcW w:type="dxa" w:w="8064"/>
             <w:vAlign w:val="center"/>
-            <w:tcMar>
-              <w:top w:w="100" w:type="dxa"/>
-              <w:start w:w="120" w:type="dxa"/>
-              <w:bottom w:w="100" w:type="dxa"/>
-              <w:end w:w="120" w:type="dxa"/>
-            </w:tcMar>
+            <w:shd w:fill="FFFFFF"/>
+            <w:tcBorders>
+              <w:top w:val="single" w:sz="4" w:color="D9D9D9"/>
+              <w:left w:val="single" w:sz="4" w:color="D9D9D9"/>
+              <w:bottom w:val="single" w:sz="4" w:color="D9D9D9"/>
+              <w:right w:val="single" w:sz="4" w:color="D9D9D9"/>
+            </w:tcBorders>
           </w:tcPr>
           <w:p>
             <w:pPr>
-              <w:spacing w:after="40" w:before="40"/>
+              <w:spacing w:before="80" w:after="80"/>
             </w:pPr>
             <w:r>
               <w:rPr>
-                <w:rFonts w:ascii="Arial" w:hAnsi="Arial"/>
-                <w:sz w:val="19"/>
+                <w:b w:val="0"/>
+                <w:sz w:val="20"/>
               </w:rPr>
-              <w:t>Solicitar, consultar, modificar y cancelar únicamente sus propios turnos; consultar servicios y recibir recordatorios.</w:t>
+              <w:t>Registrarse e iniciar sesión. Consultar servicios, disponibilidad y turnos propios. Solicitar, modificar y cancelar sus turnos. Actualizar sus datos y preferencias.</w:t>
             </w:r>
           </w:p>
         </w:tc>
@@ -164,24 +156,24 @@
       <w:tr>
         <w:tc>
           <w:tcPr>
-            <w:tcW w:type="dxa" w:w="2232"/>
+            <w:tcW w:type="dxa" w:w="1872"/>
             <w:vAlign w:val="center"/>
-            <w:tcMar>
-              <w:top w:w="100" w:type="dxa"/>
-              <w:start w:w="120" w:type="dxa"/>
-              <w:bottom w:w="100" w:type="dxa"/>
-              <w:end w:w="120" w:type="dxa"/>
-            </w:tcMar>
-            <w:shd w:fill="EAF2F8"/>
+            <w:shd w:fill="FFFFFF"/>
+            <w:tcBorders>
+              <w:top w:val="single" w:sz="4" w:color="D9D9D9"/>
+              <w:left w:val="single" w:sz="4" w:color="D9D9D9"/>
+              <w:bottom w:val="single" w:sz="4" w:color="D9D9D9"/>
+              <w:right w:val="single" w:sz="4" w:color="D9D9D9"/>
+            </w:tcBorders>
           </w:tcPr>
           <w:p>
             <w:pPr>
-              <w:spacing w:after="40" w:before="40"/>
+              <w:spacing w:before="80" w:after="80"/>
             </w:pPr>
             <w:r>
               <w:rPr>
-                <w:rFonts w:ascii="Arial" w:hAnsi="Arial"/>
-                <w:sz w:val="19"/>
+                <w:b w:val="0"/>
+                <w:sz w:val="20"/>
               </w:rPr>
               <w:t>Empleado</w:t>
             </w:r>
@@ -189,26 +181,26 @@
         </w:tc>
         <w:tc>
           <w:tcPr>
-            <w:tcW w:type="dxa" w:w="7848"/>
+            <w:tcW w:type="dxa" w:w="8064"/>
             <w:vAlign w:val="center"/>
-            <w:tcMar>
-              <w:top w:w="100" w:type="dxa"/>
-              <w:start w:w="120" w:type="dxa"/>
-              <w:bottom w:w="100" w:type="dxa"/>
-              <w:end w:w="120" w:type="dxa"/>
-            </w:tcMar>
-            <w:shd w:fill="EAF2F8"/>
+            <w:shd w:fill="FFFFFF"/>
+            <w:tcBorders>
+              <w:top w:val="single" w:sz="4" w:color="D9D9D9"/>
+              <w:left w:val="single" w:sz="4" w:color="D9D9D9"/>
+              <w:bottom w:val="single" w:sz="4" w:color="D9D9D9"/>
+              <w:right w:val="single" w:sz="4" w:color="D9D9D9"/>
+            </w:tcBorders>
           </w:tcPr>
           <w:p>
             <w:pPr>
-              <w:spacing w:after="40" w:before="40"/>
+              <w:spacing w:before="80" w:after="80"/>
             </w:pPr>
             <w:r>
               <w:rPr>
-                <w:rFonts w:ascii="Arial" w:hAnsi="Arial"/>
-                <w:sz w:val="19"/>
+                <w:b w:val="0"/>
+                <w:sz w:val="20"/>
               </w:rPr>
-              <w:t>Crear turnos para clientes, modificar o cancelar cualquier turno, consultar la agenda diaria y gestionar clientes.</w:t>
+              <w:t>Gestionar clientes y turnos de cualquier cliente y consultar la agenda diaria.</w:t>
             </w:r>
           </w:p>
         </w:tc>
@@ -216,23 +208,24 @@
       <w:tr>
         <w:tc>
           <w:tcPr>
-            <w:tcW w:type="dxa" w:w="2232"/>
+            <w:tcW w:type="dxa" w:w="1872"/>
             <w:vAlign w:val="center"/>
-            <w:tcMar>
-              <w:top w:w="100" w:type="dxa"/>
-              <w:start w:w="120" w:type="dxa"/>
-              <w:bottom w:w="100" w:type="dxa"/>
-              <w:end w:w="120" w:type="dxa"/>
-            </w:tcMar>
+            <w:shd w:fill="FFFFFF"/>
+            <w:tcBorders>
+              <w:top w:val="single" w:sz="4" w:color="D9D9D9"/>
+              <w:left w:val="single" w:sz="4" w:color="D9D9D9"/>
+              <w:bottom w:val="single" w:sz="4" w:color="D9D9D9"/>
+              <w:right w:val="single" w:sz="4" w:color="D9D9D9"/>
+            </w:tcBorders>
           </w:tcPr>
           <w:p>
             <w:pPr>
-              <w:spacing w:after="40" w:before="40"/>
+              <w:spacing w:before="80" w:after="80"/>
             </w:pPr>
             <w:r>
               <w:rPr>
-                <w:rFonts w:ascii="Arial" w:hAnsi="Arial"/>
-                <w:sz w:val="19"/>
+                <w:b w:val="0"/>
+                <w:sz w:val="20"/>
               </w:rPr>
               <w:t>Administrador</w:t>
             </w:r>
@@ -240,25 +233,26 @@
         </w:tc>
         <w:tc>
           <w:tcPr>
-            <w:tcW w:type="dxa" w:w="7848"/>
+            <w:tcW w:type="dxa" w:w="8064"/>
             <w:vAlign w:val="center"/>
-            <w:tcMar>
-              <w:top w:w="100" w:type="dxa"/>
-              <w:start w:w="120" w:type="dxa"/>
-              <w:bottom w:w="100" w:type="dxa"/>
-              <w:end w:w="120" w:type="dxa"/>
-            </w:tcMar>
+            <w:shd w:fill="FFFFFF"/>
+            <w:tcBorders>
+              <w:top w:val="single" w:sz="4" w:color="D9D9D9"/>
+              <w:left w:val="single" w:sz="4" w:color="D9D9D9"/>
+              <w:bottom w:val="single" w:sz="4" w:color="D9D9D9"/>
+              <w:right w:val="single" w:sz="4" w:color="D9D9D9"/>
+            </w:tcBorders>
           </w:tcPr>
           <w:p>
             <w:pPr>
-              <w:spacing w:after="40" w:before="40"/>
+              <w:spacing w:before="80" w:after="80"/>
             </w:pPr>
             <w:r>
               <w:rPr>
-                <w:rFonts w:ascii="Arial" w:hAnsi="Arial"/>
-                <w:sz w:val="19"/>
+                <w:b w:val="0"/>
+                <w:sz w:val="20"/>
               </w:rPr>
-              <w:t>Realizar las operaciones del empleado y gestionar exclusivamente el catálogo de servicios y sus importes.</w:t>
+              <w:t>Realizar las operaciones del empleado, administrar servicios e importes y ejecutar manualmente el procesamiento de recordatorios.</w:t>
             </w:r>
           </w:p>
         </w:tc>
@@ -266,24 +260,24 @@
       <w:tr>
         <w:tc>
           <w:tcPr>
-            <w:tcW w:type="dxa" w:w="2232"/>
+            <w:tcW w:type="dxa" w:w="1872"/>
             <w:vAlign w:val="center"/>
-            <w:tcMar>
-              <w:top w:w="100" w:type="dxa"/>
-              <w:start w:w="120" w:type="dxa"/>
-              <w:bottom w:w="100" w:type="dxa"/>
-              <w:end w:w="120" w:type="dxa"/>
-            </w:tcMar>
-            <w:shd w:fill="EAF2F8"/>
+            <w:shd w:fill="FFFFFF"/>
+            <w:tcBorders>
+              <w:top w:val="single" w:sz="4" w:color="D9D9D9"/>
+              <w:left w:val="single" w:sz="4" w:color="D9D9D9"/>
+              <w:bottom w:val="single" w:sz="4" w:color="D9D9D9"/>
+              <w:right w:val="single" w:sz="4" w:color="D9D9D9"/>
+            </w:tcBorders>
           </w:tcPr>
           <w:p>
             <w:pPr>
-              <w:spacing w:after="40" w:before="40"/>
+              <w:spacing w:before="80" w:after="80"/>
             </w:pPr>
             <w:r>
               <w:rPr>
-                <w:rFonts w:ascii="Arial" w:hAnsi="Arial"/>
-                <w:sz w:val="19"/>
+                <w:b w:val="0"/>
+                <w:sz w:val="20"/>
               </w:rPr>
               <w:t>Proceso programado</w:t>
             </w:r>
@@ -291,26 +285,26 @@
         </w:tc>
         <w:tc>
           <w:tcPr>
-            <w:tcW w:type="dxa" w:w="7848"/>
+            <w:tcW w:type="dxa" w:w="8064"/>
             <w:vAlign w:val="center"/>
-            <w:tcMar>
-              <w:top w:w="100" w:type="dxa"/>
-              <w:start w:w="120" w:type="dxa"/>
-              <w:bottom w:w="100" w:type="dxa"/>
-              <w:end w:w="120" w:type="dxa"/>
-            </w:tcMar>
-            <w:shd w:fill="EAF2F8"/>
+            <w:shd w:fill="FFFFFF"/>
+            <w:tcBorders>
+              <w:top w:val="single" w:sz="4" w:color="D9D9D9"/>
+              <w:left w:val="single" w:sz="4" w:color="D9D9D9"/>
+              <w:bottom w:val="single" w:sz="4" w:color="D9D9D9"/>
+              <w:right w:val="single" w:sz="4" w:color="D9D9D9"/>
+            </w:tcBorders>
           </w:tcPr>
           <w:p>
             <w:pPr>
-              <w:spacing w:after="40" w:before="40"/>
+              <w:spacing w:before="80" w:after="80"/>
             </w:pPr>
             <w:r>
               <w:rPr>
-                <w:rFonts w:ascii="Arial" w:hAnsi="Arial"/>
-                <w:sz w:val="19"/>
+                <w:b w:val="0"/>
+                <w:sz w:val="20"/>
               </w:rPr>
-              <w:t>Detectar turnos próximos y procesar recordatorios. No representa una persona usuaria del sistema.</w:t>
+              <w:t>Procesar periódicamente los recordatorios de turnos futuros, sin una acción del cliente.</w:t>
             </w:r>
           </w:p>
         </w:tc>
@@ -322,236 +316,25 @@
         <w:pStyle w:val="Heading1"/>
       </w:pPr>
       <w:r>
-        <w:t>Entidades principales</w:t>
+        <w:t>Entidades y alcance</w:t>
       </w:r>
     </w:p>
-    <w:tbl>
-      <w:tblPr>
-        <w:tblStyle w:val="TableGrid"/>
-        <w:tblW w:type="auto" w:w="0"/>
-        <w:jc w:val="center"/>
-        <w:tblLook w:firstColumn="1" w:firstRow="1" w:lastColumn="0" w:lastRow="0" w:noHBand="0" w:noVBand="1" w:val="04A0"/>
-      </w:tblPr>
-      <w:tblGrid>
-        <w:gridCol w:w="5040"/>
-        <w:gridCol w:w="5040"/>
-      </w:tblGrid>
-      <w:tr>
-        <w:trPr>
-          <w:tblHeader w:val="true"/>
-        </w:trPr>
-        <w:tc>
-          <w:tcPr>
-            <w:tcW w:type="dxa" w:w="2232"/>
-            <w:vAlign w:val="center"/>
-            <w:tcMar>
-              <w:top w:w="100" w:type="dxa"/>
-              <w:start w:w="120" w:type="dxa"/>
-              <w:bottom w:w="100" w:type="dxa"/>
-              <w:end w:w="120" w:type="dxa"/>
-            </w:tcMar>
-            <w:shd w:fill="1F4E78"/>
-          </w:tcPr>
-          <w:p>
-            <w:pPr>
-              <w:spacing w:after="40" w:before="40"/>
-            </w:pPr>
-            <w:r>
-              <w:rPr>
-                <w:rFonts w:ascii="Arial" w:hAnsi="Arial"/>
-                <w:b/>
-                <w:color w:val="FFFFFF"/>
-                <w:sz w:val="19"/>
-              </w:rPr>
-              <w:t>Entidad</w:t>
-            </w:r>
-          </w:p>
-        </w:tc>
-        <w:tc>
-          <w:tcPr>
-            <w:tcW w:type="dxa" w:w="7848"/>
-            <w:vAlign w:val="center"/>
-            <w:tcMar>
-              <w:top w:w="100" w:type="dxa"/>
-              <w:start w:w="120" w:type="dxa"/>
-              <w:bottom w:w="100" w:type="dxa"/>
-              <w:end w:w="120" w:type="dxa"/>
-            </w:tcMar>
-            <w:shd w:fill="1F4E78"/>
-          </w:tcPr>
-          <w:p>
-            <w:pPr>
-              <w:spacing w:after="40" w:before="40"/>
-            </w:pPr>
-            <w:r>
-              <w:rPr>
-                <w:rFonts w:ascii="Arial" w:hAnsi="Arial"/>
-                <w:b/>
-                <w:color w:val="FFFFFF"/>
-                <w:sz w:val="19"/>
-              </w:rPr>
-              <w:t>Finalidad</w:t>
-            </w:r>
-          </w:p>
-        </w:tc>
-      </w:tr>
-      <w:tr>
-        <w:tc>
-          <w:tcPr>
-            <w:tcW w:type="dxa" w:w="2232"/>
-            <w:vAlign w:val="center"/>
-            <w:tcMar>
-              <w:top w:w="100" w:type="dxa"/>
-              <w:start w:w="120" w:type="dxa"/>
-              <w:bottom w:w="100" w:type="dxa"/>
-              <w:end w:w="120" w:type="dxa"/>
-            </w:tcMar>
-          </w:tcPr>
-          <w:p>
-            <w:pPr>
-              <w:spacing w:after="40" w:before="40"/>
-            </w:pPr>
-            <w:r>
-              <w:rPr>
-                <w:rFonts w:ascii="Arial" w:hAnsi="Arial"/>
-                <w:sz w:val="19"/>
-              </w:rPr>
-              <w:t>Cliente</w:t>
-            </w:r>
-          </w:p>
-        </w:tc>
-        <w:tc>
-          <w:tcPr>
-            <w:tcW w:type="dxa" w:w="7848"/>
-            <w:vAlign w:val="center"/>
-            <w:tcMar>
-              <w:top w:w="100" w:type="dxa"/>
-              <w:start w:w="120" w:type="dxa"/>
-              <w:bottom w:w="100" w:type="dxa"/>
-              <w:end w:w="120" w:type="dxa"/>
-            </w:tcMar>
-          </w:tcPr>
-          <w:p>
-            <w:pPr>
-              <w:spacing w:after="40" w:before="40"/>
-            </w:pPr>
-            <w:r>
-              <w:rPr>
-                <w:rFonts w:ascii="Arial" w:hAnsi="Arial"/>
-                <w:sz w:val="19"/>
-              </w:rPr>
-              <w:t>Persona que reserva servicios y posee datos de contacto.</w:t>
-            </w:r>
-          </w:p>
-        </w:tc>
-      </w:tr>
-      <w:tr>
-        <w:tc>
-          <w:tcPr>
-            <w:tcW w:type="dxa" w:w="2232"/>
-            <w:vAlign w:val="center"/>
-            <w:tcMar>
-              <w:top w:w="100" w:type="dxa"/>
-              <w:start w:w="120" w:type="dxa"/>
-              <w:bottom w:w="100" w:type="dxa"/>
-              <w:end w:w="120" w:type="dxa"/>
-            </w:tcMar>
-            <w:shd w:fill="EAF2F8"/>
-          </w:tcPr>
-          <w:p>
-            <w:pPr>
-              <w:spacing w:after="40" w:before="40"/>
-            </w:pPr>
-            <w:r>
-              <w:rPr>
-                <w:rFonts w:ascii="Arial" w:hAnsi="Arial"/>
-                <w:sz w:val="19"/>
-              </w:rPr>
-              <w:t>Servicio</w:t>
-            </w:r>
-          </w:p>
-        </w:tc>
-        <w:tc>
-          <w:tcPr>
-            <w:tcW w:type="dxa" w:w="7848"/>
-            <w:vAlign w:val="center"/>
-            <w:tcMar>
-              <w:top w:w="100" w:type="dxa"/>
-              <w:start w:w="120" w:type="dxa"/>
-              <w:bottom w:w="100" w:type="dxa"/>
-              <w:end w:w="120" w:type="dxa"/>
-            </w:tcMar>
-            <w:shd w:fill="EAF2F8"/>
-          </w:tcPr>
-          <w:p>
-            <w:pPr>
-              <w:spacing w:after="40" w:before="40"/>
-            </w:pPr>
-            <w:r>
-              <w:rPr>
-                <w:rFonts w:ascii="Arial" w:hAnsi="Arial"/>
-                <w:sz w:val="19"/>
-              </w:rPr>
-              <w:t>Tipo de lavado ofrecido, con nombre, importe y estado.</w:t>
-            </w:r>
-          </w:p>
-        </w:tc>
-      </w:tr>
-      <w:tr>
-        <w:tc>
-          <w:tcPr>
-            <w:tcW w:type="dxa" w:w="2232"/>
-            <w:vAlign w:val="center"/>
-            <w:tcMar>
-              <w:top w:w="100" w:type="dxa"/>
-              <w:start w:w="120" w:type="dxa"/>
-              <w:bottom w:w="100" w:type="dxa"/>
-              <w:end w:w="120" w:type="dxa"/>
-            </w:tcMar>
-          </w:tcPr>
-          <w:p>
-            <w:pPr>
-              <w:spacing w:after="40" w:before="40"/>
-            </w:pPr>
-            <w:r>
-              <w:rPr>
-                <w:rFonts w:ascii="Arial" w:hAnsi="Arial"/>
-                <w:sz w:val="19"/>
-              </w:rPr>
-              <w:t>Turno</w:t>
-            </w:r>
-          </w:p>
-        </w:tc>
-        <w:tc>
-          <w:tcPr>
-            <w:tcW w:type="dxa" w:w="7848"/>
-            <w:vAlign w:val="center"/>
-            <w:tcMar>
-              <w:top w:w="100" w:type="dxa"/>
-              <w:start w:w="120" w:type="dxa"/>
-              <w:bottom w:w="100" w:type="dxa"/>
-              <w:end w:w="120" w:type="dxa"/>
-            </w:tcMar>
-          </w:tcPr>
-          <w:p>
-            <w:pPr>
-              <w:spacing w:after="40" w:before="40"/>
-            </w:pPr>
-            <w:r>
-              <w:rPr>
-                <w:rFonts w:ascii="Arial" w:hAnsi="Arial"/>
-                <w:sz w:val="19"/>
-              </w:rPr>
-              <w:t>Reserva de un cliente para un servicio en una fecha y hora.</w:t>
-            </w:r>
-          </w:p>
-        </w:tc>
-      </w:tr>
-    </w:tbl>
-    <w:p/>
     <w:p>
       <w:r>
-        <w:t>Los vehículos no se administran como entidad independiente en esta primera versión, porque los requisitos actuales no solicitan almacenar sus datos.</w:t>
+        <w:t>Cliente, Servicio y Turno son las entidades principales. Usuario permite autenticar y asignar roles; Recordatorio registra el resultado de cada intento. Los vehículos no se administran como entidad independiente en esta versión.</w:t>
+      </w:r>
+    </w:p>
+    <w:p>
+      <w:pPr>
+        <w:pStyle w:val="Heading1"/>
+      </w:pPr>
+      <w:r>
+        <w:t>Recordatorios</w:t>
+      </w:r>
+    </w:p>
+    <w:p>
+      <w:r>
+        <w:t>El envío se realiza por correo electrónico mediante SMTP. La ejecución automática requiere configurar el proveedor y habilitar Recordatorios:Habilitados. La ventana predeterminada es de 24 horas y se revisa cada 5 minutos. Se registran envíos, fallos y omisiones; un intento procesado no se repite. SMS queda fuera de esta versión.</w:t>
       </w:r>
     </w:p>
     <w:p>
@@ -564,46 +347,42 @@
         <w:pStyle w:val="Heading1"/>
       </w:pPr>
       <w:r>
-        <w:t>Reglas de negocio globales</w:t>
+        <w:t>Índice de casos de uso</w:t>
       </w:r>
     </w:p>
     <w:tbl>
       <w:tblPr>
-        <w:tblStyle w:val="TableGrid"/>
         <w:tblW w:type="auto" w:w="0"/>
         <w:jc w:val="center"/>
+        <w:tblLayout w:type="fixed"/>
         <w:tblLook w:firstColumn="1" w:firstRow="1" w:lastColumn="0" w:lastRow="0" w:noHBand="0" w:noVBand="1" w:val="04A0"/>
       </w:tblPr>
       <w:tblGrid>
-        <w:gridCol w:w="5040"/>
-        <w:gridCol w:w="5040"/>
+        <w:gridCol w:w="936"/>
+        <w:gridCol w:w="4608"/>
+        <w:gridCol w:w="4392"/>
       </w:tblGrid>
       <w:tr>
-        <w:trPr>
-          <w:tblHeader w:val="true"/>
-        </w:trPr>
         <w:tc>
           <w:tcPr>
-            <w:tcW w:type="dxa" w:w="1152"/>
+            <w:tcW w:type="dxa" w:w="936"/>
             <w:vAlign w:val="center"/>
-            <w:tcMar>
-              <w:top w:w="100" w:type="dxa"/>
-              <w:start w:w="120" w:type="dxa"/>
-              <w:bottom w:w="100" w:type="dxa"/>
-              <w:end w:w="120" w:type="dxa"/>
-            </w:tcMar>
-            <w:shd w:fill="1F4E78"/>
+            <w:shd w:fill="E7EBEF"/>
+            <w:tcBorders>
+              <w:top w:val="single" w:sz="4" w:color="D9D9D9"/>
+              <w:left w:val="single" w:sz="4" w:color="D9D9D9"/>
+              <w:bottom w:val="single" w:sz="4" w:color="D9D9D9"/>
+              <w:right w:val="single" w:sz="4" w:color="D9D9D9"/>
+            </w:tcBorders>
           </w:tcPr>
           <w:p>
             <w:pPr>
-              <w:spacing w:after="40" w:before="40"/>
+              <w:spacing w:before="80" w:after="80"/>
             </w:pPr>
             <w:r>
               <w:rPr>
-                <w:rFonts w:ascii="Arial" w:hAnsi="Arial"/>
                 <w:b/>
-                <w:color w:val="FFFFFF"/>
-                <w:sz w:val="19"/>
+                <w:sz w:val="20"/>
               </w:rPr>
               <w:t>ID</w:t>
             </w:r>
@@ -611,28 +390,51 @@
         </w:tc>
         <w:tc>
           <w:tcPr>
-            <w:tcW w:type="dxa" w:w="8928"/>
+            <w:tcW w:type="dxa" w:w="4608"/>
             <w:vAlign w:val="center"/>
-            <w:tcMar>
-              <w:top w:w="100" w:type="dxa"/>
-              <w:start w:w="120" w:type="dxa"/>
-              <w:bottom w:w="100" w:type="dxa"/>
-              <w:end w:w="120" w:type="dxa"/>
-            </w:tcMar>
-            <w:shd w:fill="1F4E78"/>
+            <w:shd w:fill="E7EBEF"/>
+            <w:tcBorders>
+              <w:top w:val="single" w:sz="4" w:color="D9D9D9"/>
+              <w:left w:val="single" w:sz="4" w:color="D9D9D9"/>
+              <w:bottom w:val="single" w:sz="4" w:color="D9D9D9"/>
+              <w:right w:val="single" w:sz="4" w:color="D9D9D9"/>
+            </w:tcBorders>
           </w:tcPr>
           <w:p>
             <w:pPr>
-              <w:spacing w:after="40" w:before="40"/>
+              <w:spacing w:before="80" w:after="80"/>
             </w:pPr>
             <w:r>
               <w:rPr>
-                <w:rFonts w:ascii="Arial" w:hAnsi="Arial"/>
                 <w:b/>
-                <w:color w:val="FFFFFF"/>
-                <w:sz w:val="19"/>
+                <w:sz w:val="20"/>
               </w:rPr>
-              <w:t>Regla</w:t>
+              <w:t>Caso de uso</w:t>
+            </w:r>
+          </w:p>
+        </w:tc>
+        <w:tc>
+          <w:tcPr>
+            <w:tcW w:type="dxa" w:w="4392"/>
+            <w:vAlign w:val="center"/>
+            <w:shd w:fill="E7EBEF"/>
+            <w:tcBorders>
+              <w:top w:val="single" w:sz="4" w:color="D9D9D9"/>
+              <w:left w:val="single" w:sz="4" w:color="D9D9D9"/>
+              <w:bottom w:val="single" w:sz="4" w:color="D9D9D9"/>
+              <w:right w:val="single" w:sz="4" w:color="D9D9D9"/>
+            </w:tcBorders>
+          </w:tcPr>
+          <w:p>
+            <w:pPr>
+              <w:spacing w:before="80" w:after="80"/>
+            </w:pPr>
+            <w:r>
+              <w:rPr>
+                <w:b/>
+                <w:sz w:val="20"/>
+              </w:rPr>
+              <w:t>Actor</w:t>
             </w:r>
           </w:p>
         </w:tc>
@@ -640,692 +442,74 @@
       <w:tr>
         <w:tc>
           <w:tcPr>
-            <w:tcW w:type="dxa" w:w="1152"/>
+            <w:tcW w:type="dxa" w:w="936"/>
             <w:vAlign w:val="center"/>
-            <w:tcMar>
-              <w:top w:w="100" w:type="dxa"/>
-              <w:start w:w="120" w:type="dxa"/>
-              <w:bottom w:w="100" w:type="dxa"/>
-              <w:end w:w="120" w:type="dxa"/>
-            </w:tcMar>
+            <w:shd w:fill="FFFFFF"/>
+            <w:tcBorders>
+              <w:top w:val="single" w:sz="4" w:color="D9D9D9"/>
+              <w:left w:val="single" w:sz="4" w:color="D9D9D9"/>
+              <w:bottom w:val="single" w:sz="4" w:color="D9D9D9"/>
+              <w:right w:val="single" w:sz="4" w:color="D9D9D9"/>
+            </w:tcBorders>
           </w:tcPr>
           <w:p>
             <w:pPr>
-              <w:spacing w:after="40" w:before="40"/>
+              <w:spacing w:before="80" w:after="80"/>
             </w:pPr>
             <w:r>
               <w:rPr>
-                <w:rFonts w:ascii="Arial" w:hAnsi="Arial"/>
-                <w:sz w:val="19"/>
+                <w:b w:val="0"/>
+                <w:sz w:val="20"/>
               </w:rPr>
-              <w:t>RN-01</w:t>
+              <w:t>CU-01</w:t>
             </w:r>
           </w:p>
         </w:tc>
         <w:tc>
           <w:tcPr>
-            <w:tcW w:type="dxa" w:w="8928"/>
+            <w:tcW w:type="dxa" w:w="4608"/>
             <w:vAlign w:val="center"/>
-            <w:tcMar>
-              <w:top w:w="100" w:type="dxa"/>
-              <w:start w:w="120" w:type="dxa"/>
-              <w:bottom w:w="100" w:type="dxa"/>
-              <w:end w:w="120" w:type="dxa"/>
-            </w:tcMar>
+            <w:shd w:fill="FFFFFF"/>
+            <w:tcBorders>
+              <w:top w:val="single" w:sz="4" w:color="D9D9D9"/>
+              <w:left w:val="single" w:sz="4" w:color="D9D9D9"/>
+              <w:bottom w:val="single" w:sz="4" w:color="D9D9D9"/>
+              <w:right w:val="single" w:sz="4" w:color="D9D9D9"/>
+            </w:tcBorders>
           </w:tcPr>
           <w:p>
             <w:pPr>
-              <w:spacing w:after="40" w:before="40"/>
+              <w:spacing w:before="80" w:after="80"/>
             </w:pPr>
             <w:r>
               <w:rPr>
-                <w:rFonts w:ascii="Arial" w:hAnsi="Arial"/>
-                <w:sz w:val="19"/>
+                <w:b w:val="0"/>
+                <w:sz w:val="20"/>
               </w:rPr>
-              <w:t>No puede existir más de un turno activo para la misma fecha y hora.</w:t>
-            </w:r>
-          </w:p>
-        </w:tc>
-      </w:tr>
-      <w:tr>
-        <w:tc>
-          <w:tcPr>
-            <w:tcW w:type="dxa" w:w="1152"/>
-            <w:vAlign w:val="center"/>
-            <w:tcMar>
-              <w:top w:w="100" w:type="dxa"/>
-              <w:start w:w="120" w:type="dxa"/>
-              <w:bottom w:w="100" w:type="dxa"/>
-              <w:end w:w="120" w:type="dxa"/>
-            </w:tcMar>
-            <w:shd w:fill="EAF2F8"/>
-          </w:tcPr>
-          <w:p>
-            <w:pPr>
-              <w:spacing w:after="40" w:before="40"/>
-            </w:pPr>
-            <w:r>
-              <w:rPr>
-                <w:rFonts w:ascii="Arial" w:hAnsi="Arial"/>
-                <w:sz w:val="19"/>
-              </w:rPr>
-              <w:t>RN-02</w:t>
+              <w:t>Solicitar Turno</w:t>
             </w:r>
           </w:p>
         </w:tc>
         <w:tc>
           <w:tcPr>
-            <w:tcW w:type="dxa" w:w="8928"/>
+            <w:tcW w:type="dxa" w:w="4392"/>
             <w:vAlign w:val="center"/>
-            <w:tcMar>
-              <w:top w:w="100" w:type="dxa"/>
-              <w:start w:w="120" w:type="dxa"/>
-              <w:bottom w:w="100" w:type="dxa"/>
-              <w:end w:w="120" w:type="dxa"/>
-            </w:tcMar>
-            <w:shd w:fill="EAF2F8"/>
+            <w:shd w:fill="FFFFFF"/>
+            <w:tcBorders>
+              <w:top w:val="single" w:sz="4" w:color="D9D9D9"/>
+              <w:left w:val="single" w:sz="4" w:color="D9D9D9"/>
+              <w:bottom w:val="single" w:sz="4" w:color="D9D9D9"/>
+              <w:right w:val="single" w:sz="4" w:color="D9D9D9"/>
+            </w:tcBorders>
           </w:tcPr>
           <w:p>
             <w:pPr>
-              <w:spacing w:after="40" w:before="40"/>
+              <w:spacing w:before="80" w:after="80"/>
             </w:pPr>
             <w:r>
               <w:rPr>
-                <w:rFonts w:ascii="Arial" w:hAnsi="Arial"/>
-                <w:sz w:val="19"/>
-              </w:rPr>
-              <w:t>Todo turno referencia un servicio existente y activo.</w:t>
-            </w:r>
-          </w:p>
-        </w:tc>
-      </w:tr>
-      <w:tr>
-        <w:tc>
-          <w:tcPr>
-            <w:tcW w:type="dxa" w:w="1152"/>
-            <w:vAlign w:val="center"/>
-            <w:tcMar>
-              <w:top w:w="100" w:type="dxa"/>
-              <w:start w:w="120" w:type="dxa"/>
-              <w:bottom w:w="100" w:type="dxa"/>
-              <w:end w:w="120" w:type="dxa"/>
-            </w:tcMar>
-          </w:tcPr>
-          <w:p>
-            <w:pPr>
-              <w:spacing w:after="40" w:before="40"/>
-            </w:pPr>
-            <w:r>
-              <w:rPr>
-                <w:rFonts w:ascii="Arial" w:hAnsi="Arial"/>
-                <w:sz w:val="19"/>
-              </w:rPr>
-              <w:t>RN-03</w:t>
-            </w:r>
-          </w:p>
-        </w:tc>
-        <w:tc>
-          <w:tcPr>
-            <w:tcW w:type="dxa" w:w="8928"/>
-            <w:vAlign w:val="center"/>
-            <w:tcMar>
-              <w:top w:w="100" w:type="dxa"/>
-              <w:start w:w="120" w:type="dxa"/>
-              <w:bottom w:w="100" w:type="dxa"/>
-              <w:end w:w="120" w:type="dxa"/>
-            </w:tcMar>
-          </w:tcPr>
-          <w:p>
-            <w:pPr>
-              <w:spacing w:after="40" w:before="40"/>
-            </w:pPr>
-            <w:r>
-              <w:rPr>
-                <w:rFonts w:ascii="Arial" w:hAnsi="Arial"/>
-                <w:sz w:val="19"/>
-              </w:rPr>
-              <w:t>Todo turno referencia un cliente existente.</w:t>
-            </w:r>
-          </w:p>
-        </w:tc>
-      </w:tr>
-      <w:tr>
-        <w:tc>
-          <w:tcPr>
-            <w:tcW w:type="dxa" w:w="1152"/>
-            <w:vAlign w:val="center"/>
-            <w:tcMar>
-              <w:top w:w="100" w:type="dxa"/>
-              <w:start w:w="120" w:type="dxa"/>
-              <w:bottom w:w="100" w:type="dxa"/>
-              <w:end w:w="120" w:type="dxa"/>
-            </w:tcMar>
-            <w:shd w:fill="EAF2F8"/>
-          </w:tcPr>
-          <w:p>
-            <w:pPr>
-              <w:spacing w:after="40" w:before="40"/>
-            </w:pPr>
-            <w:r>
-              <w:rPr>
-                <w:rFonts w:ascii="Arial" w:hAnsi="Arial"/>
-                <w:sz w:val="19"/>
-              </w:rPr>
-              <w:t>RN-04</w:t>
-            </w:r>
-          </w:p>
-        </w:tc>
-        <w:tc>
-          <w:tcPr>
-            <w:tcW w:type="dxa" w:w="8928"/>
-            <w:vAlign w:val="center"/>
-            <w:tcMar>
-              <w:top w:w="100" w:type="dxa"/>
-              <w:start w:w="120" w:type="dxa"/>
-              <w:bottom w:w="100" w:type="dxa"/>
-              <w:end w:w="120" w:type="dxa"/>
-            </w:tcMar>
-            <w:shd w:fill="EAF2F8"/>
-          </w:tcPr>
-          <w:p>
-            <w:pPr>
-              <w:spacing w:after="40" w:before="40"/>
-            </w:pPr>
-            <w:r>
-              <w:rPr>
-                <w:rFonts w:ascii="Arial" w:hAnsi="Arial"/>
-                <w:sz w:val="19"/>
-              </w:rPr>
-              <w:t>El cliente necesita un medio de contacto válido para recibir un recordatorio.</w:t>
-            </w:r>
-          </w:p>
-        </w:tc>
-      </w:tr>
-      <w:tr>
-        <w:tc>
-          <w:tcPr>
-            <w:tcW w:type="dxa" w:w="1152"/>
-            <w:vAlign w:val="center"/>
-            <w:tcMar>
-              <w:top w:w="100" w:type="dxa"/>
-              <w:start w:w="120" w:type="dxa"/>
-              <w:bottom w:w="100" w:type="dxa"/>
-              <w:end w:w="120" w:type="dxa"/>
-            </w:tcMar>
-          </w:tcPr>
-          <w:p>
-            <w:pPr>
-              <w:spacing w:after="40" w:before="40"/>
-            </w:pPr>
-            <w:r>
-              <w:rPr>
-                <w:rFonts w:ascii="Arial" w:hAnsi="Arial"/>
-                <w:sz w:val="19"/>
-              </w:rPr>
-              <w:t>RN-05</w:t>
-            </w:r>
-          </w:p>
-        </w:tc>
-        <w:tc>
-          <w:tcPr>
-            <w:tcW w:type="dxa" w:w="8928"/>
-            <w:vAlign w:val="center"/>
-            <w:tcMar>
-              <w:top w:w="100" w:type="dxa"/>
-              <w:start w:w="120" w:type="dxa"/>
-              <w:bottom w:w="100" w:type="dxa"/>
-              <w:end w:w="120" w:type="dxa"/>
-            </w:tcMar>
-          </w:tcPr>
-          <w:p>
-            <w:pPr>
-              <w:spacing w:after="40" w:before="40"/>
-            </w:pPr>
-            <w:r>
-              <w:rPr>
-                <w:rFonts w:ascii="Arial" w:hAnsi="Arial"/>
-                <w:sz w:val="19"/>
-              </w:rPr>
-              <w:t>No se envían recordatorios si las notificaciones están desactivadas o el turno no está activo.</w:t>
-            </w:r>
-          </w:p>
-        </w:tc>
-      </w:tr>
-      <w:tr>
-        <w:tc>
-          <w:tcPr>
-            <w:tcW w:type="dxa" w:w="1152"/>
-            <w:vAlign w:val="center"/>
-            <w:tcMar>
-              <w:top w:w="100" w:type="dxa"/>
-              <w:start w:w="120" w:type="dxa"/>
-              <w:bottom w:w="100" w:type="dxa"/>
-              <w:end w:w="120" w:type="dxa"/>
-            </w:tcMar>
-            <w:shd w:fill="EAF2F8"/>
-          </w:tcPr>
-          <w:p>
-            <w:pPr>
-              <w:spacing w:after="40" w:before="40"/>
-            </w:pPr>
-            <w:r>
-              <w:rPr>
-                <w:rFonts w:ascii="Arial" w:hAnsi="Arial"/>
-                <w:sz w:val="19"/>
-              </w:rPr>
-              <w:t>RN-06</w:t>
-            </w:r>
-          </w:p>
-        </w:tc>
-        <w:tc>
-          <w:tcPr>
-            <w:tcW w:type="dxa" w:w="8928"/>
-            <w:vAlign w:val="center"/>
-            <w:tcMar>
-              <w:top w:w="100" w:type="dxa"/>
-              <w:start w:w="120" w:type="dxa"/>
-              <w:bottom w:w="100" w:type="dxa"/>
-              <w:end w:w="120" w:type="dxa"/>
-            </w:tcMar>
-            <w:shd w:fill="EAF2F8"/>
-          </w:tcPr>
-          <w:p>
-            <w:pPr>
-              <w:spacing w:after="40" w:before="40"/>
-            </w:pPr>
-            <w:r>
-              <w:rPr>
-                <w:rFonts w:ascii="Arial" w:hAnsi="Arial"/>
-                <w:sz w:val="19"/>
-              </w:rPr>
-              <w:t>Solamente se modifican o cancelan turnos activos y futuros.</w:t>
-            </w:r>
-          </w:p>
-        </w:tc>
-      </w:tr>
-      <w:tr>
-        <w:tc>
-          <w:tcPr>
-            <w:tcW w:type="dxa" w:w="1152"/>
-            <w:vAlign w:val="center"/>
-            <w:tcMar>
-              <w:top w:w="100" w:type="dxa"/>
-              <w:start w:w="120" w:type="dxa"/>
-              <w:bottom w:w="100" w:type="dxa"/>
-              <w:end w:w="120" w:type="dxa"/>
-            </w:tcMar>
-          </w:tcPr>
-          <w:p>
-            <w:pPr>
-              <w:spacing w:after="40" w:before="40"/>
-            </w:pPr>
-            <w:r>
-              <w:rPr>
-                <w:rFonts w:ascii="Arial" w:hAnsi="Arial"/>
-                <w:sz w:val="19"/>
-              </w:rPr>
-              <w:t>RN-07</w:t>
-            </w:r>
-          </w:p>
-        </w:tc>
-        <w:tc>
-          <w:tcPr>
-            <w:tcW w:type="dxa" w:w="8928"/>
-            <w:vAlign w:val="center"/>
-            <w:tcMar>
-              <w:top w:w="100" w:type="dxa"/>
-              <w:start w:w="120" w:type="dxa"/>
-              <w:bottom w:w="100" w:type="dxa"/>
-              <w:end w:w="120" w:type="dxa"/>
-            </w:tcMar>
-          </w:tcPr>
-          <w:p>
-            <w:pPr>
-              <w:spacing w:after="40" w:before="40"/>
-            </w:pPr>
-            <w:r>
-              <w:rPr>
-                <w:rFonts w:ascii="Arial" w:hAnsi="Arial"/>
-                <w:sz w:val="19"/>
-              </w:rPr>
-              <w:t>El nombre normalizado del servicio es único.</w:t>
-            </w:r>
-          </w:p>
-        </w:tc>
-      </w:tr>
-      <w:tr>
-        <w:tc>
-          <w:tcPr>
-            <w:tcW w:type="dxa" w:w="1152"/>
-            <w:vAlign w:val="center"/>
-            <w:tcMar>
-              <w:top w:w="100" w:type="dxa"/>
-              <w:start w:w="120" w:type="dxa"/>
-              <w:bottom w:w="100" w:type="dxa"/>
-              <w:end w:w="120" w:type="dxa"/>
-            </w:tcMar>
-            <w:shd w:fill="EAF2F8"/>
-          </w:tcPr>
-          <w:p>
-            <w:pPr>
-              <w:spacing w:after="40" w:before="40"/>
-            </w:pPr>
-            <w:r>
-              <w:rPr>
-                <w:rFonts w:ascii="Arial" w:hAnsi="Arial"/>
-                <w:sz w:val="19"/>
-              </w:rPr>
-              <w:t>RN-08</w:t>
-            </w:r>
-          </w:p>
-        </w:tc>
-        <w:tc>
-          <w:tcPr>
-            <w:tcW w:type="dxa" w:w="8928"/>
-            <w:vAlign w:val="center"/>
-            <w:tcMar>
-              <w:top w:w="100" w:type="dxa"/>
-              <w:start w:w="120" w:type="dxa"/>
-              <w:bottom w:w="100" w:type="dxa"/>
-              <w:end w:w="120" w:type="dxa"/>
-            </w:tcMar>
-            <w:shd w:fill="EAF2F8"/>
-          </w:tcPr>
-          <w:p>
-            <w:pPr>
-              <w:spacing w:after="40" w:before="40"/>
-            </w:pPr>
-            <w:r>
-              <w:rPr>
-                <w:rFonts w:ascii="Arial" w:hAnsi="Arial"/>
-                <w:sz w:val="19"/>
-              </w:rPr>
-              <w:t>El importe de un servicio debe ser mayor que cero.</w:t>
-            </w:r>
-          </w:p>
-        </w:tc>
-      </w:tr>
-      <w:tr>
-        <w:tc>
-          <w:tcPr>
-            <w:tcW w:type="dxa" w:w="1152"/>
-            <w:vAlign w:val="center"/>
-            <w:tcMar>
-              <w:top w:w="100" w:type="dxa"/>
-              <w:start w:w="120" w:type="dxa"/>
-              <w:bottom w:w="100" w:type="dxa"/>
-              <w:end w:w="120" w:type="dxa"/>
-            </w:tcMar>
-          </w:tcPr>
-          <w:p>
-            <w:pPr>
-              <w:spacing w:after="40" w:before="40"/>
-            </w:pPr>
-            <w:r>
-              <w:rPr>
-                <w:rFonts w:ascii="Arial" w:hAnsi="Arial"/>
-                <w:sz w:val="19"/>
-              </w:rPr>
-              <w:t>RN-09</w:t>
-            </w:r>
-          </w:p>
-        </w:tc>
-        <w:tc>
-          <w:tcPr>
-            <w:tcW w:type="dxa" w:w="8928"/>
-            <w:vAlign w:val="center"/>
-            <w:tcMar>
-              <w:top w:w="100" w:type="dxa"/>
-              <w:start w:w="120" w:type="dxa"/>
-              <w:bottom w:w="100" w:type="dxa"/>
-              <w:end w:w="120" w:type="dxa"/>
-            </w:tcMar>
-          </w:tcPr>
-          <w:p>
-            <w:pPr>
-              <w:spacing w:after="40" w:before="40"/>
-            </w:pPr>
-            <w:r>
-              <w:rPr>
-                <w:rFonts w:ascii="Arial" w:hAnsi="Arial"/>
-                <w:sz w:val="19"/>
-              </w:rPr>
-              <w:t>No puede eliminarse un servicio relacionado con turnos.</w:t>
-            </w:r>
-          </w:p>
-        </w:tc>
-      </w:tr>
-      <w:tr>
-        <w:tc>
-          <w:tcPr>
-            <w:tcW w:type="dxa" w:w="1152"/>
-            <w:vAlign w:val="center"/>
-            <w:tcMar>
-              <w:top w:w="100" w:type="dxa"/>
-              <w:start w:w="120" w:type="dxa"/>
-              <w:bottom w:w="100" w:type="dxa"/>
-              <w:end w:w="120" w:type="dxa"/>
-            </w:tcMar>
-            <w:shd w:fill="EAF2F8"/>
-          </w:tcPr>
-          <w:p>
-            <w:pPr>
-              <w:spacing w:after="40" w:before="40"/>
-            </w:pPr>
-            <w:r>
-              <w:rPr>
-                <w:rFonts w:ascii="Arial" w:hAnsi="Arial"/>
-                <w:sz w:val="19"/>
-              </w:rPr>
-              <w:t>RN-10</w:t>
-            </w:r>
-          </w:p>
-        </w:tc>
-        <w:tc>
-          <w:tcPr>
-            <w:tcW w:type="dxa" w:w="8928"/>
-            <w:vAlign w:val="center"/>
-            <w:tcMar>
-              <w:top w:w="100" w:type="dxa"/>
-              <w:start w:w="120" w:type="dxa"/>
-              <w:bottom w:w="100" w:type="dxa"/>
-              <w:end w:w="120" w:type="dxa"/>
-            </w:tcMar>
-            <w:shd w:fill="EAF2F8"/>
-          </w:tcPr>
-          <w:p>
-            <w:pPr>
-              <w:spacing w:after="40" w:before="40"/>
-            </w:pPr>
-            <w:r>
-              <w:rPr>
-                <w:rFonts w:ascii="Arial" w:hAnsi="Arial"/>
-                <w:sz w:val="19"/>
-              </w:rPr>
-              <w:t>El cliente solo opera sobre sus turnos; empleados y administradores pueden operar sobre cualquiera.</w:t>
-            </w:r>
-          </w:p>
-        </w:tc>
-      </w:tr>
-      <w:tr>
-        <w:tc>
-          <w:tcPr>
-            <w:tcW w:type="dxa" w:w="1152"/>
-            <w:vAlign w:val="center"/>
-            <w:tcMar>
-              <w:top w:w="100" w:type="dxa"/>
-              <w:start w:w="120" w:type="dxa"/>
-              <w:bottom w:w="100" w:type="dxa"/>
-              <w:end w:w="120" w:type="dxa"/>
-            </w:tcMar>
-          </w:tcPr>
-          <w:p>
-            <w:pPr>
-              <w:spacing w:after="40" w:before="40"/>
-            </w:pPr>
-            <w:r>
-              <w:rPr>
-                <w:rFonts w:ascii="Arial" w:hAnsi="Arial"/>
-                <w:sz w:val="19"/>
-              </w:rPr>
-              <w:t>RN-11</w:t>
-            </w:r>
-          </w:p>
-        </w:tc>
-        <w:tc>
-          <w:tcPr>
-            <w:tcW w:type="dxa" w:w="8928"/>
-            <w:vAlign w:val="center"/>
-            <w:tcMar>
-              <w:top w:w="100" w:type="dxa"/>
-              <w:start w:w="120" w:type="dxa"/>
-              <w:bottom w:w="100" w:type="dxa"/>
-              <w:end w:w="120" w:type="dxa"/>
-            </w:tcMar>
-          </w:tcPr>
-          <w:p>
-            <w:pPr>
-              <w:spacing w:after="40" w:before="40"/>
-            </w:pPr>
-            <w:r>
-              <w:rPr>
-                <w:rFonts w:ascii="Arial" w:hAnsi="Arial"/>
-                <w:sz w:val="19"/>
-              </w:rPr>
-              <w:t>Los turnos nuevos o reprogramados deben tener fecha y hora futuras.</w:t>
-            </w:r>
-          </w:p>
-        </w:tc>
-      </w:tr>
-    </w:tbl>
-    <w:p/>
-    <w:p>
-      <w:r>
-        <w:br w:type="page"/>
-      </w:r>
-    </w:p>
-    <w:p>
-      <w:pPr>
-        <w:pStyle w:val="Heading1"/>
-      </w:pPr>
-      <w:r>
-        <w:t>CU-01 Solicitar Turno</w:t>
-      </w:r>
-    </w:p>
-    <w:tbl>
-      <w:tblPr>
-        <w:tblStyle w:val="TableGrid"/>
-        <w:tblW w:type="auto" w:w="0"/>
-        <w:jc w:val="center"/>
-        <w:tblLook w:firstColumn="1" w:firstRow="1" w:lastColumn="0" w:lastRow="0" w:noHBand="0" w:noVBand="1" w:val="04A0"/>
-      </w:tblPr>
-      <w:tblGrid>
-        <w:gridCol w:w="5040"/>
-        <w:gridCol w:w="5040"/>
-      </w:tblGrid>
-      <w:tr>
-        <w:trPr>
-          <w:tblHeader w:val="true"/>
-        </w:trPr>
-        <w:tc>
-          <w:tcPr>
-            <w:tcW w:type="dxa" w:w="2376"/>
-            <w:vAlign w:val="center"/>
-            <w:tcMar>
-              <w:top w:w="100" w:type="dxa"/>
-              <w:start w:w="120" w:type="dxa"/>
-              <w:bottom w:w="100" w:type="dxa"/>
-              <w:end w:w="120" w:type="dxa"/>
-            </w:tcMar>
-            <w:shd w:fill="1F4E78"/>
-          </w:tcPr>
-          <w:p>
-            <w:pPr>
-              <w:spacing w:after="40" w:before="40"/>
-            </w:pPr>
-            <w:r>
-              <w:rPr>
-                <w:rFonts w:ascii="Arial" w:hAnsi="Arial"/>
-                <w:b/>
-                <w:color w:val="FFFFFF"/>
-                <w:sz w:val="19"/>
-              </w:rPr>
-              <w:t>Campo</w:t>
-            </w:r>
-          </w:p>
-        </w:tc>
-        <w:tc>
-          <w:tcPr>
-            <w:tcW w:type="dxa" w:w="7704"/>
-            <w:vAlign w:val="center"/>
-            <w:tcMar>
-              <w:top w:w="100" w:type="dxa"/>
-              <w:start w:w="120" w:type="dxa"/>
-              <w:bottom w:w="100" w:type="dxa"/>
-              <w:end w:w="120" w:type="dxa"/>
-            </w:tcMar>
-            <w:shd w:fill="1F4E78"/>
-          </w:tcPr>
-          <w:p>
-            <w:pPr>
-              <w:spacing w:after="40" w:before="40"/>
-            </w:pPr>
-            <w:r>
-              <w:rPr>
-                <w:rFonts w:ascii="Arial" w:hAnsi="Arial"/>
-                <w:b/>
-                <w:color w:val="FFFFFF"/>
-                <w:sz w:val="19"/>
-              </w:rPr>
-              <w:t>Definición</w:t>
-            </w:r>
-          </w:p>
-        </w:tc>
-      </w:tr>
-      <w:tr>
-        <w:tc>
-          <w:tcPr>
-            <w:tcW w:type="dxa" w:w="2376"/>
-            <w:vAlign w:val="center"/>
-            <w:tcMar>
-              <w:top w:w="100" w:type="dxa"/>
-              <w:start w:w="120" w:type="dxa"/>
-              <w:bottom w:w="100" w:type="dxa"/>
-              <w:end w:w="120" w:type="dxa"/>
-            </w:tcMar>
-          </w:tcPr>
-          <w:p>
-            <w:pPr>
-              <w:spacing w:after="40" w:before="40"/>
-            </w:pPr>
-            <w:r>
-              <w:rPr>
-                <w:rFonts w:ascii="Arial" w:hAnsi="Arial"/>
-                <w:sz w:val="19"/>
-              </w:rPr>
-              <w:t>Actor principal</w:t>
-            </w:r>
-          </w:p>
-        </w:tc>
-        <w:tc>
-          <w:tcPr>
-            <w:tcW w:type="dxa" w:w="7704"/>
-            <w:vAlign w:val="center"/>
-            <w:tcMar>
-              <w:top w:w="100" w:type="dxa"/>
-              <w:start w:w="120" w:type="dxa"/>
-              <w:bottom w:w="100" w:type="dxa"/>
-              <w:end w:w="120" w:type="dxa"/>
-            </w:tcMar>
-          </w:tcPr>
-          <w:p>
-            <w:pPr>
-              <w:spacing w:after="40" w:before="40"/>
-            </w:pPr>
-            <w:r>
-              <w:rPr>
-                <w:rFonts w:ascii="Arial" w:hAnsi="Arial"/>
-                <w:sz w:val="19"/>
+                <w:b w:val="0"/>
+                <w:sz w:val="20"/>
               </w:rPr>
               <w:t>Cliente</w:t>
             </w:r>
@@ -1335,51 +519,76 @@
       <w:tr>
         <w:tc>
           <w:tcPr>
-            <w:tcW w:type="dxa" w:w="2376"/>
+            <w:tcW w:type="dxa" w:w="936"/>
             <w:vAlign w:val="center"/>
-            <w:tcMar>
-              <w:top w:w="100" w:type="dxa"/>
-              <w:start w:w="120" w:type="dxa"/>
-              <w:bottom w:w="100" w:type="dxa"/>
-              <w:end w:w="120" w:type="dxa"/>
-            </w:tcMar>
-            <w:shd w:fill="EAF2F8"/>
+            <w:shd w:fill="FFFFFF"/>
+            <w:tcBorders>
+              <w:top w:val="single" w:sz="4" w:color="D9D9D9"/>
+              <w:left w:val="single" w:sz="4" w:color="D9D9D9"/>
+              <w:bottom w:val="single" w:sz="4" w:color="D9D9D9"/>
+              <w:right w:val="single" w:sz="4" w:color="D9D9D9"/>
+            </w:tcBorders>
           </w:tcPr>
           <w:p>
             <w:pPr>
-              <w:spacing w:after="40" w:before="40"/>
+              <w:spacing w:before="80" w:after="80"/>
             </w:pPr>
             <w:r>
               <w:rPr>
-                <w:rFonts w:ascii="Arial" w:hAnsi="Arial"/>
-                <w:sz w:val="19"/>
+                <w:b w:val="0"/>
+                <w:sz w:val="20"/>
               </w:rPr>
-              <w:t>Objetivo</w:t>
+              <w:t>CU-02</w:t>
             </w:r>
           </w:p>
         </w:tc>
         <w:tc>
           <w:tcPr>
-            <w:tcW w:type="dxa" w:w="7704"/>
+            <w:tcW w:type="dxa" w:w="4608"/>
             <w:vAlign w:val="center"/>
-            <w:tcMar>
-              <w:top w:w="100" w:type="dxa"/>
-              <w:start w:w="120" w:type="dxa"/>
-              <w:bottom w:w="100" w:type="dxa"/>
-              <w:end w:w="120" w:type="dxa"/>
-            </w:tcMar>
-            <w:shd w:fill="EAF2F8"/>
+            <w:shd w:fill="FFFFFF"/>
+            <w:tcBorders>
+              <w:top w:val="single" w:sz="4" w:color="D9D9D9"/>
+              <w:left w:val="single" w:sz="4" w:color="D9D9D9"/>
+              <w:bottom w:val="single" w:sz="4" w:color="D9D9D9"/>
+              <w:right w:val="single" w:sz="4" w:color="D9D9D9"/>
+            </w:tcBorders>
           </w:tcPr>
           <w:p>
             <w:pPr>
-              <w:spacing w:after="40" w:before="40"/>
+              <w:spacing w:before="80" w:after="80"/>
             </w:pPr>
             <w:r>
               <w:rPr>
-                <w:rFonts w:ascii="Arial" w:hAnsi="Arial"/>
-                <w:sz w:val="19"/>
+                <w:b w:val="0"/>
+                <w:sz w:val="20"/>
               </w:rPr>
-              <w:t>Reservar un horario para un servicio de lavado.</w:t>
+              <w:t>Procesar Recordatorios</w:t>
+            </w:r>
+          </w:p>
+        </w:tc>
+        <w:tc>
+          <w:tcPr>
+            <w:tcW w:type="dxa" w:w="4392"/>
+            <w:vAlign w:val="center"/>
+            <w:shd w:fill="FFFFFF"/>
+            <w:tcBorders>
+              <w:top w:val="single" w:sz="4" w:color="D9D9D9"/>
+              <w:left w:val="single" w:sz="4" w:color="D9D9D9"/>
+              <w:bottom w:val="single" w:sz="4" w:color="D9D9D9"/>
+              <w:right w:val="single" w:sz="4" w:color="D9D9D9"/>
+            </w:tcBorders>
+          </w:tcPr>
+          <w:p>
+            <w:pPr>
+              <w:spacing w:before="80" w:after="80"/>
+            </w:pPr>
+            <w:r>
+              <w:rPr>
+                <w:b w:val="0"/>
+                <w:sz w:val="20"/>
+              </w:rPr>
+              <w:t>Proceso programado o Administrador</w:t>
             </w:r>
           </w:p>
         </w:tc>
@@ -1387,784 +596,74 @@
       <w:tr>
         <w:tc>
           <w:tcPr>
-            <w:tcW w:type="dxa" w:w="2376"/>
+            <w:tcW w:type="dxa" w:w="936"/>
             <w:vAlign w:val="center"/>
-            <w:tcMar>
-              <w:top w:w="100" w:type="dxa"/>
-              <w:start w:w="120" w:type="dxa"/>
-              <w:bottom w:w="100" w:type="dxa"/>
-              <w:end w:w="120" w:type="dxa"/>
-            </w:tcMar>
+            <w:shd w:fill="FFFFFF"/>
+            <w:tcBorders>
+              <w:top w:val="single" w:sz="4" w:color="D9D9D9"/>
+              <w:left w:val="single" w:sz="4" w:color="D9D9D9"/>
+              <w:bottom w:val="single" w:sz="4" w:color="D9D9D9"/>
+              <w:right w:val="single" w:sz="4" w:color="D9D9D9"/>
+            </w:tcBorders>
           </w:tcPr>
           <w:p>
             <w:pPr>
-              <w:spacing w:after="40" w:before="40"/>
+              <w:spacing w:before="80" w:after="80"/>
             </w:pPr>
             <w:r>
               <w:rPr>
-                <w:rFonts w:ascii="Arial" w:hAnsi="Arial"/>
-                <w:sz w:val="19"/>
+                <w:b w:val="0"/>
+                <w:sz w:val="20"/>
               </w:rPr>
-              <w:t>Precondiciones</w:t>
+              <w:t>CU-03</w:t>
             </w:r>
           </w:p>
         </w:tc>
         <w:tc>
           <w:tcPr>
-            <w:tcW w:type="dxa" w:w="7704"/>
+            <w:tcW w:type="dxa" w:w="4608"/>
             <w:vAlign w:val="center"/>
-            <w:tcMar>
-              <w:top w:w="100" w:type="dxa"/>
-              <w:start w:w="120" w:type="dxa"/>
-              <w:bottom w:w="100" w:type="dxa"/>
-              <w:end w:w="120" w:type="dxa"/>
-            </w:tcMar>
+            <w:shd w:fill="FFFFFF"/>
+            <w:tcBorders>
+              <w:top w:val="single" w:sz="4" w:color="D9D9D9"/>
+              <w:left w:val="single" w:sz="4" w:color="D9D9D9"/>
+              <w:bottom w:val="single" w:sz="4" w:color="D9D9D9"/>
+              <w:right w:val="single" w:sz="4" w:color="D9D9D9"/>
+            </w:tcBorders>
           </w:tcPr>
           <w:p>
             <w:pPr>
-              <w:spacing w:after="40" w:before="40"/>
+              <w:spacing w:before="80" w:after="80"/>
             </w:pPr>
             <w:r>
               <w:rPr>
-                <w:rFonts w:ascii="Arial" w:hAnsi="Arial"/>
-                <w:sz w:val="19"/>
+                <w:b w:val="0"/>
+                <w:sz w:val="20"/>
               </w:rPr>
-              <w:t>Cliente registrado y autenticado; catálogo y agenda disponibles.</w:t>
-            </w:r>
-          </w:p>
-        </w:tc>
-      </w:tr>
-      <w:tr>
-        <w:tc>
-          <w:tcPr>
-            <w:tcW w:type="dxa" w:w="2376"/>
-            <w:vAlign w:val="center"/>
-            <w:tcMar>
-              <w:top w:w="100" w:type="dxa"/>
-              <w:start w:w="120" w:type="dxa"/>
-              <w:bottom w:w="100" w:type="dxa"/>
-              <w:end w:w="120" w:type="dxa"/>
-            </w:tcMar>
-            <w:shd w:fill="EAF2F8"/>
-          </w:tcPr>
-          <w:p>
-            <w:pPr>
-              <w:spacing w:after="40" w:before="40"/>
-            </w:pPr>
-            <w:r>
-              <w:rPr>
-                <w:rFonts w:ascii="Arial" w:hAnsi="Arial"/>
-                <w:sz w:val="19"/>
-              </w:rPr>
-              <w:t>Reglas relacionadas</w:t>
+              <w:t>Crear Turno</w:t>
             </w:r>
           </w:p>
         </w:tc>
         <w:tc>
           <w:tcPr>
-            <w:tcW w:type="dxa" w:w="7704"/>
+            <w:tcW w:type="dxa" w:w="4392"/>
             <w:vAlign w:val="center"/>
-            <w:tcMar>
-              <w:top w:w="100" w:type="dxa"/>
-              <w:start w:w="120" w:type="dxa"/>
-              <w:bottom w:w="100" w:type="dxa"/>
-              <w:end w:w="120" w:type="dxa"/>
-            </w:tcMar>
-            <w:shd w:fill="EAF2F8"/>
+            <w:shd w:fill="FFFFFF"/>
+            <w:tcBorders>
+              <w:top w:val="single" w:sz="4" w:color="D9D9D9"/>
+              <w:left w:val="single" w:sz="4" w:color="D9D9D9"/>
+              <w:bottom w:val="single" w:sz="4" w:color="D9D9D9"/>
+              <w:right w:val="single" w:sz="4" w:color="D9D9D9"/>
+            </w:tcBorders>
           </w:tcPr>
           <w:p>
             <w:pPr>
-              <w:spacing w:after="40" w:before="40"/>
+              <w:spacing w:before="80" w:after="80"/>
             </w:pPr>
             <w:r>
               <w:rPr>
-                <w:rFonts w:ascii="Arial" w:hAnsi="Arial"/>
-                <w:sz w:val="19"/>
-              </w:rPr>
-              <w:t>RN-01, RN-02, RN-03, RN-10 y RN-11.</w:t>
-            </w:r>
-          </w:p>
-        </w:tc>
-      </w:tr>
-    </w:tbl>
-    <w:p/>
-    <w:p>
-      <w:pPr>
-        <w:pStyle w:val="Heading2"/>
-      </w:pPr>
-      <w:r>
-        <w:t>Flujo principal</w:t>
-      </w:r>
-    </w:p>
-    <w:p>
-      <w:pPr>
-        <w:spacing w:after="60"/>
-        <w:ind w:left="360" w:hanging="360"/>
-      </w:pPr>
-      <w:r>
-        <w:t>1.  El cliente consulta los servicios y horarios disponibles.</w:t>
-      </w:r>
-    </w:p>
-    <w:p>
-      <w:pPr>
-        <w:spacing w:after="60"/>
-        <w:ind w:left="360" w:hanging="360"/>
-      </w:pPr>
-      <w:r>
-        <w:t>2.  Selecciona un servicio, una fecha y una hora.</w:t>
-      </w:r>
-    </w:p>
-    <w:p>
-      <w:pPr>
-        <w:spacing w:after="60"/>
-        <w:ind w:left="360" w:hanging="360"/>
-      </w:pPr>
-      <w:r>
-        <w:t>3.  El sistema identifica al cliente autenticado y valida servicio, fecha y disponibilidad.</w:t>
-      </w:r>
-    </w:p>
-    <w:p>
-      <w:pPr>
-        <w:spacing w:after="60"/>
-        <w:ind w:left="360" w:hanging="360"/>
-      </w:pPr>
-      <w:r>
-        <w:t>4.  El sistema registra el turno con estado Confirmado y comunica el resultado.</w:t>
-      </w:r>
-    </w:p>
-    <w:p>
-      <w:pPr>
-        <w:pStyle w:val="Heading2"/>
-      </w:pPr>
-      <w:r>
-        <w:t>Flujos alternativos</w:t>
-      </w:r>
-    </w:p>
-    <w:p>
-      <w:pPr>
-        <w:pStyle w:val="ListBullet"/>
-        <w:spacing w:after="80"/>
-      </w:pPr>
-      <w:r>
-        <w:rPr>
-          <w:b/>
-        </w:rPr>
-        <w:t xml:space="preserve">Horario ocupado: </w:t>
-      </w:r>
-      <w:r>
-        <w:t>el sistema informa el conflicto y permite elegir otro horario.</w:t>
-      </w:r>
-    </w:p>
-    <w:p>
-      <w:pPr>
-        <w:pStyle w:val="ListBullet"/>
-        <w:spacing w:after="80"/>
-      </w:pPr>
-      <w:r>
-        <w:rPr>
-          <w:b/>
-        </w:rPr>
-        <w:t xml:space="preserve">Servicio inexistente o inactivo: </w:t>
-      </w:r>
-      <w:r>
-        <w:t>el sistema rechaza la solicitud.</w:t>
-      </w:r>
-    </w:p>
-    <w:p>
-      <w:pPr>
-        <w:pStyle w:val="ListBullet"/>
-        <w:spacing w:after="80"/>
-      </w:pPr>
-      <w:r>
-        <w:rPr>
-          <w:b/>
-        </w:rPr>
-        <w:t xml:space="preserve">Fecha pasada: </w:t>
-      </w:r>
-      <w:r>
-        <w:t>el sistema informa que el turno debe ser futuro.</w:t>
-      </w:r>
-    </w:p>
-    <w:p>
-      <w:pPr>
-        <w:pStyle w:val="ListBullet"/>
-        <w:spacing w:after="80"/>
-      </w:pPr>
-      <w:r>
-        <w:rPr>
-          <w:b/>
-        </w:rPr>
-        <w:t xml:space="preserve">Operación cancelada: </w:t>
-      </w:r>
-      <w:r>
-        <w:t>no se registra ningún turno.</w:t>
-      </w:r>
-    </w:p>
-    <w:p>
-      <w:pPr>
-        <w:pStyle w:val="Heading2"/>
-      </w:pPr>
-      <w:r>
-        <w:t>Postcondiciones</w:t>
-      </w:r>
-    </w:p>
-    <w:p>
-      <w:pPr>
-        <w:pStyle w:val="ListBullet"/>
-        <w:spacing w:after="60"/>
-      </w:pPr>
-      <w:r>
-        <w:t>El turno queda confirmado.</w:t>
-      </w:r>
-    </w:p>
-    <w:p>
-      <w:pPr>
-        <w:pStyle w:val="ListBullet"/>
-        <w:spacing w:after="60"/>
-      </w:pPr>
-      <w:r>
-        <w:t>La fecha y hora dejan de estar disponibles.</w:t>
-      </w:r>
-    </w:p>
-    <w:p>
-      <w:r>
-        <w:br w:type="page"/>
-      </w:r>
-    </w:p>
-    <w:p>
-      <w:pPr>
-        <w:pStyle w:val="Heading1"/>
-      </w:pPr>
-      <w:r>
-        <w:t>CU-02 Procesar Recordatorios</w:t>
-      </w:r>
-    </w:p>
-    <w:tbl>
-      <w:tblPr>
-        <w:tblStyle w:val="TableGrid"/>
-        <w:tblW w:type="auto" w:w="0"/>
-        <w:jc w:val="center"/>
-        <w:tblLook w:firstColumn="1" w:firstRow="1" w:lastColumn="0" w:lastRow="0" w:noHBand="0" w:noVBand="1" w:val="04A0"/>
-      </w:tblPr>
-      <w:tblGrid>
-        <w:gridCol w:w="5040"/>
-        <w:gridCol w:w="5040"/>
-      </w:tblGrid>
-      <w:tr>
-        <w:trPr>
-          <w:tblHeader w:val="true"/>
-        </w:trPr>
-        <w:tc>
-          <w:tcPr>
-            <w:tcW w:type="dxa" w:w="2376"/>
-            <w:vAlign w:val="center"/>
-            <w:tcMar>
-              <w:top w:w="100" w:type="dxa"/>
-              <w:start w:w="120" w:type="dxa"/>
-              <w:bottom w:w="100" w:type="dxa"/>
-              <w:end w:w="120" w:type="dxa"/>
-            </w:tcMar>
-            <w:shd w:fill="1F4E78"/>
-          </w:tcPr>
-          <w:p>
-            <w:pPr>
-              <w:spacing w:after="40" w:before="40"/>
-            </w:pPr>
-            <w:r>
-              <w:rPr>
-                <w:rFonts w:ascii="Arial" w:hAnsi="Arial"/>
-                <w:b/>
-                <w:color w:val="FFFFFF"/>
-                <w:sz w:val="19"/>
-              </w:rPr>
-              <w:t>Campo</w:t>
-            </w:r>
-          </w:p>
-        </w:tc>
-        <w:tc>
-          <w:tcPr>
-            <w:tcW w:type="dxa" w:w="7704"/>
-            <w:vAlign w:val="center"/>
-            <w:tcMar>
-              <w:top w:w="100" w:type="dxa"/>
-              <w:start w:w="120" w:type="dxa"/>
-              <w:bottom w:w="100" w:type="dxa"/>
-              <w:end w:w="120" w:type="dxa"/>
-            </w:tcMar>
-            <w:shd w:fill="1F4E78"/>
-          </w:tcPr>
-          <w:p>
-            <w:pPr>
-              <w:spacing w:after="40" w:before="40"/>
-            </w:pPr>
-            <w:r>
-              <w:rPr>
-                <w:rFonts w:ascii="Arial" w:hAnsi="Arial"/>
-                <w:b/>
-                <w:color w:val="FFFFFF"/>
-                <w:sz w:val="19"/>
-              </w:rPr>
-              <w:t>Definición</w:t>
-            </w:r>
-          </w:p>
-        </w:tc>
-      </w:tr>
-      <w:tr>
-        <w:tc>
-          <w:tcPr>
-            <w:tcW w:type="dxa" w:w="2376"/>
-            <w:vAlign w:val="center"/>
-            <w:tcMar>
-              <w:top w:w="100" w:type="dxa"/>
-              <w:start w:w="120" w:type="dxa"/>
-              <w:bottom w:w="100" w:type="dxa"/>
-              <w:end w:w="120" w:type="dxa"/>
-            </w:tcMar>
-          </w:tcPr>
-          <w:p>
-            <w:pPr>
-              <w:spacing w:after="40" w:before="40"/>
-            </w:pPr>
-            <w:r>
-              <w:rPr>
-                <w:rFonts w:ascii="Arial" w:hAnsi="Arial"/>
-                <w:sz w:val="19"/>
-              </w:rPr>
-              <w:t>Actor principal</w:t>
-            </w:r>
-          </w:p>
-        </w:tc>
-        <w:tc>
-          <w:tcPr>
-            <w:tcW w:type="dxa" w:w="7704"/>
-            <w:vAlign w:val="center"/>
-            <w:tcMar>
-              <w:top w:w="100" w:type="dxa"/>
-              <w:start w:w="120" w:type="dxa"/>
-              <w:bottom w:w="100" w:type="dxa"/>
-              <w:end w:w="120" w:type="dxa"/>
-            </w:tcMar>
-          </w:tcPr>
-          <w:p>
-            <w:pPr>
-              <w:spacing w:after="40" w:before="40"/>
-            </w:pPr>
-            <w:r>
-              <w:rPr>
-                <w:rFonts w:ascii="Arial" w:hAnsi="Arial"/>
-                <w:sz w:val="19"/>
-              </w:rPr>
-              <w:t>Proceso programado del sistema</w:t>
-            </w:r>
-          </w:p>
-        </w:tc>
-      </w:tr>
-      <w:tr>
-        <w:tc>
-          <w:tcPr>
-            <w:tcW w:type="dxa" w:w="2376"/>
-            <w:vAlign w:val="center"/>
-            <w:tcMar>
-              <w:top w:w="100" w:type="dxa"/>
-              <w:start w:w="120" w:type="dxa"/>
-              <w:bottom w:w="100" w:type="dxa"/>
-              <w:end w:w="120" w:type="dxa"/>
-            </w:tcMar>
-            <w:shd w:fill="EAF2F8"/>
-          </w:tcPr>
-          <w:p>
-            <w:pPr>
-              <w:spacing w:after="40" w:before="40"/>
-            </w:pPr>
-            <w:r>
-              <w:rPr>
-                <w:rFonts w:ascii="Arial" w:hAnsi="Arial"/>
-                <w:sz w:val="19"/>
-              </w:rPr>
-              <w:t>Objetivo</w:t>
-            </w:r>
-          </w:p>
-        </w:tc>
-        <w:tc>
-          <w:tcPr>
-            <w:tcW w:type="dxa" w:w="7704"/>
-            <w:vAlign w:val="center"/>
-            <w:tcMar>
-              <w:top w:w="100" w:type="dxa"/>
-              <w:start w:w="120" w:type="dxa"/>
-              <w:bottom w:w="100" w:type="dxa"/>
-              <w:end w:w="120" w:type="dxa"/>
-            </w:tcMar>
-            <w:shd w:fill="EAF2F8"/>
-          </w:tcPr>
-          <w:p>
-            <w:pPr>
-              <w:spacing w:after="40" w:before="40"/>
-            </w:pPr>
-            <w:r>
-              <w:rPr>
-                <w:rFonts w:ascii="Arial" w:hAnsi="Arial"/>
-                <w:sz w:val="19"/>
-              </w:rPr>
-              <w:t>Recordar a los clientes sus turnos próximos.</w:t>
-            </w:r>
-          </w:p>
-        </w:tc>
-      </w:tr>
-      <w:tr>
-        <w:tc>
-          <w:tcPr>
-            <w:tcW w:type="dxa" w:w="2376"/>
-            <w:vAlign w:val="center"/>
-            <w:tcMar>
-              <w:top w:w="100" w:type="dxa"/>
-              <w:start w:w="120" w:type="dxa"/>
-              <w:bottom w:w="100" w:type="dxa"/>
-              <w:end w:w="120" w:type="dxa"/>
-            </w:tcMar>
-          </w:tcPr>
-          <w:p>
-            <w:pPr>
-              <w:spacing w:after="40" w:before="40"/>
-            </w:pPr>
-            <w:r>
-              <w:rPr>
-                <w:rFonts w:ascii="Arial" w:hAnsi="Arial"/>
-                <w:sz w:val="19"/>
-              </w:rPr>
-              <w:t>Precondiciones</w:t>
-            </w:r>
-          </w:p>
-        </w:tc>
-        <w:tc>
-          <w:tcPr>
-            <w:tcW w:type="dxa" w:w="7704"/>
-            <w:vAlign w:val="center"/>
-            <w:tcMar>
-              <w:top w:w="100" w:type="dxa"/>
-              <w:start w:w="120" w:type="dxa"/>
-              <w:bottom w:w="100" w:type="dxa"/>
-              <w:end w:w="120" w:type="dxa"/>
-            </w:tcMar>
-          </w:tcPr>
-          <w:p>
-            <w:pPr>
-              <w:spacing w:after="40" w:before="40"/>
-            </w:pPr>
-            <w:r>
-              <w:rPr>
-                <w:rFonts w:ascii="Arial" w:hAnsi="Arial"/>
-                <w:sz w:val="19"/>
-              </w:rPr>
-              <w:t>Existe un turno próximo confirmado y el cliente posee un medio de contacto.</w:t>
-            </w:r>
-          </w:p>
-        </w:tc>
-      </w:tr>
-      <w:tr>
-        <w:tc>
-          <w:tcPr>
-            <w:tcW w:type="dxa" w:w="2376"/>
-            <w:vAlign w:val="center"/>
-            <w:tcMar>
-              <w:top w:w="100" w:type="dxa"/>
-              <w:start w:w="120" w:type="dxa"/>
-              <w:bottom w:w="100" w:type="dxa"/>
-              <w:end w:w="120" w:type="dxa"/>
-            </w:tcMar>
-            <w:shd w:fill="EAF2F8"/>
-          </w:tcPr>
-          <w:p>
-            <w:pPr>
-              <w:spacing w:after="40" w:before="40"/>
-            </w:pPr>
-            <w:r>
-              <w:rPr>
-                <w:rFonts w:ascii="Arial" w:hAnsi="Arial"/>
-                <w:sz w:val="19"/>
-              </w:rPr>
-              <w:t>Reglas relacionadas</w:t>
-            </w:r>
-          </w:p>
-        </w:tc>
-        <w:tc>
-          <w:tcPr>
-            <w:tcW w:type="dxa" w:w="7704"/>
-            <w:vAlign w:val="center"/>
-            <w:tcMar>
-              <w:top w:w="100" w:type="dxa"/>
-              <w:start w:w="120" w:type="dxa"/>
-              <w:bottom w:w="100" w:type="dxa"/>
-              <w:end w:w="120" w:type="dxa"/>
-            </w:tcMar>
-            <w:shd w:fill="EAF2F8"/>
-          </w:tcPr>
-          <w:p>
-            <w:pPr>
-              <w:spacing w:after="40" w:before="40"/>
-            </w:pPr>
-            <w:r>
-              <w:rPr>
-                <w:rFonts w:ascii="Arial" w:hAnsi="Arial"/>
-                <w:sz w:val="19"/>
-              </w:rPr>
-              <w:t>RN-04 y RN-05.</w:t>
-            </w:r>
-          </w:p>
-        </w:tc>
-      </w:tr>
-    </w:tbl>
-    <w:p/>
-    <w:p>
-      <w:pPr>
-        <w:pStyle w:val="Heading2"/>
-      </w:pPr>
-      <w:r>
-        <w:t>Flujo principal</w:t>
-      </w:r>
-    </w:p>
-    <w:p>
-      <w:pPr>
-        <w:spacing w:after="60"/>
-        <w:ind w:left="360" w:hanging="360"/>
-      </w:pPr>
-      <w:r>
-        <w:t>1.  El proceso programado identifica los turnos próximos sin recordatorio procesado.</w:t>
-      </w:r>
-    </w:p>
-    <w:p>
-      <w:pPr>
-        <w:spacing w:after="60"/>
-        <w:ind w:left="360" w:hanging="360"/>
-      </w:pPr>
-      <w:r>
-        <w:t>2.  El sistema valida el estado del turno y las preferencias del cliente.</w:t>
-      </w:r>
-    </w:p>
-    <w:p>
-      <w:pPr>
-        <w:spacing w:after="60"/>
-        <w:ind w:left="360" w:hanging="360"/>
-      </w:pPr>
-      <w:r>
-        <w:t>3.  El servicio de notificaciones realiza el envío.</w:t>
-      </w:r>
-    </w:p>
-    <w:p>
-      <w:pPr>
-        <w:spacing w:after="60"/>
-        <w:ind w:left="360" w:hanging="360"/>
-      </w:pPr>
-      <w:r>
-        <w:t>4.  El sistema registra el resultado del intento.</w:t>
-      </w:r>
-    </w:p>
-    <w:p>
-      <w:pPr>
-        <w:pStyle w:val="Heading2"/>
-      </w:pPr>
-      <w:r>
-        <w:t>Flujos alternativos</w:t>
-      </w:r>
-    </w:p>
-    <w:p>
-      <w:pPr>
-        <w:pStyle w:val="ListBullet"/>
-        <w:spacing w:after="80"/>
-      </w:pPr>
-      <w:r>
-        <w:rPr>
-          <w:b/>
-        </w:rPr>
-        <w:t xml:space="preserve">Turno cancelado: </w:t>
-      </w:r>
-      <w:r>
-        <w:t>no se envía el recordatorio.</w:t>
-      </w:r>
-    </w:p>
-    <w:p>
-      <w:pPr>
-        <w:pStyle w:val="ListBullet"/>
-        <w:spacing w:after="80"/>
-      </w:pPr>
-      <w:r>
-        <w:rPr>
-          <w:b/>
-        </w:rPr>
-        <w:t xml:space="preserve">Contacto inválido: </w:t>
-      </w:r>
-      <w:r>
-        <w:t>se registra el intento fallido y continúa el proceso.</w:t>
-      </w:r>
-    </w:p>
-    <w:p>
-      <w:pPr>
-        <w:pStyle w:val="ListBullet"/>
-        <w:spacing w:after="80"/>
-      </w:pPr>
-      <w:r>
-        <w:rPr>
-          <w:b/>
-        </w:rPr>
-        <w:t xml:space="preserve">Notificaciones desactivadas: </w:t>
-      </w:r>
-      <w:r>
-        <w:t>se respeta la preferencia y no se envía.</w:t>
-      </w:r>
-    </w:p>
-    <w:p>
-      <w:pPr>
-        <w:pStyle w:val="Heading2"/>
-      </w:pPr>
-      <w:r>
-        <w:t>Postcondiciones</w:t>
-      </w:r>
-    </w:p>
-    <w:p>
-      <w:pPr>
-        <w:pStyle w:val="ListBullet"/>
-        <w:spacing w:after="60"/>
-      </w:pPr>
-      <w:r>
-        <w:t>El intento queda registrado.</w:t>
-      </w:r>
-    </w:p>
-    <w:p>
-      <w:pPr>
-        <w:pStyle w:val="ListBullet"/>
-        <w:spacing w:after="60"/>
-      </w:pPr>
-      <w:r>
-        <w:t>Un recordatorio procesado no vuelve a enviarse.</w:t>
-      </w:r>
-    </w:p>
-    <w:p>
-      <w:r>
-        <w:br w:type="page"/>
-      </w:r>
-    </w:p>
-    <w:p>
-      <w:pPr>
-        <w:pStyle w:val="Heading1"/>
-      </w:pPr>
-      <w:r>
-        <w:t>CU-03 Crear Turno</w:t>
-      </w:r>
-    </w:p>
-    <w:tbl>
-      <w:tblPr>
-        <w:tblStyle w:val="TableGrid"/>
-        <w:tblW w:type="auto" w:w="0"/>
-        <w:jc w:val="center"/>
-        <w:tblLook w:firstColumn="1" w:firstRow="1" w:lastColumn="0" w:lastRow="0" w:noHBand="0" w:noVBand="1" w:val="04A0"/>
-      </w:tblPr>
-      <w:tblGrid>
-        <w:gridCol w:w="5040"/>
-        <w:gridCol w:w="5040"/>
-      </w:tblGrid>
-      <w:tr>
-        <w:trPr>
-          <w:tblHeader w:val="true"/>
-        </w:trPr>
-        <w:tc>
-          <w:tcPr>
-            <w:tcW w:type="dxa" w:w="2376"/>
-            <w:vAlign w:val="center"/>
-            <w:tcMar>
-              <w:top w:w="100" w:type="dxa"/>
-              <w:start w:w="120" w:type="dxa"/>
-              <w:bottom w:w="100" w:type="dxa"/>
-              <w:end w:w="120" w:type="dxa"/>
-            </w:tcMar>
-            <w:shd w:fill="1F4E78"/>
-          </w:tcPr>
-          <w:p>
-            <w:pPr>
-              <w:spacing w:after="40" w:before="40"/>
-            </w:pPr>
-            <w:r>
-              <w:rPr>
-                <w:rFonts w:ascii="Arial" w:hAnsi="Arial"/>
-                <w:b/>
-                <w:color w:val="FFFFFF"/>
-                <w:sz w:val="19"/>
-              </w:rPr>
-              <w:t>Campo</w:t>
-            </w:r>
-          </w:p>
-        </w:tc>
-        <w:tc>
-          <w:tcPr>
-            <w:tcW w:type="dxa" w:w="7704"/>
-            <w:vAlign w:val="center"/>
-            <w:tcMar>
-              <w:top w:w="100" w:type="dxa"/>
-              <w:start w:w="120" w:type="dxa"/>
-              <w:bottom w:w="100" w:type="dxa"/>
-              <w:end w:w="120" w:type="dxa"/>
-            </w:tcMar>
-            <w:shd w:fill="1F4E78"/>
-          </w:tcPr>
-          <w:p>
-            <w:pPr>
-              <w:spacing w:after="40" w:before="40"/>
-            </w:pPr>
-            <w:r>
-              <w:rPr>
-                <w:rFonts w:ascii="Arial" w:hAnsi="Arial"/>
-                <w:b/>
-                <w:color w:val="FFFFFF"/>
-                <w:sz w:val="19"/>
-              </w:rPr>
-              <w:t>Definición</w:t>
-            </w:r>
-          </w:p>
-        </w:tc>
-      </w:tr>
-      <w:tr>
-        <w:tc>
-          <w:tcPr>
-            <w:tcW w:type="dxa" w:w="2376"/>
-            <w:vAlign w:val="center"/>
-            <w:tcMar>
-              <w:top w:w="100" w:type="dxa"/>
-              <w:start w:w="120" w:type="dxa"/>
-              <w:bottom w:w="100" w:type="dxa"/>
-              <w:end w:w="120" w:type="dxa"/>
-            </w:tcMar>
-          </w:tcPr>
-          <w:p>
-            <w:pPr>
-              <w:spacing w:after="40" w:before="40"/>
-            </w:pPr>
-            <w:r>
-              <w:rPr>
-                <w:rFonts w:ascii="Arial" w:hAnsi="Arial"/>
-                <w:sz w:val="19"/>
-              </w:rPr>
-              <w:t>Actor principal</w:t>
-            </w:r>
-          </w:p>
-        </w:tc>
-        <w:tc>
-          <w:tcPr>
-            <w:tcW w:type="dxa" w:w="7704"/>
-            <w:vAlign w:val="center"/>
-            <w:tcMar>
-              <w:top w:w="100" w:type="dxa"/>
-              <w:start w:w="120" w:type="dxa"/>
-              <w:bottom w:w="100" w:type="dxa"/>
-              <w:end w:w="120" w:type="dxa"/>
-            </w:tcMar>
-          </w:tcPr>
-          <w:p>
-            <w:pPr>
-              <w:spacing w:after="40" w:before="40"/>
-            </w:pPr>
-            <w:r>
-              <w:rPr>
-                <w:rFonts w:ascii="Arial" w:hAnsi="Arial"/>
-                <w:sz w:val="19"/>
+                <w:b w:val="0"/>
+                <w:sz w:val="20"/>
               </w:rPr>
               <w:t>Empleado o Administrador</w:t>
             </w:r>
@@ -2174,51 +673,76 @@
       <w:tr>
         <w:tc>
           <w:tcPr>
-            <w:tcW w:type="dxa" w:w="2376"/>
+            <w:tcW w:type="dxa" w:w="936"/>
             <w:vAlign w:val="center"/>
-            <w:tcMar>
-              <w:top w:w="100" w:type="dxa"/>
-              <w:start w:w="120" w:type="dxa"/>
-              <w:bottom w:w="100" w:type="dxa"/>
-              <w:end w:w="120" w:type="dxa"/>
-            </w:tcMar>
-            <w:shd w:fill="EAF2F8"/>
+            <w:shd w:fill="FFFFFF"/>
+            <w:tcBorders>
+              <w:top w:val="single" w:sz="4" w:color="D9D9D9"/>
+              <w:left w:val="single" w:sz="4" w:color="D9D9D9"/>
+              <w:bottom w:val="single" w:sz="4" w:color="D9D9D9"/>
+              <w:right w:val="single" w:sz="4" w:color="D9D9D9"/>
+            </w:tcBorders>
           </w:tcPr>
           <w:p>
             <w:pPr>
-              <w:spacing w:after="40" w:before="40"/>
+              <w:spacing w:before="80" w:after="80"/>
             </w:pPr>
             <w:r>
               <w:rPr>
-                <w:rFonts w:ascii="Arial" w:hAnsi="Arial"/>
-                <w:sz w:val="19"/>
+                <w:b w:val="0"/>
+                <w:sz w:val="20"/>
               </w:rPr>
-              <w:t>Objetivo</w:t>
+              <w:t>CU-04</w:t>
             </w:r>
           </w:p>
         </w:tc>
         <w:tc>
           <w:tcPr>
-            <w:tcW w:type="dxa" w:w="7704"/>
+            <w:tcW w:type="dxa" w:w="4608"/>
             <w:vAlign w:val="center"/>
-            <w:tcMar>
-              <w:top w:w="100" w:type="dxa"/>
-              <w:start w:w="120" w:type="dxa"/>
-              <w:bottom w:w="100" w:type="dxa"/>
-              <w:end w:w="120" w:type="dxa"/>
-            </w:tcMar>
-            <w:shd w:fill="EAF2F8"/>
+            <w:shd w:fill="FFFFFF"/>
+            <w:tcBorders>
+              <w:top w:val="single" w:sz="4" w:color="D9D9D9"/>
+              <w:left w:val="single" w:sz="4" w:color="D9D9D9"/>
+              <w:bottom w:val="single" w:sz="4" w:color="D9D9D9"/>
+              <w:right w:val="single" w:sz="4" w:color="D9D9D9"/>
+            </w:tcBorders>
           </w:tcPr>
           <w:p>
             <w:pPr>
-              <w:spacing w:after="40" w:before="40"/>
+              <w:spacing w:before="80" w:after="80"/>
             </w:pPr>
             <w:r>
               <w:rPr>
-                <w:rFonts w:ascii="Arial" w:hAnsi="Arial"/>
-                <w:sz w:val="19"/>
+                <w:b w:val="0"/>
+                <w:sz w:val="20"/>
               </w:rPr>
-              <w:t>Registrar un turno en nombre de un cliente.</w:t>
+              <w:t>Modificar Turno</w:t>
+            </w:r>
+          </w:p>
+        </w:tc>
+        <w:tc>
+          <w:tcPr>
+            <w:tcW w:type="dxa" w:w="4392"/>
+            <w:vAlign w:val="center"/>
+            <w:shd w:fill="FFFFFF"/>
+            <w:tcBorders>
+              <w:top w:val="single" w:sz="4" w:color="D9D9D9"/>
+              <w:left w:val="single" w:sz="4" w:color="D9D9D9"/>
+              <w:bottom w:val="single" w:sz="4" w:color="D9D9D9"/>
+              <w:right w:val="single" w:sz="4" w:color="D9D9D9"/>
+            </w:tcBorders>
+          </w:tcPr>
+          <w:p>
+            <w:pPr>
+              <w:spacing w:before="80" w:after="80"/>
+            </w:pPr>
+            <w:r>
+              <w:rPr>
+                <w:b w:val="0"/>
+                <w:sz w:val="20"/>
+              </w:rPr>
+              <w:t>Cliente o Personal</w:t>
             </w:r>
           </w:p>
         </w:tc>
@@ -2226,49 +750,76 @@
       <w:tr>
         <w:tc>
           <w:tcPr>
-            <w:tcW w:type="dxa" w:w="2376"/>
+            <w:tcW w:type="dxa" w:w="936"/>
             <w:vAlign w:val="center"/>
-            <w:tcMar>
-              <w:top w:w="100" w:type="dxa"/>
-              <w:start w:w="120" w:type="dxa"/>
-              <w:bottom w:w="100" w:type="dxa"/>
-              <w:end w:w="120" w:type="dxa"/>
-            </w:tcMar>
+            <w:shd w:fill="FFFFFF"/>
+            <w:tcBorders>
+              <w:top w:val="single" w:sz="4" w:color="D9D9D9"/>
+              <w:left w:val="single" w:sz="4" w:color="D9D9D9"/>
+              <w:bottom w:val="single" w:sz="4" w:color="D9D9D9"/>
+              <w:right w:val="single" w:sz="4" w:color="D9D9D9"/>
+            </w:tcBorders>
           </w:tcPr>
           <w:p>
             <w:pPr>
-              <w:spacing w:after="40" w:before="40"/>
+              <w:spacing w:before="80" w:after="80"/>
             </w:pPr>
             <w:r>
               <w:rPr>
-                <w:rFonts w:ascii="Arial" w:hAnsi="Arial"/>
-                <w:sz w:val="19"/>
+                <w:b w:val="0"/>
+                <w:sz w:val="20"/>
               </w:rPr>
-              <w:t>Precondiciones</w:t>
+              <w:t>CU-05</w:t>
             </w:r>
           </w:p>
         </w:tc>
         <w:tc>
           <w:tcPr>
-            <w:tcW w:type="dxa" w:w="7704"/>
+            <w:tcW w:type="dxa" w:w="4608"/>
             <w:vAlign w:val="center"/>
-            <w:tcMar>
-              <w:top w:w="100" w:type="dxa"/>
-              <w:start w:w="120" w:type="dxa"/>
-              <w:bottom w:w="100" w:type="dxa"/>
-              <w:end w:w="120" w:type="dxa"/>
-            </w:tcMar>
+            <w:shd w:fill="FFFFFF"/>
+            <w:tcBorders>
+              <w:top w:val="single" w:sz="4" w:color="D9D9D9"/>
+              <w:left w:val="single" w:sz="4" w:color="D9D9D9"/>
+              <w:bottom w:val="single" w:sz="4" w:color="D9D9D9"/>
+              <w:right w:val="single" w:sz="4" w:color="D9D9D9"/>
+            </w:tcBorders>
           </w:tcPr>
           <w:p>
             <w:pPr>
-              <w:spacing w:after="40" w:before="40"/>
+              <w:spacing w:before="80" w:after="80"/>
             </w:pPr>
             <w:r>
               <w:rPr>
-                <w:rFonts w:ascii="Arial" w:hAnsi="Arial"/>
-                <w:sz w:val="19"/>
+                <w:b w:val="0"/>
+                <w:sz w:val="20"/>
               </w:rPr>
-              <w:t>Personal autenticado; cliente registrado.</w:t>
+              <w:t>Cancelar Turno</w:t>
+            </w:r>
+          </w:p>
+        </w:tc>
+        <w:tc>
+          <w:tcPr>
+            <w:tcW w:type="dxa" w:w="4392"/>
+            <w:vAlign w:val="center"/>
+            <w:shd w:fill="FFFFFF"/>
+            <w:tcBorders>
+              <w:top w:val="single" w:sz="4" w:color="D9D9D9"/>
+              <w:left w:val="single" w:sz="4" w:color="D9D9D9"/>
+              <w:bottom w:val="single" w:sz="4" w:color="D9D9D9"/>
+              <w:right w:val="single" w:sz="4" w:color="D9D9D9"/>
+            </w:tcBorders>
+          </w:tcPr>
+          <w:p>
+            <w:pPr>
+              <w:spacing w:before="80" w:after="80"/>
+            </w:pPr>
+            <w:r>
+              <w:rPr>
+                <w:b w:val="0"/>
+                <w:sz w:val="20"/>
+              </w:rPr>
+              <w:t>Cliente o Personal</w:t>
             </w:r>
           </w:p>
         </w:tc>
@@ -2276,1161 +827,74 @@
       <w:tr>
         <w:tc>
           <w:tcPr>
-            <w:tcW w:type="dxa" w:w="2376"/>
+            <w:tcW w:type="dxa" w:w="936"/>
             <w:vAlign w:val="center"/>
-            <w:tcMar>
-              <w:top w:w="100" w:type="dxa"/>
-              <w:start w:w="120" w:type="dxa"/>
-              <w:bottom w:w="100" w:type="dxa"/>
-              <w:end w:w="120" w:type="dxa"/>
-            </w:tcMar>
-            <w:shd w:fill="EAF2F8"/>
+            <w:shd w:fill="FFFFFF"/>
+            <w:tcBorders>
+              <w:top w:val="single" w:sz="4" w:color="D9D9D9"/>
+              <w:left w:val="single" w:sz="4" w:color="D9D9D9"/>
+              <w:bottom w:val="single" w:sz="4" w:color="D9D9D9"/>
+              <w:right w:val="single" w:sz="4" w:color="D9D9D9"/>
+            </w:tcBorders>
           </w:tcPr>
           <w:p>
             <w:pPr>
-              <w:spacing w:after="40" w:before="40"/>
+              <w:spacing w:before="80" w:after="80"/>
             </w:pPr>
             <w:r>
               <w:rPr>
-                <w:rFonts w:ascii="Arial" w:hAnsi="Arial"/>
-                <w:sz w:val="19"/>
+                <w:b w:val="0"/>
+                <w:sz w:val="20"/>
               </w:rPr>
-              <w:t>Reglas relacionadas</w:t>
+              <w:t>CU-06</w:t>
             </w:r>
           </w:p>
         </w:tc>
         <w:tc>
           <w:tcPr>
-            <w:tcW w:type="dxa" w:w="7704"/>
+            <w:tcW w:type="dxa" w:w="4608"/>
             <w:vAlign w:val="center"/>
-            <w:tcMar>
-              <w:top w:w="100" w:type="dxa"/>
-              <w:start w:w="120" w:type="dxa"/>
-              <w:bottom w:w="100" w:type="dxa"/>
-              <w:end w:w="120" w:type="dxa"/>
-            </w:tcMar>
-            <w:shd w:fill="EAF2F8"/>
+            <w:shd w:fill="FFFFFF"/>
+            <w:tcBorders>
+              <w:top w:val="single" w:sz="4" w:color="D9D9D9"/>
+              <w:left w:val="single" w:sz="4" w:color="D9D9D9"/>
+              <w:bottom w:val="single" w:sz="4" w:color="D9D9D9"/>
+              <w:right w:val="single" w:sz="4" w:color="D9D9D9"/>
+            </w:tcBorders>
           </w:tcPr>
           <w:p>
             <w:pPr>
-              <w:spacing w:after="40" w:before="40"/>
+              <w:spacing w:before="80" w:after="80"/>
             </w:pPr>
             <w:r>
               <w:rPr>
-                <w:rFonts w:ascii="Arial" w:hAnsi="Arial"/>
-                <w:sz w:val="19"/>
+                <w:b w:val="0"/>
+                <w:sz w:val="20"/>
               </w:rPr>
-              <w:t>RN-01, RN-02, RN-03 y RN-11.</w:t>
-            </w:r>
-          </w:p>
-        </w:tc>
-      </w:tr>
-    </w:tbl>
-    <w:p/>
-    <w:p>
-      <w:pPr>
-        <w:pStyle w:val="Heading2"/>
-      </w:pPr>
-      <w:r>
-        <w:t>Flujo principal</w:t>
-      </w:r>
-    </w:p>
-    <w:p>
-      <w:pPr>
-        <w:spacing w:after="60"/>
-        <w:ind w:left="360" w:hanging="360"/>
-      </w:pPr>
-      <w:r>
-        <w:t>1.  El actor busca y selecciona al cliente.</w:t>
-      </w:r>
-    </w:p>
-    <w:p>
-      <w:pPr>
-        <w:spacing w:after="60"/>
-        <w:ind w:left="360" w:hanging="360"/>
-      </w:pPr>
-      <w:r>
-        <w:t>2.  Selecciona el servicio, la fecha y la hora.</w:t>
-      </w:r>
-    </w:p>
-    <w:p>
-      <w:pPr>
-        <w:spacing w:after="60"/>
-        <w:ind w:left="360" w:hanging="360"/>
-      </w:pPr>
-      <w:r>
-        <w:t>3.  El sistema valida cliente, servicio, fecha y disponibilidad.</w:t>
-      </w:r>
-    </w:p>
-    <w:p>
-      <w:pPr>
-        <w:spacing w:after="60"/>
-        <w:ind w:left="360" w:hanging="360"/>
-      </w:pPr>
-      <w:r>
-        <w:t>4.  El sistema registra el turno y confirma la creación.</w:t>
-      </w:r>
-    </w:p>
-    <w:p>
-      <w:pPr>
-        <w:pStyle w:val="Heading2"/>
-      </w:pPr>
-      <w:r>
-        <w:t>Flujos alternativos</w:t>
-      </w:r>
-    </w:p>
-    <w:p>
-      <w:pPr>
-        <w:pStyle w:val="ListBullet"/>
-        <w:spacing w:after="80"/>
-      </w:pPr>
-      <w:r>
-        <w:rPr>
-          <w:b/>
-        </w:rPr>
-        <w:t xml:space="preserve">Cliente inexistente: </w:t>
-      </w:r>
-      <w:r>
-        <w:t>el sistema rechaza la operación y permite registrarlo por separado.</w:t>
-      </w:r>
-    </w:p>
-    <w:p>
-      <w:pPr>
-        <w:pStyle w:val="ListBullet"/>
-        <w:spacing w:after="80"/>
-      </w:pPr>
-      <w:r>
-        <w:rPr>
-          <w:b/>
-        </w:rPr>
-        <w:t xml:space="preserve">Horario ocupado: </w:t>
-      </w:r>
-      <w:r>
-        <w:t>el sistema informa el conflicto.</w:t>
-      </w:r>
-    </w:p>
-    <w:p>
-      <w:pPr>
-        <w:pStyle w:val="ListBullet"/>
-        <w:spacing w:after="80"/>
-      </w:pPr>
-      <w:r>
-        <w:rPr>
-          <w:b/>
-        </w:rPr>
-        <w:t xml:space="preserve">Servicio inválido: </w:t>
-      </w:r>
-      <w:r>
-        <w:t>el sistema rechaza la operación.</w:t>
-      </w:r>
-    </w:p>
-    <w:p>
-      <w:pPr>
-        <w:pStyle w:val="ListBullet"/>
-        <w:spacing w:after="80"/>
-      </w:pPr>
-      <w:r>
-        <w:rPr>
-          <w:b/>
-        </w:rPr>
-        <w:t xml:space="preserve">Fecha pasada: </w:t>
-      </w:r>
-      <w:r>
-        <w:t>el sistema exige una fecha futura.</w:t>
-      </w:r>
-    </w:p>
-    <w:p>
-      <w:pPr>
-        <w:pStyle w:val="Heading2"/>
-      </w:pPr>
-      <w:r>
-        <w:t>Postcondiciones</w:t>
-      </w:r>
-    </w:p>
-    <w:p>
-      <w:pPr>
-        <w:pStyle w:val="ListBullet"/>
-        <w:spacing w:after="60"/>
-      </w:pPr>
-      <w:r>
-        <w:t>El turno queda confirmado para el cliente seleccionado.</w:t>
-      </w:r>
-    </w:p>
-    <w:p>
-      <w:pPr>
-        <w:pStyle w:val="ListBullet"/>
-        <w:spacing w:after="60"/>
-      </w:pPr>
-      <w:r>
-        <w:t>El horario queda ocupado.</w:t>
-      </w:r>
-    </w:p>
-    <w:p>
-      <w:r>
-        <w:br w:type="page"/>
-      </w:r>
-    </w:p>
-    <w:p>
-      <w:pPr>
-        <w:pStyle w:val="Heading1"/>
-      </w:pPr>
-      <w:r>
-        <w:t>CU-04 Modificar Turno</w:t>
-      </w:r>
-    </w:p>
-    <w:tbl>
-      <w:tblPr>
-        <w:tblStyle w:val="TableGrid"/>
-        <w:tblW w:type="auto" w:w="0"/>
-        <w:jc w:val="center"/>
-        <w:tblLook w:firstColumn="1" w:firstRow="1" w:lastColumn="0" w:lastRow="0" w:noHBand="0" w:noVBand="1" w:val="04A0"/>
-      </w:tblPr>
-      <w:tblGrid>
-        <w:gridCol w:w="5040"/>
-        <w:gridCol w:w="5040"/>
-      </w:tblGrid>
-      <w:tr>
-        <w:trPr>
-          <w:tblHeader w:val="true"/>
-        </w:trPr>
-        <w:tc>
-          <w:tcPr>
-            <w:tcW w:type="dxa" w:w="2376"/>
-            <w:vAlign w:val="center"/>
-            <w:tcMar>
-              <w:top w:w="100" w:type="dxa"/>
-              <w:start w:w="120" w:type="dxa"/>
-              <w:bottom w:w="100" w:type="dxa"/>
-              <w:end w:w="120" w:type="dxa"/>
-            </w:tcMar>
-            <w:shd w:fill="1F4E78"/>
-          </w:tcPr>
-          <w:p>
-            <w:pPr>
-              <w:spacing w:after="40" w:before="40"/>
-            </w:pPr>
-            <w:r>
-              <w:rPr>
-                <w:rFonts w:ascii="Arial" w:hAnsi="Arial"/>
-                <w:b/>
-                <w:color w:val="FFFFFF"/>
-                <w:sz w:val="19"/>
-              </w:rPr>
-              <w:t>Campo</w:t>
+              <w:t>Gestionar Servicios</w:t>
             </w:r>
           </w:p>
         </w:tc>
         <w:tc>
           <w:tcPr>
-            <w:tcW w:type="dxa" w:w="7704"/>
+            <w:tcW w:type="dxa" w:w="4392"/>
             <w:vAlign w:val="center"/>
-            <w:tcMar>
-              <w:top w:w="100" w:type="dxa"/>
-              <w:start w:w="120" w:type="dxa"/>
-              <w:bottom w:w="100" w:type="dxa"/>
-              <w:end w:w="120" w:type="dxa"/>
-            </w:tcMar>
-            <w:shd w:fill="1F4E78"/>
+            <w:shd w:fill="FFFFFF"/>
+            <w:tcBorders>
+              <w:top w:val="single" w:sz="4" w:color="D9D9D9"/>
+              <w:left w:val="single" w:sz="4" w:color="D9D9D9"/>
+              <w:bottom w:val="single" w:sz="4" w:color="D9D9D9"/>
+              <w:right w:val="single" w:sz="4" w:color="D9D9D9"/>
+            </w:tcBorders>
           </w:tcPr>
           <w:p>
             <w:pPr>
-              <w:spacing w:after="40" w:before="40"/>
+              <w:spacing w:before="80" w:after="80"/>
             </w:pPr>
             <w:r>
               <w:rPr>
-                <w:rFonts w:ascii="Arial" w:hAnsi="Arial"/>
-                <w:b/>
-                <w:color w:val="FFFFFF"/>
-                <w:sz w:val="19"/>
-              </w:rPr>
-              <w:t>Definición</w:t>
-            </w:r>
-          </w:p>
-        </w:tc>
-      </w:tr>
-      <w:tr>
-        <w:tc>
-          <w:tcPr>
-            <w:tcW w:type="dxa" w:w="2376"/>
-            <w:vAlign w:val="center"/>
-            <w:tcMar>
-              <w:top w:w="100" w:type="dxa"/>
-              <w:start w:w="120" w:type="dxa"/>
-              <w:bottom w:w="100" w:type="dxa"/>
-              <w:end w:w="120" w:type="dxa"/>
-            </w:tcMar>
-          </w:tcPr>
-          <w:p>
-            <w:pPr>
-              <w:spacing w:after="40" w:before="40"/>
-            </w:pPr>
-            <w:r>
-              <w:rPr>
-                <w:rFonts w:ascii="Arial" w:hAnsi="Arial"/>
-                <w:sz w:val="19"/>
-              </w:rPr>
-              <w:t>Actor principal</w:t>
-            </w:r>
-          </w:p>
-        </w:tc>
-        <w:tc>
-          <w:tcPr>
-            <w:tcW w:type="dxa" w:w="7704"/>
-            <w:vAlign w:val="center"/>
-            <w:tcMar>
-              <w:top w:w="100" w:type="dxa"/>
-              <w:start w:w="120" w:type="dxa"/>
-              <w:bottom w:w="100" w:type="dxa"/>
-              <w:end w:w="120" w:type="dxa"/>
-            </w:tcMar>
-          </w:tcPr>
-          <w:p>
-            <w:pPr>
-              <w:spacing w:after="40" w:before="40"/>
-            </w:pPr>
-            <w:r>
-              <w:rPr>
-                <w:rFonts w:ascii="Arial" w:hAnsi="Arial"/>
-                <w:sz w:val="19"/>
-              </w:rPr>
-              <w:t>Cliente, Empleado o Administrador</w:t>
-            </w:r>
-          </w:p>
-        </w:tc>
-      </w:tr>
-      <w:tr>
-        <w:tc>
-          <w:tcPr>
-            <w:tcW w:type="dxa" w:w="2376"/>
-            <w:vAlign w:val="center"/>
-            <w:tcMar>
-              <w:top w:w="100" w:type="dxa"/>
-              <w:start w:w="120" w:type="dxa"/>
-              <w:bottom w:w="100" w:type="dxa"/>
-              <w:end w:w="120" w:type="dxa"/>
-            </w:tcMar>
-            <w:shd w:fill="EAF2F8"/>
-          </w:tcPr>
-          <w:p>
-            <w:pPr>
-              <w:spacing w:after="40" w:before="40"/>
-            </w:pPr>
-            <w:r>
-              <w:rPr>
-                <w:rFonts w:ascii="Arial" w:hAnsi="Arial"/>
-                <w:sz w:val="19"/>
-              </w:rPr>
-              <w:t>Objetivo</w:t>
-            </w:r>
-          </w:p>
-        </w:tc>
-        <w:tc>
-          <w:tcPr>
-            <w:tcW w:type="dxa" w:w="7704"/>
-            <w:vAlign w:val="center"/>
-            <w:tcMar>
-              <w:top w:w="100" w:type="dxa"/>
-              <w:start w:w="120" w:type="dxa"/>
-              <w:bottom w:w="100" w:type="dxa"/>
-              <w:end w:w="120" w:type="dxa"/>
-            </w:tcMar>
-            <w:shd w:fill="EAF2F8"/>
-          </w:tcPr>
-          <w:p>
-            <w:pPr>
-              <w:spacing w:after="40" w:before="40"/>
-            </w:pPr>
-            <w:r>
-              <w:rPr>
-                <w:rFonts w:ascii="Arial" w:hAnsi="Arial"/>
-                <w:sz w:val="19"/>
-              </w:rPr>
-              <w:t>Cambiar la fecha, hora o servicio de un turno existente.</w:t>
-            </w:r>
-          </w:p>
-        </w:tc>
-      </w:tr>
-      <w:tr>
-        <w:tc>
-          <w:tcPr>
-            <w:tcW w:type="dxa" w:w="2376"/>
-            <w:vAlign w:val="center"/>
-            <w:tcMar>
-              <w:top w:w="100" w:type="dxa"/>
-              <w:start w:w="120" w:type="dxa"/>
-              <w:bottom w:w="100" w:type="dxa"/>
-              <w:end w:w="120" w:type="dxa"/>
-            </w:tcMar>
-          </w:tcPr>
-          <w:p>
-            <w:pPr>
-              <w:spacing w:after="40" w:before="40"/>
-            </w:pPr>
-            <w:r>
-              <w:rPr>
-                <w:rFonts w:ascii="Arial" w:hAnsi="Arial"/>
-                <w:sz w:val="19"/>
-              </w:rPr>
-              <w:t>Precondiciones</w:t>
-            </w:r>
-          </w:p>
-        </w:tc>
-        <w:tc>
-          <w:tcPr>
-            <w:tcW w:type="dxa" w:w="7704"/>
-            <w:vAlign w:val="center"/>
-            <w:tcMar>
-              <w:top w:w="100" w:type="dxa"/>
-              <w:start w:w="120" w:type="dxa"/>
-              <w:bottom w:w="100" w:type="dxa"/>
-              <w:end w:w="120" w:type="dxa"/>
-            </w:tcMar>
-          </w:tcPr>
-          <w:p>
-            <w:pPr>
-              <w:spacing w:after="40" w:before="40"/>
-            </w:pPr>
-            <w:r>
-              <w:rPr>
-                <w:rFonts w:ascii="Arial" w:hAnsi="Arial"/>
-                <w:sz w:val="19"/>
-              </w:rPr>
-              <w:t>Turno activo y futuro; actor autenticado. El cliente solo accede a un turno propio.</w:t>
-            </w:r>
-          </w:p>
-        </w:tc>
-      </w:tr>
-      <w:tr>
-        <w:tc>
-          <w:tcPr>
-            <w:tcW w:type="dxa" w:w="2376"/>
-            <w:vAlign w:val="center"/>
-            <w:tcMar>
-              <w:top w:w="100" w:type="dxa"/>
-              <w:start w:w="120" w:type="dxa"/>
-              <w:bottom w:w="100" w:type="dxa"/>
-              <w:end w:w="120" w:type="dxa"/>
-            </w:tcMar>
-            <w:shd w:fill="EAF2F8"/>
-          </w:tcPr>
-          <w:p>
-            <w:pPr>
-              <w:spacing w:after="40" w:before="40"/>
-            </w:pPr>
-            <w:r>
-              <w:rPr>
-                <w:rFonts w:ascii="Arial" w:hAnsi="Arial"/>
-                <w:sz w:val="19"/>
-              </w:rPr>
-              <w:t>Reglas relacionadas</w:t>
-            </w:r>
-          </w:p>
-        </w:tc>
-        <w:tc>
-          <w:tcPr>
-            <w:tcW w:type="dxa" w:w="7704"/>
-            <w:vAlign w:val="center"/>
-            <w:tcMar>
-              <w:top w:w="100" w:type="dxa"/>
-              <w:start w:w="120" w:type="dxa"/>
-              <w:bottom w:w="100" w:type="dxa"/>
-              <w:end w:w="120" w:type="dxa"/>
-            </w:tcMar>
-            <w:shd w:fill="EAF2F8"/>
-          </w:tcPr>
-          <w:p>
-            <w:pPr>
-              <w:spacing w:after="40" w:before="40"/>
-            </w:pPr>
-            <w:r>
-              <w:rPr>
-                <w:rFonts w:ascii="Arial" w:hAnsi="Arial"/>
-                <w:sz w:val="19"/>
-              </w:rPr>
-              <w:t>RN-01, RN-02, RN-06, RN-10 y RN-11.</w:t>
-            </w:r>
-          </w:p>
-        </w:tc>
-      </w:tr>
-    </w:tbl>
-    <w:p/>
-    <w:p>
-      <w:pPr>
-        <w:pStyle w:val="Heading2"/>
-      </w:pPr>
-      <w:r>
-        <w:t>Flujo principal</w:t>
-      </w:r>
-    </w:p>
-    <w:p>
-      <w:pPr>
-        <w:spacing w:after="60"/>
-        <w:ind w:left="360" w:hanging="360"/>
-      </w:pPr>
-      <w:r>
-        <w:t>1.  El actor selecciona un turno permitido.</w:t>
-      </w:r>
-    </w:p>
-    <w:p>
-      <w:pPr>
-        <w:spacing w:after="60"/>
-        <w:ind w:left="360" w:hanging="360"/>
-      </w:pPr>
-      <w:r>
-        <w:t>2.  Indica la nueva fecha, hora o servicio.</w:t>
-      </w:r>
-    </w:p>
-    <w:p>
-      <w:pPr>
-        <w:spacing w:after="60"/>
-        <w:ind w:left="360" w:hanging="360"/>
-      </w:pPr>
-      <w:r>
-        <w:t>3.  El sistema verifica permisos, estado, servicio y disponibilidad.</w:t>
-      </w:r>
-    </w:p>
-    <w:p>
-      <w:pPr>
-        <w:spacing w:after="60"/>
-        <w:ind w:left="360" w:hanging="360"/>
-      </w:pPr>
-      <w:r>
-        <w:t>4.  El sistema actualiza el turno y confirma el cambio.</w:t>
-      </w:r>
-    </w:p>
-    <w:p>
-      <w:pPr>
-        <w:pStyle w:val="Heading2"/>
-      </w:pPr>
-      <w:r>
-        <w:t>Flujos alternativos</w:t>
-      </w:r>
-    </w:p>
-    <w:p>
-      <w:pPr>
-        <w:pStyle w:val="ListBullet"/>
-        <w:spacing w:after="80"/>
-      </w:pPr>
-      <w:r>
-        <w:rPr>
-          <w:b/>
-        </w:rPr>
-        <w:t xml:space="preserve">Turno ajeno: </w:t>
-      </w:r>
-      <w:r>
-        <w:t>si el actor es cliente, el sistema deniega el acceso.</w:t>
-      </w:r>
-    </w:p>
-    <w:p>
-      <w:pPr>
-        <w:pStyle w:val="ListBullet"/>
-        <w:spacing w:after="80"/>
-      </w:pPr>
-      <w:r>
-        <w:rPr>
-          <w:b/>
-        </w:rPr>
-        <w:t xml:space="preserve">Turno vencido o cancelado: </w:t>
-      </w:r>
-      <w:r>
-        <w:t>el sistema no permite modificarlo.</w:t>
-      </w:r>
-    </w:p>
-    <w:p>
-      <w:pPr>
-        <w:pStyle w:val="ListBullet"/>
-        <w:spacing w:after="80"/>
-      </w:pPr>
-      <w:r>
-        <w:rPr>
-          <w:b/>
-        </w:rPr>
-        <w:t xml:space="preserve">Horario ocupado: </w:t>
-      </w:r>
-      <w:r>
-        <w:t>el turno original se mantiene sin cambios.</w:t>
-      </w:r>
-    </w:p>
-    <w:p>
-      <w:pPr>
-        <w:pStyle w:val="ListBullet"/>
-        <w:spacing w:after="80"/>
-      </w:pPr>
-      <w:r>
-        <w:rPr>
-          <w:b/>
-        </w:rPr>
-        <w:t xml:space="preserve">Operación cancelada: </w:t>
-      </w:r>
-      <w:r>
-        <w:t>el turno original se conserva.</w:t>
-      </w:r>
-    </w:p>
-    <w:p>
-      <w:pPr>
-        <w:pStyle w:val="Heading2"/>
-      </w:pPr>
-      <w:r>
-        <w:t>Postcondiciones</w:t>
-      </w:r>
-    </w:p>
-    <w:p>
-      <w:pPr>
-        <w:pStyle w:val="ListBullet"/>
-        <w:spacing w:after="60"/>
-      </w:pPr>
-      <w:r>
-        <w:t>El turno queda actualizado.</w:t>
-      </w:r>
-    </w:p>
-    <w:p>
-      <w:pPr>
-        <w:pStyle w:val="ListBullet"/>
-        <w:spacing w:after="60"/>
-      </w:pPr>
-      <w:r>
-        <w:t>El horario anterior se libera y el nuevo queda ocupado.</w:t>
-      </w:r>
-    </w:p>
-    <w:p>
-      <w:r>
-        <w:br w:type="page"/>
-      </w:r>
-    </w:p>
-    <w:p>
-      <w:pPr>
-        <w:pStyle w:val="Heading1"/>
-      </w:pPr>
-      <w:r>
-        <w:t>CU-05 Cancelar Turno</w:t>
-      </w:r>
-    </w:p>
-    <w:tbl>
-      <w:tblPr>
-        <w:tblStyle w:val="TableGrid"/>
-        <w:tblW w:type="auto" w:w="0"/>
-        <w:jc w:val="center"/>
-        <w:tblLook w:firstColumn="1" w:firstRow="1" w:lastColumn="0" w:lastRow="0" w:noHBand="0" w:noVBand="1" w:val="04A0"/>
-      </w:tblPr>
-      <w:tblGrid>
-        <w:gridCol w:w="5040"/>
-        <w:gridCol w:w="5040"/>
-      </w:tblGrid>
-      <w:tr>
-        <w:trPr>
-          <w:tblHeader w:val="true"/>
-        </w:trPr>
-        <w:tc>
-          <w:tcPr>
-            <w:tcW w:type="dxa" w:w="2376"/>
-            <w:vAlign w:val="center"/>
-            <w:tcMar>
-              <w:top w:w="100" w:type="dxa"/>
-              <w:start w:w="120" w:type="dxa"/>
-              <w:bottom w:w="100" w:type="dxa"/>
-              <w:end w:w="120" w:type="dxa"/>
-            </w:tcMar>
-            <w:shd w:fill="1F4E78"/>
-          </w:tcPr>
-          <w:p>
-            <w:pPr>
-              <w:spacing w:after="40" w:before="40"/>
-            </w:pPr>
-            <w:r>
-              <w:rPr>
-                <w:rFonts w:ascii="Arial" w:hAnsi="Arial"/>
-                <w:b/>
-                <w:color w:val="FFFFFF"/>
-                <w:sz w:val="19"/>
-              </w:rPr>
-              <w:t>Campo</w:t>
-            </w:r>
-          </w:p>
-        </w:tc>
-        <w:tc>
-          <w:tcPr>
-            <w:tcW w:type="dxa" w:w="7704"/>
-            <w:vAlign w:val="center"/>
-            <w:tcMar>
-              <w:top w:w="100" w:type="dxa"/>
-              <w:start w:w="120" w:type="dxa"/>
-              <w:bottom w:w="100" w:type="dxa"/>
-              <w:end w:w="120" w:type="dxa"/>
-            </w:tcMar>
-            <w:shd w:fill="1F4E78"/>
-          </w:tcPr>
-          <w:p>
-            <w:pPr>
-              <w:spacing w:after="40" w:before="40"/>
-            </w:pPr>
-            <w:r>
-              <w:rPr>
-                <w:rFonts w:ascii="Arial" w:hAnsi="Arial"/>
-                <w:b/>
-                <w:color w:val="FFFFFF"/>
-                <w:sz w:val="19"/>
-              </w:rPr>
-              <w:t>Definición</w:t>
-            </w:r>
-          </w:p>
-        </w:tc>
-      </w:tr>
-      <w:tr>
-        <w:tc>
-          <w:tcPr>
-            <w:tcW w:type="dxa" w:w="2376"/>
-            <w:vAlign w:val="center"/>
-            <w:tcMar>
-              <w:top w:w="100" w:type="dxa"/>
-              <w:start w:w="120" w:type="dxa"/>
-              <w:bottom w:w="100" w:type="dxa"/>
-              <w:end w:w="120" w:type="dxa"/>
-            </w:tcMar>
-          </w:tcPr>
-          <w:p>
-            <w:pPr>
-              <w:spacing w:after="40" w:before="40"/>
-            </w:pPr>
-            <w:r>
-              <w:rPr>
-                <w:rFonts w:ascii="Arial" w:hAnsi="Arial"/>
-                <w:sz w:val="19"/>
-              </w:rPr>
-              <w:t>Actor principal</w:t>
-            </w:r>
-          </w:p>
-        </w:tc>
-        <w:tc>
-          <w:tcPr>
-            <w:tcW w:type="dxa" w:w="7704"/>
-            <w:vAlign w:val="center"/>
-            <w:tcMar>
-              <w:top w:w="100" w:type="dxa"/>
-              <w:start w:w="120" w:type="dxa"/>
-              <w:bottom w:w="100" w:type="dxa"/>
-              <w:end w:w="120" w:type="dxa"/>
-            </w:tcMar>
-          </w:tcPr>
-          <w:p>
-            <w:pPr>
-              <w:spacing w:after="40" w:before="40"/>
-            </w:pPr>
-            <w:r>
-              <w:rPr>
-                <w:rFonts w:ascii="Arial" w:hAnsi="Arial"/>
-                <w:sz w:val="19"/>
-              </w:rPr>
-              <w:t>Cliente, Empleado o Administrador</w:t>
-            </w:r>
-          </w:p>
-        </w:tc>
-      </w:tr>
-      <w:tr>
-        <w:tc>
-          <w:tcPr>
-            <w:tcW w:type="dxa" w:w="2376"/>
-            <w:vAlign w:val="center"/>
-            <w:tcMar>
-              <w:top w:w="100" w:type="dxa"/>
-              <w:start w:w="120" w:type="dxa"/>
-              <w:bottom w:w="100" w:type="dxa"/>
-              <w:end w:w="120" w:type="dxa"/>
-            </w:tcMar>
-            <w:shd w:fill="EAF2F8"/>
-          </w:tcPr>
-          <w:p>
-            <w:pPr>
-              <w:spacing w:after="40" w:before="40"/>
-            </w:pPr>
-            <w:r>
-              <w:rPr>
-                <w:rFonts w:ascii="Arial" w:hAnsi="Arial"/>
-                <w:sz w:val="19"/>
-              </w:rPr>
-              <w:t>Objetivo</w:t>
-            </w:r>
-          </w:p>
-        </w:tc>
-        <w:tc>
-          <w:tcPr>
-            <w:tcW w:type="dxa" w:w="7704"/>
-            <w:vAlign w:val="center"/>
-            <w:tcMar>
-              <w:top w:w="100" w:type="dxa"/>
-              <w:start w:w="120" w:type="dxa"/>
-              <w:bottom w:w="100" w:type="dxa"/>
-              <w:end w:w="120" w:type="dxa"/>
-            </w:tcMar>
-            <w:shd w:fill="EAF2F8"/>
-          </w:tcPr>
-          <w:p>
-            <w:pPr>
-              <w:spacing w:after="40" w:before="40"/>
-            </w:pPr>
-            <w:r>
-              <w:rPr>
-                <w:rFonts w:ascii="Arial" w:hAnsi="Arial"/>
-                <w:sz w:val="19"/>
-              </w:rPr>
-              <w:t>Cancelar un turno y liberar su horario sin borrar su historial.</w:t>
-            </w:r>
-          </w:p>
-        </w:tc>
-      </w:tr>
-      <w:tr>
-        <w:tc>
-          <w:tcPr>
-            <w:tcW w:type="dxa" w:w="2376"/>
-            <w:vAlign w:val="center"/>
-            <w:tcMar>
-              <w:top w:w="100" w:type="dxa"/>
-              <w:start w:w="120" w:type="dxa"/>
-              <w:bottom w:w="100" w:type="dxa"/>
-              <w:end w:w="120" w:type="dxa"/>
-            </w:tcMar>
-          </w:tcPr>
-          <w:p>
-            <w:pPr>
-              <w:spacing w:after="40" w:before="40"/>
-            </w:pPr>
-            <w:r>
-              <w:rPr>
-                <w:rFonts w:ascii="Arial" w:hAnsi="Arial"/>
-                <w:sz w:val="19"/>
-              </w:rPr>
-              <w:t>Precondiciones</w:t>
-            </w:r>
-          </w:p>
-        </w:tc>
-        <w:tc>
-          <w:tcPr>
-            <w:tcW w:type="dxa" w:w="7704"/>
-            <w:vAlign w:val="center"/>
-            <w:tcMar>
-              <w:top w:w="100" w:type="dxa"/>
-              <w:start w:w="120" w:type="dxa"/>
-              <w:bottom w:w="100" w:type="dxa"/>
-              <w:end w:w="120" w:type="dxa"/>
-            </w:tcMar>
-          </w:tcPr>
-          <w:p>
-            <w:pPr>
-              <w:spacing w:after="40" w:before="40"/>
-            </w:pPr>
-            <w:r>
-              <w:rPr>
-                <w:rFonts w:ascii="Arial" w:hAnsi="Arial"/>
-                <w:sz w:val="19"/>
-              </w:rPr>
-              <w:t>Turno activo y futuro; actor autenticado. El cliente solo accede a un turno propio.</w:t>
-            </w:r>
-          </w:p>
-        </w:tc>
-      </w:tr>
-      <w:tr>
-        <w:tc>
-          <w:tcPr>
-            <w:tcW w:type="dxa" w:w="2376"/>
-            <w:vAlign w:val="center"/>
-            <w:tcMar>
-              <w:top w:w="100" w:type="dxa"/>
-              <w:start w:w="120" w:type="dxa"/>
-              <w:bottom w:w="100" w:type="dxa"/>
-              <w:end w:w="120" w:type="dxa"/>
-            </w:tcMar>
-            <w:shd w:fill="EAF2F8"/>
-          </w:tcPr>
-          <w:p>
-            <w:pPr>
-              <w:spacing w:after="40" w:before="40"/>
-            </w:pPr>
-            <w:r>
-              <w:rPr>
-                <w:rFonts w:ascii="Arial" w:hAnsi="Arial"/>
-                <w:sz w:val="19"/>
-              </w:rPr>
-              <w:t>Reglas relacionadas</w:t>
-            </w:r>
-          </w:p>
-        </w:tc>
-        <w:tc>
-          <w:tcPr>
-            <w:tcW w:type="dxa" w:w="7704"/>
-            <w:vAlign w:val="center"/>
-            <w:tcMar>
-              <w:top w:w="100" w:type="dxa"/>
-              <w:start w:w="120" w:type="dxa"/>
-              <w:bottom w:w="100" w:type="dxa"/>
-              <w:end w:w="120" w:type="dxa"/>
-            </w:tcMar>
-            <w:shd w:fill="EAF2F8"/>
-          </w:tcPr>
-          <w:p>
-            <w:pPr>
-              <w:spacing w:after="40" w:before="40"/>
-            </w:pPr>
-            <w:r>
-              <w:rPr>
-                <w:rFonts w:ascii="Arial" w:hAnsi="Arial"/>
-                <w:sz w:val="19"/>
-              </w:rPr>
-              <w:t>RN-06 y RN-10.</w:t>
-            </w:r>
-          </w:p>
-        </w:tc>
-      </w:tr>
-    </w:tbl>
-    <w:p/>
-    <w:p>
-      <w:pPr>
-        <w:pStyle w:val="Heading2"/>
-      </w:pPr>
-      <w:r>
-        <w:t>Flujo principal</w:t>
-      </w:r>
-    </w:p>
-    <w:p>
-      <w:pPr>
-        <w:spacing w:after="60"/>
-        <w:ind w:left="360" w:hanging="360"/>
-      </w:pPr>
-      <w:r>
-        <w:t>1.  El actor selecciona el turno y confirma la cancelación.</w:t>
-      </w:r>
-    </w:p>
-    <w:p>
-      <w:pPr>
-        <w:spacing w:after="60"/>
-        <w:ind w:left="360" w:hanging="360"/>
-      </w:pPr>
-      <w:r>
-        <w:t>2.  El sistema verifica existencia, permisos, estado y fecha.</w:t>
-      </w:r>
-    </w:p>
-    <w:p>
-      <w:pPr>
-        <w:spacing w:after="60"/>
-        <w:ind w:left="360" w:hanging="360"/>
-      </w:pPr>
-      <w:r>
-        <w:t>3.  El sistema cambia el estado a Cancelado.</w:t>
-      </w:r>
-    </w:p>
-    <w:p>
-      <w:pPr>
-        <w:spacing w:after="60"/>
-        <w:ind w:left="360" w:hanging="360"/>
-      </w:pPr>
-      <w:r>
-        <w:t>4.  El sistema confirma la operación y libera el horario.</w:t>
-      </w:r>
-    </w:p>
-    <w:p>
-      <w:pPr>
-        <w:pStyle w:val="Heading2"/>
-      </w:pPr>
-      <w:r>
-        <w:t>Flujos alternativos</w:t>
-      </w:r>
-    </w:p>
-    <w:p>
-      <w:pPr>
-        <w:pStyle w:val="ListBullet"/>
-        <w:spacing w:after="80"/>
-      </w:pPr>
-      <w:r>
-        <w:rPr>
-          <w:b/>
-        </w:rPr>
-        <w:t xml:space="preserve">Turno ajeno: </w:t>
-      </w:r>
-      <w:r>
-        <w:t>si el actor es cliente, el sistema deniega el acceso.</w:t>
-      </w:r>
-    </w:p>
-    <w:p>
-      <w:pPr>
-        <w:pStyle w:val="ListBullet"/>
-        <w:spacing w:after="80"/>
-      </w:pPr>
-      <w:r>
-        <w:rPr>
-          <w:b/>
-        </w:rPr>
-        <w:t xml:space="preserve">Turno vencido o no activo: </w:t>
-      </w:r>
-      <w:r>
-        <w:t>el sistema no permite cancelarlo.</w:t>
-      </w:r>
-    </w:p>
-    <w:p>
-      <w:pPr>
-        <w:pStyle w:val="ListBullet"/>
-        <w:spacing w:after="80"/>
-      </w:pPr>
-      <w:r>
-        <w:rPr>
-          <w:b/>
-        </w:rPr>
-        <w:t xml:space="preserve">Cancelación no confirmada: </w:t>
-      </w:r>
-      <w:r>
-        <w:t>no se realiza ninguna petición ni cambio.</w:t>
-      </w:r>
-    </w:p>
-    <w:p>
-      <w:pPr>
-        <w:pStyle w:val="Heading2"/>
-      </w:pPr>
-      <w:r>
-        <w:t>Postcondiciones</w:t>
-      </w:r>
-    </w:p>
-    <w:p>
-      <w:pPr>
-        <w:pStyle w:val="ListBullet"/>
-        <w:spacing w:after="60"/>
-      </w:pPr>
-      <w:r>
-        <w:t>El turno permanece registrado con estado Cancelado.</w:t>
-      </w:r>
-    </w:p>
-    <w:p>
-      <w:pPr>
-        <w:pStyle w:val="ListBullet"/>
-        <w:spacing w:after="60"/>
-      </w:pPr>
-      <w:r>
-        <w:t>El horario vuelve a estar disponible.</w:t>
-      </w:r>
-    </w:p>
-    <w:p>
-      <w:r>
-        <w:br w:type="page"/>
-      </w:r>
-    </w:p>
-    <w:p>
-      <w:pPr>
-        <w:pStyle w:val="Heading1"/>
-      </w:pPr>
-      <w:r>
-        <w:t>CU-06 Gestionar Servicios</w:t>
-      </w:r>
-    </w:p>
-    <w:tbl>
-      <w:tblPr>
-        <w:tblStyle w:val="TableGrid"/>
-        <w:tblW w:type="auto" w:w="0"/>
-        <w:jc w:val="center"/>
-        <w:tblLook w:firstColumn="1" w:firstRow="1" w:lastColumn="0" w:lastRow="0" w:noHBand="0" w:noVBand="1" w:val="04A0"/>
-      </w:tblPr>
-      <w:tblGrid>
-        <w:gridCol w:w="5040"/>
-        <w:gridCol w:w="5040"/>
-      </w:tblGrid>
-      <w:tr>
-        <w:trPr>
-          <w:tblHeader w:val="true"/>
-        </w:trPr>
-        <w:tc>
-          <w:tcPr>
-            <w:tcW w:type="dxa" w:w="2376"/>
-            <w:vAlign w:val="center"/>
-            <w:tcMar>
-              <w:top w:w="100" w:type="dxa"/>
-              <w:start w:w="120" w:type="dxa"/>
-              <w:bottom w:w="100" w:type="dxa"/>
-              <w:end w:w="120" w:type="dxa"/>
-            </w:tcMar>
-            <w:shd w:fill="1F4E78"/>
-          </w:tcPr>
-          <w:p>
-            <w:pPr>
-              <w:spacing w:after="40" w:before="40"/>
-            </w:pPr>
-            <w:r>
-              <w:rPr>
-                <w:rFonts w:ascii="Arial" w:hAnsi="Arial"/>
-                <w:b/>
-                <w:color w:val="FFFFFF"/>
-                <w:sz w:val="19"/>
-              </w:rPr>
-              <w:t>Campo</w:t>
-            </w:r>
-          </w:p>
-        </w:tc>
-        <w:tc>
-          <w:tcPr>
-            <w:tcW w:type="dxa" w:w="7704"/>
-            <w:vAlign w:val="center"/>
-            <w:tcMar>
-              <w:top w:w="100" w:type="dxa"/>
-              <w:start w:w="120" w:type="dxa"/>
-              <w:bottom w:w="100" w:type="dxa"/>
-              <w:end w:w="120" w:type="dxa"/>
-            </w:tcMar>
-            <w:shd w:fill="1F4E78"/>
-          </w:tcPr>
-          <w:p>
-            <w:pPr>
-              <w:spacing w:after="40" w:before="40"/>
-            </w:pPr>
-            <w:r>
-              <w:rPr>
-                <w:rFonts w:ascii="Arial" w:hAnsi="Arial"/>
-                <w:b/>
-                <w:color w:val="FFFFFF"/>
-                <w:sz w:val="19"/>
-              </w:rPr>
-              <w:t>Definición</w:t>
-            </w:r>
-          </w:p>
-        </w:tc>
-      </w:tr>
-      <w:tr>
-        <w:tc>
-          <w:tcPr>
-            <w:tcW w:type="dxa" w:w="2376"/>
-            <w:vAlign w:val="center"/>
-            <w:tcMar>
-              <w:top w:w="100" w:type="dxa"/>
-              <w:start w:w="120" w:type="dxa"/>
-              <w:bottom w:w="100" w:type="dxa"/>
-              <w:end w:w="120" w:type="dxa"/>
-            </w:tcMar>
-          </w:tcPr>
-          <w:p>
-            <w:pPr>
-              <w:spacing w:after="40" w:before="40"/>
-            </w:pPr>
-            <w:r>
-              <w:rPr>
-                <w:rFonts w:ascii="Arial" w:hAnsi="Arial"/>
-                <w:sz w:val="19"/>
-              </w:rPr>
-              <w:t>Actor principal</w:t>
-            </w:r>
-          </w:p>
-        </w:tc>
-        <w:tc>
-          <w:tcPr>
-            <w:tcW w:type="dxa" w:w="7704"/>
-            <w:vAlign w:val="center"/>
-            <w:tcMar>
-              <w:top w:w="100" w:type="dxa"/>
-              <w:start w:w="120" w:type="dxa"/>
-              <w:bottom w:w="100" w:type="dxa"/>
-              <w:end w:w="120" w:type="dxa"/>
-            </w:tcMar>
-          </w:tcPr>
-          <w:p>
-            <w:pPr>
-              <w:spacing w:after="40" w:before="40"/>
-            </w:pPr>
-            <w:r>
-              <w:rPr>
-                <w:rFonts w:ascii="Arial" w:hAnsi="Arial"/>
-                <w:sz w:val="19"/>
+                <w:b w:val="0"/>
+                <w:sz w:val="20"/>
               </w:rPr>
               <w:t>Administrador</w:t>
             </w:r>
@@ -3440,51 +904,76 @@
       <w:tr>
         <w:tc>
           <w:tcPr>
-            <w:tcW w:type="dxa" w:w="2376"/>
+            <w:tcW w:type="dxa" w:w="936"/>
             <w:vAlign w:val="center"/>
-            <w:tcMar>
-              <w:top w:w="100" w:type="dxa"/>
-              <w:start w:w="120" w:type="dxa"/>
-              <w:bottom w:w="100" w:type="dxa"/>
-              <w:end w:w="120" w:type="dxa"/>
-            </w:tcMar>
-            <w:shd w:fill="EAF2F8"/>
+            <w:shd w:fill="FFFFFF"/>
+            <w:tcBorders>
+              <w:top w:val="single" w:sz="4" w:color="D9D9D9"/>
+              <w:left w:val="single" w:sz="4" w:color="D9D9D9"/>
+              <w:bottom w:val="single" w:sz="4" w:color="D9D9D9"/>
+              <w:right w:val="single" w:sz="4" w:color="D9D9D9"/>
+            </w:tcBorders>
           </w:tcPr>
           <w:p>
             <w:pPr>
-              <w:spacing w:after="40" w:before="40"/>
+              <w:spacing w:before="80" w:after="80"/>
             </w:pPr>
             <w:r>
               <w:rPr>
-                <w:rFonts w:ascii="Arial" w:hAnsi="Arial"/>
-                <w:sz w:val="19"/>
+                <w:b w:val="0"/>
+                <w:sz w:val="20"/>
               </w:rPr>
-              <w:t>Objetivo</w:t>
+              <w:t>CU-07</w:t>
             </w:r>
           </w:p>
         </w:tc>
         <w:tc>
           <w:tcPr>
-            <w:tcW w:type="dxa" w:w="7704"/>
+            <w:tcW w:type="dxa" w:w="4608"/>
             <w:vAlign w:val="center"/>
-            <w:tcMar>
-              <w:top w:w="100" w:type="dxa"/>
-              <w:start w:w="120" w:type="dxa"/>
-              <w:bottom w:w="100" w:type="dxa"/>
-              <w:end w:w="120" w:type="dxa"/>
-            </w:tcMar>
-            <w:shd w:fill="EAF2F8"/>
+            <w:shd w:fill="FFFFFF"/>
+            <w:tcBorders>
+              <w:top w:val="single" w:sz="4" w:color="D9D9D9"/>
+              <w:left w:val="single" w:sz="4" w:color="D9D9D9"/>
+              <w:bottom w:val="single" w:sz="4" w:color="D9D9D9"/>
+              <w:right w:val="single" w:sz="4" w:color="D9D9D9"/>
+            </w:tcBorders>
           </w:tcPr>
           <w:p>
             <w:pPr>
-              <w:spacing w:after="40" w:before="40"/>
+              <w:spacing w:before="80" w:after="80"/>
             </w:pPr>
             <w:r>
               <w:rPr>
-                <w:rFonts w:ascii="Arial" w:hAnsi="Arial"/>
-                <w:sz w:val="19"/>
+                <w:b w:val="0"/>
+                <w:sz w:val="20"/>
               </w:rPr>
-              <w:t>Agregar, modificar o eliminar servicios y establecer sus importes.</w:t>
+              <w:t>Registrar Cliente</w:t>
+            </w:r>
+          </w:p>
+        </w:tc>
+        <w:tc>
+          <w:tcPr>
+            <w:tcW w:type="dxa" w:w="4392"/>
+            <w:vAlign w:val="center"/>
+            <w:shd w:fill="FFFFFF"/>
+            <w:tcBorders>
+              <w:top w:val="single" w:sz="4" w:color="D9D9D9"/>
+              <w:left w:val="single" w:sz="4" w:color="D9D9D9"/>
+              <w:bottom w:val="single" w:sz="4" w:color="D9D9D9"/>
+              <w:right w:val="single" w:sz="4" w:color="D9D9D9"/>
+            </w:tcBorders>
+          </w:tcPr>
+          <w:p>
+            <w:pPr>
+              <w:spacing w:before="80" w:after="80"/>
+            </w:pPr>
+            <w:r>
+              <w:rPr>
+                <w:b w:val="0"/>
+                <w:sz w:val="20"/>
+              </w:rPr>
+              <w:t>Persona que desea registrarse</w:t>
             </w:r>
           </w:p>
         </w:tc>
@@ -3492,49 +981,76 @@
       <w:tr>
         <w:tc>
           <w:tcPr>
-            <w:tcW w:type="dxa" w:w="2376"/>
+            <w:tcW w:type="dxa" w:w="936"/>
             <w:vAlign w:val="center"/>
-            <w:tcMar>
-              <w:top w:w="100" w:type="dxa"/>
-              <w:start w:w="120" w:type="dxa"/>
-              <w:bottom w:w="100" w:type="dxa"/>
-              <w:end w:w="120" w:type="dxa"/>
-            </w:tcMar>
+            <w:shd w:fill="FFFFFF"/>
+            <w:tcBorders>
+              <w:top w:val="single" w:sz="4" w:color="D9D9D9"/>
+              <w:left w:val="single" w:sz="4" w:color="D9D9D9"/>
+              <w:bottom w:val="single" w:sz="4" w:color="D9D9D9"/>
+              <w:right w:val="single" w:sz="4" w:color="D9D9D9"/>
+            </w:tcBorders>
           </w:tcPr>
           <w:p>
             <w:pPr>
-              <w:spacing w:after="40" w:before="40"/>
+              <w:spacing w:before="80" w:after="80"/>
             </w:pPr>
             <w:r>
               <w:rPr>
-                <w:rFonts w:ascii="Arial" w:hAnsi="Arial"/>
-                <w:sz w:val="19"/>
+                <w:b w:val="0"/>
+                <w:sz w:val="20"/>
               </w:rPr>
-              <w:t>Precondiciones</w:t>
+              <w:t>CU-08</w:t>
             </w:r>
           </w:p>
         </w:tc>
         <w:tc>
           <w:tcPr>
-            <w:tcW w:type="dxa" w:w="7704"/>
+            <w:tcW w:type="dxa" w:w="4608"/>
             <w:vAlign w:val="center"/>
-            <w:tcMar>
-              <w:top w:w="100" w:type="dxa"/>
-              <w:start w:w="120" w:type="dxa"/>
-              <w:bottom w:w="100" w:type="dxa"/>
-              <w:end w:w="120" w:type="dxa"/>
-            </w:tcMar>
+            <w:shd w:fill="FFFFFF"/>
+            <w:tcBorders>
+              <w:top w:val="single" w:sz="4" w:color="D9D9D9"/>
+              <w:left w:val="single" w:sz="4" w:color="D9D9D9"/>
+              <w:bottom w:val="single" w:sz="4" w:color="D9D9D9"/>
+              <w:right w:val="single" w:sz="4" w:color="D9D9D9"/>
+            </w:tcBorders>
           </w:tcPr>
           <w:p>
             <w:pPr>
-              <w:spacing w:after="40" w:before="40"/>
+              <w:spacing w:before="80" w:after="80"/>
             </w:pPr>
             <w:r>
               <w:rPr>
-                <w:rFonts w:ascii="Arial" w:hAnsi="Arial"/>
-                <w:sz w:val="19"/>
+                <w:b w:val="0"/>
+                <w:sz w:val="20"/>
               </w:rPr>
-              <w:t>Administrador autenticado con permisos sobre el catálogo.</w:t>
+              <w:t>Iniciar Sesión</w:t>
+            </w:r>
+          </w:p>
+        </w:tc>
+        <w:tc>
+          <w:tcPr>
+            <w:tcW w:type="dxa" w:w="4392"/>
+            <w:vAlign w:val="center"/>
+            <w:shd w:fill="FFFFFF"/>
+            <w:tcBorders>
+              <w:top w:val="single" w:sz="4" w:color="D9D9D9"/>
+              <w:left w:val="single" w:sz="4" w:color="D9D9D9"/>
+              <w:bottom w:val="single" w:sz="4" w:color="D9D9D9"/>
+              <w:right w:val="single" w:sz="4" w:color="D9D9D9"/>
+            </w:tcBorders>
+          </w:tcPr>
+          <w:p>
+            <w:pPr>
+              <w:spacing w:before="80" w:after="80"/>
+            </w:pPr>
+            <w:r>
+              <w:rPr>
+                <w:b w:val="0"/>
+                <w:sz w:val="20"/>
+              </w:rPr>
+              <w:t>Cliente o Personal</w:t>
             </w:r>
           </w:p>
         </w:tc>
@@ -3542,51 +1058,384 @@
       <w:tr>
         <w:tc>
           <w:tcPr>
-            <w:tcW w:type="dxa" w:w="2376"/>
+            <w:tcW w:type="dxa" w:w="936"/>
             <w:vAlign w:val="center"/>
-            <w:tcMar>
-              <w:top w:w="100" w:type="dxa"/>
-              <w:start w:w="120" w:type="dxa"/>
-              <w:bottom w:w="100" w:type="dxa"/>
-              <w:end w:w="120" w:type="dxa"/>
-            </w:tcMar>
-            <w:shd w:fill="EAF2F8"/>
+            <w:shd w:fill="FFFFFF"/>
+            <w:tcBorders>
+              <w:top w:val="single" w:sz="4" w:color="D9D9D9"/>
+              <w:left w:val="single" w:sz="4" w:color="D9D9D9"/>
+              <w:bottom w:val="single" w:sz="4" w:color="D9D9D9"/>
+              <w:right w:val="single" w:sz="4" w:color="D9D9D9"/>
+            </w:tcBorders>
           </w:tcPr>
           <w:p>
             <w:pPr>
-              <w:spacing w:after="40" w:before="40"/>
+              <w:spacing w:before="80" w:after="80"/>
             </w:pPr>
             <w:r>
               <w:rPr>
-                <w:rFonts w:ascii="Arial" w:hAnsi="Arial"/>
-                <w:sz w:val="19"/>
+                <w:b w:val="0"/>
+                <w:sz w:val="20"/>
               </w:rPr>
-              <w:t>Reglas relacionadas</w:t>
+              <w:t>CU-09</w:t>
             </w:r>
           </w:p>
         </w:tc>
         <w:tc>
           <w:tcPr>
-            <w:tcW w:type="dxa" w:w="7704"/>
+            <w:tcW w:type="dxa" w:w="4608"/>
             <w:vAlign w:val="center"/>
-            <w:tcMar>
-              <w:top w:w="100" w:type="dxa"/>
-              <w:start w:w="120" w:type="dxa"/>
-              <w:bottom w:w="100" w:type="dxa"/>
-              <w:end w:w="120" w:type="dxa"/>
-            </w:tcMar>
-            <w:shd w:fill="EAF2F8"/>
+            <w:shd w:fill="FFFFFF"/>
+            <w:tcBorders>
+              <w:top w:val="single" w:sz="4" w:color="D9D9D9"/>
+              <w:left w:val="single" w:sz="4" w:color="D9D9D9"/>
+              <w:bottom w:val="single" w:sz="4" w:color="D9D9D9"/>
+              <w:right w:val="single" w:sz="4" w:color="D9D9D9"/>
+            </w:tcBorders>
           </w:tcPr>
           <w:p>
             <w:pPr>
-              <w:spacing w:after="40" w:before="40"/>
+              <w:spacing w:before="80" w:after="80"/>
             </w:pPr>
             <w:r>
               <w:rPr>
-                <w:rFonts w:ascii="Arial" w:hAnsi="Arial"/>
-                <w:sz w:val="19"/>
+                <w:b w:val="0"/>
+                <w:sz w:val="20"/>
               </w:rPr>
-              <w:t>RN-07, RN-08 y RN-09.</w:t>
+              <w:t>Consultar Disponibilidad</w:t>
+            </w:r>
+          </w:p>
+        </w:tc>
+        <w:tc>
+          <w:tcPr>
+            <w:tcW w:type="dxa" w:w="4392"/>
+            <w:vAlign w:val="center"/>
+            <w:shd w:fill="FFFFFF"/>
+            <w:tcBorders>
+              <w:top w:val="single" w:sz="4" w:color="D9D9D9"/>
+              <w:left w:val="single" w:sz="4" w:color="D9D9D9"/>
+              <w:bottom w:val="single" w:sz="4" w:color="D9D9D9"/>
+              <w:right w:val="single" w:sz="4" w:color="D9D9D9"/>
+            </w:tcBorders>
+          </w:tcPr>
+          <w:p>
+            <w:pPr>
+              <w:spacing w:before="80" w:after="80"/>
+            </w:pPr>
+            <w:r>
+              <w:rPr>
+                <w:b w:val="0"/>
+                <w:sz w:val="20"/>
+              </w:rPr>
+              <w:t>Cliente o Personal</w:t>
+            </w:r>
+          </w:p>
+        </w:tc>
+      </w:tr>
+      <w:tr>
+        <w:tc>
+          <w:tcPr>
+            <w:tcW w:type="dxa" w:w="936"/>
+            <w:vAlign w:val="center"/>
+            <w:shd w:fill="FFFFFF"/>
+            <w:tcBorders>
+              <w:top w:val="single" w:sz="4" w:color="D9D9D9"/>
+              <w:left w:val="single" w:sz="4" w:color="D9D9D9"/>
+              <w:bottom w:val="single" w:sz="4" w:color="D9D9D9"/>
+              <w:right w:val="single" w:sz="4" w:color="D9D9D9"/>
+            </w:tcBorders>
+          </w:tcPr>
+          <w:p>
+            <w:pPr>
+              <w:spacing w:before="80" w:after="80"/>
+            </w:pPr>
+            <w:r>
+              <w:rPr>
+                <w:b w:val="0"/>
+                <w:sz w:val="20"/>
+              </w:rPr>
+              <w:t>CU-10</w:t>
+            </w:r>
+          </w:p>
+        </w:tc>
+        <w:tc>
+          <w:tcPr>
+            <w:tcW w:type="dxa" w:w="4608"/>
+            <w:vAlign w:val="center"/>
+            <w:shd w:fill="FFFFFF"/>
+            <w:tcBorders>
+              <w:top w:val="single" w:sz="4" w:color="D9D9D9"/>
+              <w:left w:val="single" w:sz="4" w:color="D9D9D9"/>
+              <w:bottom w:val="single" w:sz="4" w:color="D9D9D9"/>
+              <w:right w:val="single" w:sz="4" w:color="D9D9D9"/>
+            </w:tcBorders>
+          </w:tcPr>
+          <w:p>
+            <w:pPr>
+              <w:spacing w:before="80" w:after="80"/>
+            </w:pPr>
+            <w:r>
+              <w:rPr>
+                <w:b w:val="0"/>
+                <w:sz w:val="20"/>
+              </w:rPr>
+              <w:t>Consultar Turnos Propios</w:t>
+            </w:r>
+          </w:p>
+        </w:tc>
+        <w:tc>
+          <w:tcPr>
+            <w:tcW w:type="dxa" w:w="4392"/>
+            <w:vAlign w:val="center"/>
+            <w:shd w:fill="FFFFFF"/>
+            <w:tcBorders>
+              <w:top w:val="single" w:sz="4" w:color="D9D9D9"/>
+              <w:left w:val="single" w:sz="4" w:color="D9D9D9"/>
+              <w:bottom w:val="single" w:sz="4" w:color="D9D9D9"/>
+              <w:right w:val="single" w:sz="4" w:color="D9D9D9"/>
+            </w:tcBorders>
+          </w:tcPr>
+          <w:p>
+            <w:pPr>
+              <w:spacing w:before="80" w:after="80"/>
+            </w:pPr>
+            <w:r>
+              <w:rPr>
+                <w:b w:val="0"/>
+                <w:sz w:val="20"/>
+              </w:rPr>
+              <w:t>Cliente</w:t>
+            </w:r>
+          </w:p>
+        </w:tc>
+      </w:tr>
+      <w:tr>
+        <w:tc>
+          <w:tcPr>
+            <w:tcW w:type="dxa" w:w="936"/>
+            <w:vAlign w:val="center"/>
+            <w:shd w:fill="FFFFFF"/>
+            <w:tcBorders>
+              <w:top w:val="single" w:sz="4" w:color="D9D9D9"/>
+              <w:left w:val="single" w:sz="4" w:color="D9D9D9"/>
+              <w:bottom w:val="single" w:sz="4" w:color="D9D9D9"/>
+              <w:right w:val="single" w:sz="4" w:color="D9D9D9"/>
+            </w:tcBorders>
+          </w:tcPr>
+          <w:p>
+            <w:pPr>
+              <w:spacing w:before="80" w:after="80"/>
+            </w:pPr>
+            <w:r>
+              <w:rPr>
+                <w:b w:val="0"/>
+                <w:sz w:val="20"/>
+              </w:rPr>
+              <w:t>CU-11</w:t>
+            </w:r>
+          </w:p>
+        </w:tc>
+        <w:tc>
+          <w:tcPr>
+            <w:tcW w:type="dxa" w:w="4608"/>
+            <w:vAlign w:val="center"/>
+            <w:shd w:fill="FFFFFF"/>
+            <w:tcBorders>
+              <w:top w:val="single" w:sz="4" w:color="D9D9D9"/>
+              <w:left w:val="single" w:sz="4" w:color="D9D9D9"/>
+              <w:bottom w:val="single" w:sz="4" w:color="D9D9D9"/>
+              <w:right w:val="single" w:sz="4" w:color="D9D9D9"/>
+            </w:tcBorders>
+          </w:tcPr>
+          <w:p>
+            <w:pPr>
+              <w:spacing w:before="80" w:after="80"/>
+            </w:pPr>
+            <w:r>
+              <w:rPr>
+                <w:b w:val="0"/>
+                <w:sz w:val="20"/>
+              </w:rPr>
+              <w:t>Consultar Agenda Diaria</w:t>
+            </w:r>
+          </w:p>
+        </w:tc>
+        <w:tc>
+          <w:tcPr>
+            <w:tcW w:type="dxa" w:w="4392"/>
+            <w:vAlign w:val="center"/>
+            <w:shd w:fill="FFFFFF"/>
+            <w:tcBorders>
+              <w:top w:val="single" w:sz="4" w:color="D9D9D9"/>
+              <w:left w:val="single" w:sz="4" w:color="D9D9D9"/>
+              <w:bottom w:val="single" w:sz="4" w:color="D9D9D9"/>
+              <w:right w:val="single" w:sz="4" w:color="D9D9D9"/>
+            </w:tcBorders>
+          </w:tcPr>
+          <w:p>
+            <w:pPr>
+              <w:spacing w:before="80" w:after="80"/>
+            </w:pPr>
+            <w:r>
+              <w:rPr>
+                <w:b w:val="0"/>
+                <w:sz w:val="20"/>
+              </w:rPr>
+              <w:t>Empleado o Administrador</w:t>
+            </w:r>
+          </w:p>
+        </w:tc>
+      </w:tr>
+      <w:tr>
+        <w:tc>
+          <w:tcPr>
+            <w:tcW w:type="dxa" w:w="936"/>
+            <w:vAlign w:val="center"/>
+            <w:shd w:fill="FFFFFF"/>
+            <w:tcBorders>
+              <w:top w:val="single" w:sz="4" w:color="D9D9D9"/>
+              <w:left w:val="single" w:sz="4" w:color="D9D9D9"/>
+              <w:bottom w:val="single" w:sz="4" w:color="D9D9D9"/>
+              <w:right w:val="single" w:sz="4" w:color="D9D9D9"/>
+            </w:tcBorders>
+          </w:tcPr>
+          <w:p>
+            <w:pPr>
+              <w:spacing w:before="80" w:after="80"/>
+            </w:pPr>
+            <w:r>
+              <w:rPr>
+                <w:b w:val="0"/>
+                <w:sz w:val="20"/>
+              </w:rPr>
+              <w:t>CU-12</w:t>
+            </w:r>
+          </w:p>
+        </w:tc>
+        <w:tc>
+          <w:tcPr>
+            <w:tcW w:type="dxa" w:w="4608"/>
+            <w:vAlign w:val="center"/>
+            <w:shd w:fill="FFFFFF"/>
+            <w:tcBorders>
+              <w:top w:val="single" w:sz="4" w:color="D9D9D9"/>
+              <w:left w:val="single" w:sz="4" w:color="D9D9D9"/>
+              <w:bottom w:val="single" w:sz="4" w:color="D9D9D9"/>
+              <w:right w:val="single" w:sz="4" w:color="D9D9D9"/>
+            </w:tcBorders>
+          </w:tcPr>
+          <w:p>
+            <w:pPr>
+              <w:spacing w:before="80" w:after="80"/>
+            </w:pPr>
+            <w:r>
+              <w:rPr>
+                <w:b w:val="0"/>
+                <w:sz w:val="20"/>
+              </w:rPr>
+              <w:t>Gestionar Clientes</w:t>
+            </w:r>
+          </w:p>
+        </w:tc>
+        <w:tc>
+          <w:tcPr>
+            <w:tcW w:type="dxa" w:w="4392"/>
+            <w:vAlign w:val="center"/>
+            <w:shd w:fill="FFFFFF"/>
+            <w:tcBorders>
+              <w:top w:val="single" w:sz="4" w:color="D9D9D9"/>
+              <w:left w:val="single" w:sz="4" w:color="D9D9D9"/>
+              <w:bottom w:val="single" w:sz="4" w:color="D9D9D9"/>
+              <w:right w:val="single" w:sz="4" w:color="D9D9D9"/>
+            </w:tcBorders>
+          </w:tcPr>
+          <w:p>
+            <w:pPr>
+              <w:spacing w:before="80" w:after="80"/>
+            </w:pPr>
+            <w:r>
+              <w:rPr>
+                <w:b w:val="0"/>
+                <w:sz w:val="20"/>
+              </w:rPr>
+              <w:t>Personal y Cliente propietario</w:t>
+            </w:r>
+          </w:p>
+        </w:tc>
+      </w:tr>
+      <w:tr>
+        <w:tc>
+          <w:tcPr>
+            <w:tcW w:type="dxa" w:w="936"/>
+            <w:vAlign w:val="center"/>
+            <w:shd w:fill="FFFFFF"/>
+            <w:tcBorders>
+              <w:top w:val="single" w:sz="4" w:color="D9D9D9"/>
+              <w:left w:val="single" w:sz="4" w:color="D9D9D9"/>
+              <w:bottom w:val="single" w:sz="4" w:color="D9D9D9"/>
+              <w:right w:val="single" w:sz="4" w:color="D9D9D9"/>
+            </w:tcBorders>
+          </w:tcPr>
+          <w:p>
+            <w:pPr>
+              <w:spacing w:before="80" w:after="80"/>
+            </w:pPr>
+            <w:r>
+              <w:rPr>
+                <w:b w:val="0"/>
+                <w:sz w:val="20"/>
+              </w:rPr>
+              <w:t>CU-13</w:t>
+            </w:r>
+          </w:p>
+        </w:tc>
+        <w:tc>
+          <w:tcPr>
+            <w:tcW w:type="dxa" w:w="4608"/>
+            <w:vAlign w:val="center"/>
+            <w:shd w:fill="FFFFFF"/>
+            <w:tcBorders>
+              <w:top w:val="single" w:sz="4" w:color="D9D9D9"/>
+              <w:left w:val="single" w:sz="4" w:color="D9D9D9"/>
+              <w:bottom w:val="single" w:sz="4" w:color="D9D9D9"/>
+              <w:right w:val="single" w:sz="4" w:color="D9D9D9"/>
+            </w:tcBorders>
+          </w:tcPr>
+          <w:p>
+            <w:pPr>
+              <w:spacing w:before="80" w:after="80"/>
+            </w:pPr>
+            <w:r>
+              <w:rPr>
+                <w:b w:val="0"/>
+                <w:sz w:val="20"/>
+              </w:rPr>
+              <w:t>Consultar Servicios</w:t>
+            </w:r>
+          </w:p>
+        </w:tc>
+        <w:tc>
+          <w:tcPr>
+            <w:tcW w:type="dxa" w:w="4392"/>
+            <w:vAlign w:val="center"/>
+            <w:shd w:fill="FFFFFF"/>
+            <w:tcBorders>
+              <w:top w:val="single" w:sz="4" w:color="D9D9D9"/>
+              <w:left w:val="single" w:sz="4" w:color="D9D9D9"/>
+              <w:bottom w:val="single" w:sz="4" w:color="D9D9D9"/>
+              <w:right w:val="single" w:sz="4" w:color="D9D9D9"/>
+            </w:tcBorders>
+          </w:tcPr>
+          <w:p>
+            <w:pPr>
+              <w:spacing w:before="80" w:after="80"/>
+            </w:pPr>
+            <w:r>
+              <w:rPr>
+                <w:b w:val="0"/>
+                <w:sz w:val="20"/>
+              </w:rPr>
+              <w:t>Cliente o Personal</w:t>
             </w:r>
           </w:p>
         </w:tc>
@@ -3595,154 +1444,38 @@
     <w:p/>
     <w:p>
       <w:pPr>
-        <w:pStyle w:val="Heading2"/>
+        <w:pStyle w:val="Heading1"/>
       </w:pPr>
       <w:r>
-        <w:t>Flujo principal</w:t>
+        <w:t>Reglas comunes</w:t>
+      </w:r>
+    </w:p>
+    <w:p>
+      <w:r>
+        <w:t>Los turnos deben ser futuros y no compartir fecha y hora con otro turno confirmado. Cada turno referencia un cliente existente y un servicio activo. Solo se modifican o cancelan turnos confirmados y futuros. Los clientes operan exclusivamente sobre sus propios turnos.</w:t>
+      </w:r>
+    </w:p>
+    <w:p>
+      <w:r>
+        <w:t>El administrador gestiona servicios con nombres únicos e importes positivos. Un servicio relacionado con turnos no se elimina. Los avisos respetan las preferencias de notificación y requieren un correo válido.</w:t>
       </w:r>
     </w:p>
     <w:p>
       <w:pPr>
-        <w:spacing w:after="60"/>
-        <w:ind w:left="360" w:hanging="360"/>
+        <w:pStyle w:val="Heading1"/>
       </w:pPr>
       <w:r>
-        <w:t>1.  El administrador consulta el catálogo.</w:t>
+        <w:t>Documentación de referencia</w:t>
       </w:r>
     </w:p>
     <w:p>
-      <w:pPr>
-        <w:spacing w:after="60"/>
-        <w:ind w:left="360" w:hanging="360"/>
-      </w:pPr>
       <w:r>
-        <w:t>2.  Selecciona alta, modificación o eliminación.</w:t>
-      </w:r>
-    </w:p>
-    <w:p>
-      <w:pPr>
-        <w:spacing w:after="60"/>
-        <w:ind w:left="360" w:hanging="360"/>
-      </w:pPr>
-      <w:r>
-        <w:t>3.  Ingresa o modifica el nombre y el importe.</w:t>
-      </w:r>
-    </w:p>
-    <w:p>
-      <w:pPr>
-        <w:spacing w:after="60"/>
-        <w:ind w:left="360" w:hanging="360"/>
-      </w:pPr>
-      <w:r>
-        <w:t>4.  El sistema valida unicidad, importe y relaciones antes de guardar.</w:t>
-      </w:r>
-    </w:p>
-    <w:p>
-      <w:pPr>
-        <w:spacing w:after="60"/>
-        <w:ind w:left="360" w:hanging="360"/>
-      </w:pPr>
-      <w:r>
-        <w:t>5.  El sistema confirma la operación.</w:t>
-      </w:r>
-    </w:p>
-    <w:p>
-      <w:pPr>
-        <w:pStyle w:val="Heading2"/>
-      </w:pPr>
-      <w:r>
-        <w:t>Flujos alternativos</w:t>
-      </w:r>
-    </w:p>
-    <w:p>
-      <w:pPr>
-        <w:pStyle w:val="ListBullet"/>
-        <w:spacing w:after="80"/>
-      </w:pPr>
-      <w:r>
-        <w:rPr>
-          <w:b/>
-        </w:rPr>
-        <w:t xml:space="preserve">Nombre duplicado: </w:t>
-      </w:r>
-      <w:r>
-        <w:t>el sistema informa el conflicto.</w:t>
-      </w:r>
-    </w:p>
-    <w:p>
-      <w:pPr>
-        <w:pStyle w:val="ListBullet"/>
-        <w:spacing w:after="80"/>
-      </w:pPr>
-      <w:r>
-        <w:rPr>
-          <w:b/>
-        </w:rPr>
-        <w:t xml:space="preserve">Importe inválido: </w:t>
-      </w:r>
-      <w:r>
-        <w:t>el sistema exige un valor mayor que cero.</w:t>
-      </w:r>
-    </w:p>
-    <w:p>
-      <w:pPr>
-        <w:pStyle w:val="ListBullet"/>
-        <w:spacing w:after="80"/>
-      </w:pPr>
-      <w:r>
-        <w:rPr>
-          <w:b/>
-        </w:rPr>
-        <w:t xml:space="preserve">Servicio con turnos: </w:t>
-      </w:r>
-      <w:r>
-        <w:t>el sistema impide su eliminación para conservar la integridad.</w:t>
-      </w:r>
-    </w:p>
-    <w:p>
-      <w:pPr>
-        <w:pStyle w:val="ListBullet"/>
-        <w:spacing w:after="80"/>
-      </w:pPr>
-      <w:r>
-        <w:rPr>
-          <w:b/>
-        </w:rPr>
-        <w:t xml:space="preserve">Operación cancelada: </w:t>
-      </w:r>
-      <w:r>
-        <w:t>el catálogo permanece sin cambios.</w:t>
-      </w:r>
-    </w:p>
-    <w:p>
-      <w:pPr>
-        <w:pStyle w:val="Heading2"/>
-      </w:pPr>
-      <w:r>
-        <w:t>Postcondiciones</w:t>
-      </w:r>
-    </w:p>
-    <w:p>
-      <w:pPr>
-        <w:pStyle w:val="ListBullet"/>
-        <w:spacing w:after="60"/>
-      </w:pPr>
-      <w:r>
-        <w:t>El catálogo queda actualizado.</w:t>
-      </w:r>
-    </w:p>
-    <w:p>
-      <w:pPr>
-        <w:pStyle w:val="ListBullet"/>
-        <w:spacing w:after="60"/>
-      </w:pPr>
-      <w:r>
-        <w:t>Los cambios son visibles al consultar o reservar turnos.</w:t>
+        <w:t>Consultar README.md, Alcance del Sistema.md, Reglas de Negocio.md y TRAZABILIDAD.md en Documentos/Entregas TP. Para ejecutar la API y configurar SMTP, consultar Documentos/GUIA-TECNICA.md y Documentos/RECORDATORIOS.md.</w:t>
       </w:r>
     </w:p>
     <w:sectPr>
       <w:pgSz w:w="12240" w:h="15840"/>
-      <w:pgMar w:top="1008" w:right="1080" w:bottom="1008" w:left="1080" w:header="720" w:footer="720" w:gutter="0"/>
+      <w:pgMar w:top="1080" w:right="1152" w:bottom="1080" w:left="1152" w:header="720" w:footer="720" w:gutter="0"/>
       <w:cols w:space="720"/>
       <w:docGrid w:linePitch="360"/>
     </w:sectPr>
@@ -4117,7 +1850,7 @@
       <w:spacing w:after="120" w:line="259" w:lineRule="auto"/>
     </w:pPr>
     <w:rPr>
-      <w:rFonts w:ascii="Arial" w:hAnsi="Arial"/>
+      <w:rFonts w:ascii="Calibri" w:hAnsi="Calibri"/>
       <w:color w:val="000000"/>
       <w:sz w:val="21"/>
     </w:rPr>
@@ -4181,11 +1914,11 @@
       <w:outlineLvl w:val="0"/>
     </w:pPr>
     <w:rPr>
-      <w:rFonts w:asciiTheme="majorHAnsi" w:eastAsiaTheme="majorEastAsia" w:hAnsiTheme="majorHAnsi" w:cstheme="majorBidi" w:ascii="Arial" w:hAnsi="Arial"/>
+      <w:rFonts w:asciiTheme="majorHAnsi" w:eastAsiaTheme="majorEastAsia" w:hAnsiTheme="majorHAnsi" w:cstheme="majorBidi" w:ascii="Calibri" w:hAnsi="Calibri"/>
       <w:b/>
       <w:bCs/>
       <w:color w:val="000000"/>
-      <w:sz w:val="32"/>
+      <w:sz w:val="30"/>
       <w:szCs w:val="28"/>
     </w:rPr>
   </w:style>
@@ -4205,7 +1938,7 @@
       <w:outlineLvl w:val="1"/>
     </w:pPr>
     <w:rPr>
-      <w:rFonts w:asciiTheme="majorHAnsi" w:eastAsiaTheme="majorEastAsia" w:hAnsiTheme="majorHAnsi" w:cstheme="majorBidi" w:ascii="Arial" w:hAnsi="Arial"/>
+      <w:rFonts w:asciiTheme="majorHAnsi" w:eastAsiaTheme="majorEastAsia" w:hAnsiTheme="majorHAnsi" w:cstheme="majorBidi" w:ascii="Calibri" w:hAnsi="Calibri"/>
       <w:b/>
       <w:bCs/>
       <w:color w:val="000000"/>
@@ -4467,12 +2200,12 @@
       <w:contextualSpacing/>
     </w:pPr>
     <w:rPr>
-      <w:rFonts w:asciiTheme="majorHAnsi" w:eastAsiaTheme="majorEastAsia" w:hAnsiTheme="majorHAnsi" w:cstheme="majorBidi" w:ascii="Arial" w:hAnsi="Arial"/>
+      <w:rFonts w:asciiTheme="majorHAnsi" w:eastAsiaTheme="majorEastAsia" w:hAnsiTheme="majorHAnsi" w:cstheme="majorBidi" w:ascii="Calibri" w:hAnsi="Calibri"/>
       <w:b/>
       <w:color w:val="000000"/>
       <w:spacing w:val="5"/>
       <w:kern w:val="28"/>
-      <w:sz w:val="48"/>
+      <w:sz w:val="44"/>
       <w:szCs w:val="52"/>
     </w:rPr>
   </w:style>
@@ -4505,10 +2238,10 @@
       </w:numPr>
     </w:pPr>
     <w:rPr>
-      <w:rFonts w:asciiTheme="majorHAnsi" w:eastAsiaTheme="majorEastAsia" w:hAnsiTheme="majorHAnsi" w:cstheme="majorBidi"/>
+      <w:rFonts w:asciiTheme="majorHAnsi" w:eastAsiaTheme="majorEastAsia" w:hAnsiTheme="majorHAnsi" w:cstheme="majorBidi" w:ascii="Calibri" w:hAnsi="Calibri"/>
       <w:i/>
       <w:iCs/>
-      <w:color w:val="4F81BD" w:themeColor="accent1"/>
+      <w:color w:val="000000"/>
       <w:spacing w:val="15"/>
       <w:sz w:val="24"/>
       <w:szCs w:val="24"/>

</xml_diff>

<commit_message>
Conservar documentacion original del grupo
</commit_message>
<xml_diff>
--- a/Documentos/Entregas TP/Lista Casos de Usos.docx
+++ b/Documentos/Entregas TP/Lista Casos de Usos.docx
@@ -5,29 +5,32 @@
     <w:p>
       <w:pPr>
         <w:pStyle w:val="Title"/>
+        <w:jc w:val="center"/>
       </w:pPr>
       <w:r>
-        <w:t>Sistema de turnos para lavadero</w:t>
+        <w:t>Sistema de Turnos para Lavadero</w:t>
       </w:r>
     </w:p>
     <w:p>
       <w:pPr>
-        <w:pStyle w:val="Subtitle"/>
+        <w:jc w:val="center"/>
       </w:pPr>
       <w:r>
-        <w:t>Actores alcance y casos de uso</w:t>
+        <w:rPr>
+          <w:rFonts w:ascii="Arial" w:hAnsi="Arial"/>
+          <w:b/>
+          <w:sz w:val="26"/>
+        </w:rPr>
+        <w:t>Actores alcance y Casos de Uso</w:t>
       </w:r>
     </w:p>
+    <w:p/>
     <w:p>
+      <w:pPr>
+        <w:jc w:val="both"/>
+      </w:pPr>
       <w:r>
-        <w:t>Grupo 9 · Tomás Martín Ponce y Juan Jesús Baigorria</w:t>
-        <w:br/>
-        <w:t>Prácticas Profesionalizantes I · TSDS · 2026</w:t>
-      </w:r>
-    </w:p>
-    <w:p>
-      <w:r>
-        <w:t>Este documento resume el alcance y los trece casos de uso del sistema. Las especificaciones detalladas, los contratos HTTP y las pruebas asociadas se encuentran en los archivos Markdown de Documentos/Entregas TP.</w:t>
+        <w:t>Este documento define el límite funcional inicial del sistema. Los actores, permisos, reglas y Casos de Uso aquí resumidos son coherentes con las especificaciones técnicas individuales almacenadas en la carpeta Documentos/Entregas TP.</w:t>
       </w:r>
     </w:p>
     <w:p>
@@ -40,36 +43,41 @@
     </w:p>
     <w:tbl>
       <w:tblPr>
+        <w:tblStyle w:val="TableGrid"/>
         <w:tblW w:type="auto" w:w="0"/>
         <w:jc w:val="center"/>
-        <w:tblLayout w:type="fixed"/>
         <w:tblLook w:firstColumn="1" w:firstRow="1" w:lastColumn="0" w:lastRow="0" w:noHBand="0" w:noVBand="1" w:val="04A0"/>
       </w:tblPr>
       <w:tblGrid>
-        <w:gridCol w:w="1872"/>
-        <w:gridCol w:w="8064"/>
+        <w:gridCol w:w="5040"/>
+        <w:gridCol w:w="5040"/>
       </w:tblGrid>
       <w:tr>
+        <w:trPr>
+          <w:tblHeader w:val="true"/>
+        </w:trPr>
         <w:tc>
           <w:tcPr>
-            <w:tcW w:type="dxa" w:w="1872"/>
+            <w:tcW w:type="dxa" w:w="2232"/>
             <w:vAlign w:val="center"/>
-            <w:shd w:fill="E7EBEF"/>
-            <w:tcBorders>
-              <w:top w:val="single" w:sz="4" w:color="D9D9D9"/>
-              <w:left w:val="single" w:sz="4" w:color="D9D9D9"/>
-              <w:bottom w:val="single" w:sz="4" w:color="D9D9D9"/>
-              <w:right w:val="single" w:sz="4" w:color="D9D9D9"/>
-            </w:tcBorders>
+            <w:tcMar>
+              <w:top w:w="100" w:type="dxa"/>
+              <w:start w:w="120" w:type="dxa"/>
+              <w:bottom w:w="100" w:type="dxa"/>
+              <w:end w:w="120" w:type="dxa"/>
+            </w:tcMar>
+            <w:shd w:fill="1F4E78"/>
           </w:tcPr>
           <w:p>
             <w:pPr>
-              <w:spacing w:before="80" w:after="80"/>
+              <w:spacing w:after="40" w:before="40"/>
             </w:pPr>
             <w:r>
               <w:rPr>
+                <w:rFonts w:ascii="Arial" w:hAnsi="Arial"/>
                 <w:b/>
-                <w:sz w:val="20"/>
+                <w:color w:val="FFFFFF"/>
+                <w:sz w:val="19"/>
               </w:rPr>
               <w:t>Actor</w:t>
             </w:r>
@@ -77,24 +85,26 @@
         </w:tc>
         <w:tc>
           <w:tcPr>
-            <w:tcW w:type="dxa" w:w="8064"/>
+            <w:tcW w:type="dxa" w:w="7848"/>
             <w:vAlign w:val="center"/>
-            <w:shd w:fill="E7EBEF"/>
-            <w:tcBorders>
-              <w:top w:val="single" w:sz="4" w:color="D9D9D9"/>
-              <w:left w:val="single" w:sz="4" w:color="D9D9D9"/>
-              <w:bottom w:val="single" w:sz="4" w:color="D9D9D9"/>
-              <w:right w:val="single" w:sz="4" w:color="D9D9D9"/>
-            </w:tcBorders>
+            <w:tcMar>
+              <w:top w:w="100" w:type="dxa"/>
+              <w:start w:w="120" w:type="dxa"/>
+              <w:bottom w:w="100" w:type="dxa"/>
+              <w:end w:w="120" w:type="dxa"/>
+            </w:tcMar>
+            <w:shd w:fill="1F4E78"/>
           </w:tcPr>
           <w:p>
             <w:pPr>
-              <w:spacing w:before="80" w:after="80"/>
+              <w:spacing w:after="40" w:before="40"/>
             </w:pPr>
             <w:r>
               <w:rPr>
+                <w:rFonts w:ascii="Arial" w:hAnsi="Arial"/>
                 <w:b/>
-                <w:sz w:val="20"/>
+                <w:color w:val="FFFFFF"/>
+                <w:sz w:val="19"/>
               </w:rPr>
               <w:t>Responsabilidades</w:t>
             </w:r>
@@ -104,24 +114,23 @@
       <w:tr>
         <w:tc>
           <w:tcPr>
-            <w:tcW w:type="dxa" w:w="1872"/>
+            <w:tcW w:type="dxa" w:w="2232"/>
             <w:vAlign w:val="center"/>
-            <w:shd w:fill="FFFFFF"/>
-            <w:tcBorders>
-              <w:top w:val="single" w:sz="4" w:color="D9D9D9"/>
-              <w:left w:val="single" w:sz="4" w:color="D9D9D9"/>
-              <w:bottom w:val="single" w:sz="4" w:color="D9D9D9"/>
-              <w:right w:val="single" w:sz="4" w:color="D9D9D9"/>
-            </w:tcBorders>
+            <w:tcMar>
+              <w:top w:w="100" w:type="dxa"/>
+              <w:start w:w="120" w:type="dxa"/>
+              <w:bottom w:w="100" w:type="dxa"/>
+              <w:end w:w="120" w:type="dxa"/>
+            </w:tcMar>
           </w:tcPr>
           <w:p>
             <w:pPr>
-              <w:spacing w:before="80" w:after="80"/>
+              <w:spacing w:after="40" w:before="40"/>
             </w:pPr>
             <w:r>
               <w:rPr>
-                <w:b w:val="0"/>
-                <w:sz w:val="20"/>
+                <w:rFonts w:ascii="Arial" w:hAnsi="Arial"/>
+                <w:sz w:val="19"/>
               </w:rPr>
               <w:t>Cliente</w:t>
             </w:r>
@@ -129,26 +138,25 @@
         </w:tc>
         <w:tc>
           <w:tcPr>
-            <w:tcW w:type="dxa" w:w="8064"/>
+            <w:tcW w:type="dxa" w:w="7848"/>
             <w:vAlign w:val="center"/>
-            <w:shd w:fill="FFFFFF"/>
-            <w:tcBorders>
-              <w:top w:val="single" w:sz="4" w:color="D9D9D9"/>
-              <w:left w:val="single" w:sz="4" w:color="D9D9D9"/>
-              <w:bottom w:val="single" w:sz="4" w:color="D9D9D9"/>
-              <w:right w:val="single" w:sz="4" w:color="D9D9D9"/>
-            </w:tcBorders>
+            <w:tcMar>
+              <w:top w:w="100" w:type="dxa"/>
+              <w:start w:w="120" w:type="dxa"/>
+              <w:bottom w:w="100" w:type="dxa"/>
+              <w:end w:w="120" w:type="dxa"/>
+            </w:tcMar>
           </w:tcPr>
           <w:p>
             <w:pPr>
-              <w:spacing w:before="80" w:after="80"/>
+              <w:spacing w:after="40" w:before="40"/>
             </w:pPr>
             <w:r>
               <w:rPr>
-                <w:b w:val="0"/>
-                <w:sz w:val="20"/>
+                <w:rFonts w:ascii="Arial" w:hAnsi="Arial"/>
+                <w:sz w:val="19"/>
               </w:rPr>
-              <w:t>Registrarse e iniciar sesión. Consultar servicios, disponibilidad y turnos propios. Solicitar, modificar y cancelar sus turnos. Actualizar sus datos y preferencias.</w:t>
+              <w:t>Solicitar, consultar, modificar y cancelar únicamente sus propios turnos; consultar servicios y recibir recordatorios.</w:t>
             </w:r>
           </w:p>
         </w:tc>
@@ -156,24 +164,24 @@
       <w:tr>
         <w:tc>
           <w:tcPr>
-            <w:tcW w:type="dxa" w:w="1872"/>
+            <w:tcW w:type="dxa" w:w="2232"/>
             <w:vAlign w:val="center"/>
-            <w:shd w:fill="FFFFFF"/>
-            <w:tcBorders>
-              <w:top w:val="single" w:sz="4" w:color="D9D9D9"/>
-              <w:left w:val="single" w:sz="4" w:color="D9D9D9"/>
-              <w:bottom w:val="single" w:sz="4" w:color="D9D9D9"/>
-              <w:right w:val="single" w:sz="4" w:color="D9D9D9"/>
-            </w:tcBorders>
+            <w:tcMar>
+              <w:top w:w="100" w:type="dxa"/>
+              <w:start w:w="120" w:type="dxa"/>
+              <w:bottom w:w="100" w:type="dxa"/>
+              <w:end w:w="120" w:type="dxa"/>
+            </w:tcMar>
+            <w:shd w:fill="EAF2F8"/>
           </w:tcPr>
           <w:p>
             <w:pPr>
-              <w:spacing w:before="80" w:after="80"/>
+              <w:spacing w:after="40" w:before="40"/>
             </w:pPr>
             <w:r>
               <w:rPr>
-                <w:b w:val="0"/>
-                <w:sz w:val="20"/>
+                <w:rFonts w:ascii="Arial" w:hAnsi="Arial"/>
+                <w:sz w:val="19"/>
               </w:rPr>
               <w:t>Empleado</w:t>
             </w:r>
@@ -181,26 +189,26 @@
         </w:tc>
         <w:tc>
           <w:tcPr>
-            <w:tcW w:type="dxa" w:w="8064"/>
+            <w:tcW w:type="dxa" w:w="7848"/>
             <w:vAlign w:val="center"/>
-            <w:shd w:fill="FFFFFF"/>
-            <w:tcBorders>
-              <w:top w:val="single" w:sz="4" w:color="D9D9D9"/>
-              <w:left w:val="single" w:sz="4" w:color="D9D9D9"/>
-              <w:bottom w:val="single" w:sz="4" w:color="D9D9D9"/>
-              <w:right w:val="single" w:sz="4" w:color="D9D9D9"/>
-            </w:tcBorders>
+            <w:tcMar>
+              <w:top w:w="100" w:type="dxa"/>
+              <w:start w:w="120" w:type="dxa"/>
+              <w:bottom w:w="100" w:type="dxa"/>
+              <w:end w:w="120" w:type="dxa"/>
+            </w:tcMar>
+            <w:shd w:fill="EAF2F8"/>
           </w:tcPr>
           <w:p>
             <w:pPr>
-              <w:spacing w:before="80" w:after="80"/>
+              <w:spacing w:after="40" w:before="40"/>
             </w:pPr>
             <w:r>
               <w:rPr>
-                <w:b w:val="0"/>
-                <w:sz w:val="20"/>
+                <w:rFonts w:ascii="Arial" w:hAnsi="Arial"/>
+                <w:sz w:val="19"/>
               </w:rPr>
-              <w:t>Gestionar clientes y turnos de cualquier cliente y consultar la agenda diaria.</w:t>
+              <w:t>Crear turnos para clientes, modificar o cancelar cualquier turno, consultar la agenda diaria y gestionar clientes.</w:t>
             </w:r>
           </w:p>
         </w:tc>
@@ -208,24 +216,23 @@
       <w:tr>
         <w:tc>
           <w:tcPr>
-            <w:tcW w:type="dxa" w:w="1872"/>
+            <w:tcW w:type="dxa" w:w="2232"/>
             <w:vAlign w:val="center"/>
-            <w:shd w:fill="FFFFFF"/>
-            <w:tcBorders>
-              <w:top w:val="single" w:sz="4" w:color="D9D9D9"/>
-              <w:left w:val="single" w:sz="4" w:color="D9D9D9"/>
-              <w:bottom w:val="single" w:sz="4" w:color="D9D9D9"/>
-              <w:right w:val="single" w:sz="4" w:color="D9D9D9"/>
-            </w:tcBorders>
+            <w:tcMar>
+              <w:top w:w="100" w:type="dxa"/>
+              <w:start w:w="120" w:type="dxa"/>
+              <w:bottom w:w="100" w:type="dxa"/>
+              <w:end w:w="120" w:type="dxa"/>
+            </w:tcMar>
           </w:tcPr>
           <w:p>
             <w:pPr>
-              <w:spacing w:before="80" w:after="80"/>
+              <w:spacing w:after="40" w:before="40"/>
             </w:pPr>
             <w:r>
               <w:rPr>
-                <w:b w:val="0"/>
-                <w:sz w:val="20"/>
+                <w:rFonts w:ascii="Arial" w:hAnsi="Arial"/>
+                <w:sz w:val="19"/>
               </w:rPr>
               <w:t>Administrador</w:t>
             </w:r>
@@ -233,26 +240,25 @@
         </w:tc>
         <w:tc>
           <w:tcPr>
-            <w:tcW w:type="dxa" w:w="8064"/>
+            <w:tcW w:type="dxa" w:w="7848"/>
             <w:vAlign w:val="center"/>
-            <w:shd w:fill="FFFFFF"/>
-            <w:tcBorders>
-              <w:top w:val="single" w:sz="4" w:color="D9D9D9"/>
-              <w:left w:val="single" w:sz="4" w:color="D9D9D9"/>
-              <w:bottom w:val="single" w:sz="4" w:color="D9D9D9"/>
-              <w:right w:val="single" w:sz="4" w:color="D9D9D9"/>
-            </w:tcBorders>
+            <w:tcMar>
+              <w:top w:w="100" w:type="dxa"/>
+              <w:start w:w="120" w:type="dxa"/>
+              <w:bottom w:w="100" w:type="dxa"/>
+              <w:end w:w="120" w:type="dxa"/>
+            </w:tcMar>
           </w:tcPr>
           <w:p>
             <w:pPr>
-              <w:spacing w:before="80" w:after="80"/>
+              <w:spacing w:after="40" w:before="40"/>
             </w:pPr>
             <w:r>
               <w:rPr>
-                <w:b w:val="0"/>
-                <w:sz w:val="20"/>
+                <w:rFonts w:ascii="Arial" w:hAnsi="Arial"/>
+                <w:sz w:val="19"/>
               </w:rPr>
-              <w:t>Realizar las operaciones del empleado, administrar servicios e importes y ejecutar manualmente el procesamiento de recordatorios.</w:t>
+              <w:t>Realizar las operaciones del empleado y gestionar exclusivamente el catálogo de servicios y sus importes.</w:t>
             </w:r>
           </w:p>
         </w:tc>
@@ -260,24 +266,24 @@
       <w:tr>
         <w:tc>
           <w:tcPr>
-            <w:tcW w:type="dxa" w:w="1872"/>
+            <w:tcW w:type="dxa" w:w="2232"/>
             <w:vAlign w:val="center"/>
-            <w:shd w:fill="FFFFFF"/>
-            <w:tcBorders>
-              <w:top w:val="single" w:sz="4" w:color="D9D9D9"/>
-              <w:left w:val="single" w:sz="4" w:color="D9D9D9"/>
-              <w:bottom w:val="single" w:sz="4" w:color="D9D9D9"/>
-              <w:right w:val="single" w:sz="4" w:color="D9D9D9"/>
-            </w:tcBorders>
+            <w:tcMar>
+              <w:top w:w="100" w:type="dxa"/>
+              <w:start w:w="120" w:type="dxa"/>
+              <w:bottom w:w="100" w:type="dxa"/>
+              <w:end w:w="120" w:type="dxa"/>
+            </w:tcMar>
+            <w:shd w:fill="EAF2F8"/>
           </w:tcPr>
           <w:p>
             <w:pPr>
-              <w:spacing w:before="80" w:after="80"/>
+              <w:spacing w:after="40" w:before="40"/>
             </w:pPr>
             <w:r>
               <w:rPr>
-                <w:b w:val="0"/>
-                <w:sz w:val="20"/>
+                <w:rFonts w:ascii="Arial" w:hAnsi="Arial"/>
+                <w:sz w:val="19"/>
               </w:rPr>
               <w:t>Proceso programado</w:t>
             </w:r>
@@ -285,26 +291,26 @@
         </w:tc>
         <w:tc>
           <w:tcPr>
-            <w:tcW w:type="dxa" w:w="8064"/>
+            <w:tcW w:type="dxa" w:w="7848"/>
             <w:vAlign w:val="center"/>
-            <w:shd w:fill="FFFFFF"/>
-            <w:tcBorders>
-              <w:top w:val="single" w:sz="4" w:color="D9D9D9"/>
-              <w:left w:val="single" w:sz="4" w:color="D9D9D9"/>
-              <w:bottom w:val="single" w:sz="4" w:color="D9D9D9"/>
-              <w:right w:val="single" w:sz="4" w:color="D9D9D9"/>
-            </w:tcBorders>
+            <w:tcMar>
+              <w:top w:w="100" w:type="dxa"/>
+              <w:start w:w="120" w:type="dxa"/>
+              <w:bottom w:w="100" w:type="dxa"/>
+              <w:end w:w="120" w:type="dxa"/>
+            </w:tcMar>
+            <w:shd w:fill="EAF2F8"/>
           </w:tcPr>
           <w:p>
             <w:pPr>
-              <w:spacing w:before="80" w:after="80"/>
+              <w:spacing w:after="40" w:before="40"/>
             </w:pPr>
             <w:r>
               <w:rPr>
-                <w:b w:val="0"/>
-                <w:sz w:val="20"/>
+                <w:rFonts w:ascii="Arial" w:hAnsi="Arial"/>
+                <w:sz w:val="19"/>
               </w:rPr>
-              <w:t>Procesar periódicamente los recordatorios de turnos futuros, sin una acción del cliente.</w:t>
+              <w:t>Detectar turnos próximos y procesar recordatorios. No representa una persona usuaria del sistema.</w:t>
             </w:r>
           </w:p>
         </w:tc>
@@ -316,25 +322,236 @@
         <w:pStyle w:val="Heading1"/>
       </w:pPr>
       <w:r>
-        <w:t>Entidades y alcance</w:t>
+        <w:t>Entidades principales</w:t>
       </w:r>
     </w:p>
+    <w:tbl>
+      <w:tblPr>
+        <w:tblStyle w:val="TableGrid"/>
+        <w:tblW w:type="auto" w:w="0"/>
+        <w:jc w:val="center"/>
+        <w:tblLook w:firstColumn="1" w:firstRow="1" w:lastColumn="0" w:lastRow="0" w:noHBand="0" w:noVBand="1" w:val="04A0"/>
+      </w:tblPr>
+      <w:tblGrid>
+        <w:gridCol w:w="5040"/>
+        <w:gridCol w:w="5040"/>
+      </w:tblGrid>
+      <w:tr>
+        <w:trPr>
+          <w:tblHeader w:val="true"/>
+        </w:trPr>
+        <w:tc>
+          <w:tcPr>
+            <w:tcW w:type="dxa" w:w="2232"/>
+            <w:vAlign w:val="center"/>
+            <w:tcMar>
+              <w:top w:w="100" w:type="dxa"/>
+              <w:start w:w="120" w:type="dxa"/>
+              <w:bottom w:w="100" w:type="dxa"/>
+              <w:end w:w="120" w:type="dxa"/>
+            </w:tcMar>
+            <w:shd w:fill="1F4E78"/>
+          </w:tcPr>
+          <w:p>
+            <w:pPr>
+              <w:spacing w:after="40" w:before="40"/>
+            </w:pPr>
+            <w:r>
+              <w:rPr>
+                <w:rFonts w:ascii="Arial" w:hAnsi="Arial"/>
+                <w:b/>
+                <w:color w:val="FFFFFF"/>
+                <w:sz w:val="19"/>
+              </w:rPr>
+              <w:t>Entidad</w:t>
+            </w:r>
+          </w:p>
+        </w:tc>
+        <w:tc>
+          <w:tcPr>
+            <w:tcW w:type="dxa" w:w="7848"/>
+            <w:vAlign w:val="center"/>
+            <w:tcMar>
+              <w:top w:w="100" w:type="dxa"/>
+              <w:start w:w="120" w:type="dxa"/>
+              <w:bottom w:w="100" w:type="dxa"/>
+              <w:end w:w="120" w:type="dxa"/>
+            </w:tcMar>
+            <w:shd w:fill="1F4E78"/>
+          </w:tcPr>
+          <w:p>
+            <w:pPr>
+              <w:spacing w:after="40" w:before="40"/>
+            </w:pPr>
+            <w:r>
+              <w:rPr>
+                <w:rFonts w:ascii="Arial" w:hAnsi="Arial"/>
+                <w:b/>
+                <w:color w:val="FFFFFF"/>
+                <w:sz w:val="19"/>
+              </w:rPr>
+              <w:t>Finalidad</w:t>
+            </w:r>
+          </w:p>
+        </w:tc>
+      </w:tr>
+      <w:tr>
+        <w:tc>
+          <w:tcPr>
+            <w:tcW w:type="dxa" w:w="2232"/>
+            <w:vAlign w:val="center"/>
+            <w:tcMar>
+              <w:top w:w="100" w:type="dxa"/>
+              <w:start w:w="120" w:type="dxa"/>
+              <w:bottom w:w="100" w:type="dxa"/>
+              <w:end w:w="120" w:type="dxa"/>
+            </w:tcMar>
+          </w:tcPr>
+          <w:p>
+            <w:pPr>
+              <w:spacing w:after="40" w:before="40"/>
+            </w:pPr>
+            <w:r>
+              <w:rPr>
+                <w:rFonts w:ascii="Arial" w:hAnsi="Arial"/>
+                <w:sz w:val="19"/>
+              </w:rPr>
+              <w:t>Cliente</w:t>
+            </w:r>
+          </w:p>
+        </w:tc>
+        <w:tc>
+          <w:tcPr>
+            <w:tcW w:type="dxa" w:w="7848"/>
+            <w:vAlign w:val="center"/>
+            <w:tcMar>
+              <w:top w:w="100" w:type="dxa"/>
+              <w:start w:w="120" w:type="dxa"/>
+              <w:bottom w:w="100" w:type="dxa"/>
+              <w:end w:w="120" w:type="dxa"/>
+            </w:tcMar>
+          </w:tcPr>
+          <w:p>
+            <w:pPr>
+              <w:spacing w:after="40" w:before="40"/>
+            </w:pPr>
+            <w:r>
+              <w:rPr>
+                <w:rFonts w:ascii="Arial" w:hAnsi="Arial"/>
+                <w:sz w:val="19"/>
+              </w:rPr>
+              <w:t>Persona que reserva servicios y posee datos de contacto.</w:t>
+            </w:r>
+          </w:p>
+        </w:tc>
+      </w:tr>
+      <w:tr>
+        <w:tc>
+          <w:tcPr>
+            <w:tcW w:type="dxa" w:w="2232"/>
+            <w:vAlign w:val="center"/>
+            <w:tcMar>
+              <w:top w:w="100" w:type="dxa"/>
+              <w:start w:w="120" w:type="dxa"/>
+              <w:bottom w:w="100" w:type="dxa"/>
+              <w:end w:w="120" w:type="dxa"/>
+            </w:tcMar>
+            <w:shd w:fill="EAF2F8"/>
+          </w:tcPr>
+          <w:p>
+            <w:pPr>
+              <w:spacing w:after="40" w:before="40"/>
+            </w:pPr>
+            <w:r>
+              <w:rPr>
+                <w:rFonts w:ascii="Arial" w:hAnsi="Arial"/>
+                <w:sz w:val="19"/>
+              </w:rPr>
+              <w:t>Servicio</w:t>
+            </w:r>
+          </w:p>
+        </w:tc>
+        <w:tc>
+          <w:tcPr>
+            <w:tcW w:type="dxa" w:w="7848"/>
+            <w:vAlign w:val="center"/>
+            <w:tcMar>
+              <w:top w:w="100" w:type="dxa"/>
+              <w:start w:w="120" w:type="dxa"/>
+              <w:bottom w:w="100" w:type="dxa"/>
+              <w:end w:w="120" w:type="dxa"/>
+            </w:tcMar>
+            <w:shd w:fill="EAF2F8"/>
+          </w:tcPr>
+          <w:p>
+            <w:pPr>
+              <w:spacing w:after="40" w:before="40"/>
+            </w:pPr>
+            <w:r>
+              <w:rPr>
+                <w:rFonts w:ascii="Arial" w:hAnsi="Arial"/>
+                <w:sz w:val="19"/>
+              </w:rPr>
+              <w:t>Tipo de lavado ofrecido, con nombre, importe y estado.</w:t>
+            </w:r>
+          </w:p>
+        </w:tc>
+      </w:tr>
+      <w:tr>
+        <w:tc>
+          <w:tcPr>
+            <w:tcW w:type="dxa" w:w="2232"/>
+            <w:vAlign w:val="center"/>
+            <w:tcMar>
+              <w:top w:w="100" w:type="dxa"/>
+              <w:start w:w="120" w:type="dxa"/>
+              <w:bottom w:w="100" w:type="dxa"/>
+              <w:end w:w="120" w:type="dxa"/>
+            </w:tcMar>
+          </w:tcPr>
+          <w:p>
+            <w:pPr>
+              <w:spacing w:after="40" w:before="40"/>
+            </w:pPr>
+            <w:r>
+              <w:rPr>
+                <w:rFonts w:ascii="Arial" w:hAnsi="Arial"/>
+                <w:sz w:val="19"/>
+              </w:rPr>
+              <w:t>Turno</w:t>
+            </w:r>
+          </w:p>
+        </w:tc>
+        <w:tc>
+          <w:tcPr>
+            <w:tcW w:type="dxa" w:w="7848"/>
+            <w:vAlign w:val="center"/>
+            <w:tcMar>
+              <w:top w:w="100" w:type="dxa"/>
+              <w:start w:w="120" w:type="dxa"/>
+              <w:bottom w:w="100" w:type="dxa"/>
+              <w:end w:w="120" w:type="dxa"/>
+            </w:tcMar>
+          </w:tcPr>
+          <w:p>
+            <w:pPr>
+              <w:spacing w:after="40" w:before="40"/>
+            </w:pPr>
+            <w:r>
+              <w:rPr>
+                <w:rFonts w:ascii="Arial" w:hAnsi="Arial"/>
+                <w:sz w:val="19"/>
+              </w:rPr>
+              <w:t>Reserva de un cliente para un servicio en una fecha y hora.</w:t>
+            </w:r>
+          </w:p>
+        </w:tc>
+      </w:tr>
+    </w:tbl>
+    <w:p/>
     <w:p>
       <w:r>
-        <w:t>Cliente, Servicio y Turno son las entidades principales. Usuario permite autenticar y asignar roles; Recordatorio registra el resultado de cada intento. Los vehículos no se administran como entidad independiente en esta versión.</w:t>
-      </w:r>
-    </w:p>
-    <w:p>
-      <w:pPr>
-        <w:pStyle w:val="Heading1"/>
-      </w:pPr>
-      <w:r>
-        <w:t>Recordatorios</w:t>
-      </w:r>
-    </w:p>
-    <w:p>
-      <w:r>
-        <w:t>El envío se realiza por correo electrónico mediante SMTP. La ejecución automática requiere configurar el proveedor y habilitar Recordatorios:Habilitados. La ventana predeterminada es de 24 horas y se revisa cada 5 minutos. Se registran envíos, fallos y omisiones; un intento procesado no se repite. SMS queda fuera de esta versión.</w:t>
+        <w:t>Los vehículos no se administran como entidad independiente en esta primera versión, porque los requisitos actuales no solicitan almacenar sus datos.</w:t>
       </w:r>
     </w:p>
     <w:p>
@@ -347,42 +564,46 @@
         <w:pStyle w:val="Heading1"/>
       </w:pPr>
       <w:r>
-        <w:t>Índice de casos de uso</w:t>
+        <w:t>Reglas de negocio globales</w:t>
       </w:r>
     </w:p>
     <w:tbl>
       <w:tblPr>
+        <w:tblStyle w:val="TableGrid"/>
         <w:tblW w:type="auto" w:w="0"/>
         <w:jc w:val="center"/>
-        <w:tblLayout w:type="fixed"/>
         <w:tblLook w:firstColumn="1" w:firstRow="1" w:lastColumn="0" w:lastRow="0" w:noHBand="0" w:noVBand="1" w:val="04A0"/>
       </w:tblPr>
       <w:tblGrid>
-        <w:gridCol w:w="936"/>
-        <w:gridCol w:w="4608"/>
-        <w:gridCol w:w="4392"/>
+        <w:gridCol w:w="5040"/>
+        <w:gridCol w:w="5040"/>
       </w:tblGrid>
       <w:tr>
+        <w:trPr>
+          <w:tblHeader w:val="true"/>
+        </w:trPr>
         <w:tc>
           <w:tcPr>
-            <w:tcW w:type="dxa" w:w="936"/>
+            <w:tcW w:type="dxa" w:w="1152"/>
             <w:vAlign w:val="center"/>
-            <w:shd w:fill="E7EBEF"/>
-            <w:tcBorders>
-              <w:top w:val="single" w:sz="4" w:color="D9D9D9"/>
-              <w:left w:val="single" w:sz="4" w:color="D9D9D9"/>
-              <w:bottom w:val="single" w:sz="4" w:color="D9D9D9"/>
-              <w:right w:val="single" w:sz="4" w:color="D9D9D9"/>
-            </w:tcBorders>
+            <w:tcMar>
+              <w:top w:w="100" w:type="dxa"/>
+              <w:start w:w="120" w:type="dxa"/>
+              <w:bottom w:w="100" w:type="dxa"/>
+              <w:end w:w="120" w:type="dxa"/>
+            </w:tcMar>
+            <w:shd w:fill="1F4E78"/>
           </w:tcPr>
           <w:p>
             <w:pPr>
-              <w:spacing w:before="80" w:after="80"/>
+              <w:spacing w:after="40" w:before="40"/>
             </w:pPr>
             <w:r>
               <w:rPr>
+                <w:rFonts w:ascii="Arial" w:hAnsi="Arial"/>
                 <w:b/>
-                <w:sz w:val="20"/>
+                <w:color w:val="FFFFFF"/>
+                <w:sz w:val="19"/>
               </w:rPr>
               <w:t>ID</w:t>
             </w:r>
@@ -390,51 +611,28 @@
         </w:tc>
         <w:tc>
           <w:tcPr>
-            <w:tcW w:type="dxa" w:w="4608"/>
+            <w:tcW w:type="dxa" w:w="8928"/>
             <w:vAlign w:val="center"/>
-            <w:shd w:fill="E7EBEF"/>
-            <w:tcBorders>
-              <w:top w:val="single" w:sz="4" w:color="D9D9D9"/>
-              <w:left w:val="single" w:sz="4" w:color="D9D9D9"/>
-              <w:bottom w:val="single" w:sz="4" w:color="D9D9D9"/>
-              <w:right w:val="single" w:sz="4" w:color="D9D9D9"/>
-            </w:tcBorders>
+            <w:tcMar>
+              <w:top w:w="100" w:type="dxa"/>
+              <w:start w:w="120" w:type="dxa"/>
+              <w:bottom w:w="100" w:type="dxa"/>
+              <w:end w:w="120" w:type="dxa"/>
+            </w:tcMar>
+            <w:shd w:fill="1F4E78"/>
           </w:tcPr>
           <w:p>
             <w:pPr>
-              <w:spacing w:before="80" w:after="80"/>
+              <w:spacing w:after="40" w:before="40"/>
             </w:pPr>
             <w:r>
               <w:rPr>
+                <w:rFonts w:ascii="Arial" w:hAnsi="Arial"/>
                 <w:b/>
-                <w:sz w:val="20"/>
+                <w:color w:val="FFFFFF"/>
+                <w:sz w:val="19"/>
               </w:rPr>
-              <w:t>Caso de uso</w:t>
-            </w:r>
-          </w:p>
-        </w:tc>
-        <w:tc>
-          <w:tcPr>
-            <w:tcW w:type="dxa" w:w="4392"/>
-            <w:vAlign w:val="center"/>
-            <w:shd w:fill="E7EBEF"/>
-            <w:tcBorders>
-              <w:top w:val="single" w:sz="4" w:color="D9D9D9"/>
-              <w:left w:val="single" w:sz="4" w:color="D9D9D9"/>
-              <w:bottom w:val="single" w:sz="4" w:color="D9D9D9"/>
-              <w:right w:val="single" w:sz="4" w:color="D9D9D9"/>
-            </w:tcBorders>
-          </w:tcPr>
-          <w:p>
-            <w:pPr>
-              <w:spacing w:before="80" w:after="80"/>
-            </w:pPr>
-            <w:r>
-              <w:rPr>
-                <w:b/>
-                <w:sz w:val="20"/>
-              </w:rPr>
-              <w:t>Actor</w:t>
+              <w:t>Regla</w:t>
             </w:r>
           </w:p>
         </w:tc>
@@ -442,74 +640,692 @@
       <w:tr>
         <w:tc>
           <w:tcPr>
-            <w:tcW w:type="dxa" w:w="936"/>
+            <w:tcW w:type="dxa" w:w="1152"/>
             <w:vAlign w:val="center"/>
-            <w:shd w:fill="FFFFFF"/>
-            <w:tcBorders>
-              <w:top w:val="single" w:sz="4" w:color="D9D9D9"/>
-              <w:left w:val="single" w:sz="4" w:color="D9D9D9"/>
-              <w:bottom w:val="single" w:sz="4" w:color="D9D9D9"/>
-              <w:right w:val="single" w:sz="4" w:color="D9D9D9"/>
-            </w:tcBorders>
+            <w:tcMar>
+              <w:top w:w="100" w:type="dxa"/>
+              <w:start w:w="120" w:type="dxa"/>
+              <w:bottom w:w="100" w:type="dxa"/>
+              <w:end w:w="120" w:type="dxa"/>
+            </w:tcMar>
           </w:tcPr>
           <w:p>
             <w:pPr>
-              <w:spacing w:before="80" w:after="80"/>
+              <w:spacing w:after="40" w:before="40"/>
             </w:pPr>
             <w:r>
               <w:rPr>
-                <w:b w:val="0"/>
-                <w:sz w:val="20"/>
+                <w:rFonts w:ascii="Arial" w:hAnsi="Arial"/>
+                <w:sz w:val="19"/>
               </w:rPr>
-              <w:t>CU-01</w:t>
+              <w:t>RN-01</w:t>
             </w:r>
           </w:p>
         </w:tc>
         <w:tc>
           <w:tcPr>
-            <w:tcW w:type="dxa" w:w="4608"/>
+            <w:tcW w:type="dxa" w:w="8928"/>
             <w:vAlign w:val="center"/>
-            <w:shd w:fill="FFFFFF"/>
-            <w:tcBorders>
-              <w:top w:val="single" w:sz="4" w:color="D9D9D9"/>
-              <w:left w:val="single" w:sz="4" w:color="D9D9D9"/>
-              <w:bottom w:val="single" w:sz="4" w:color="D9D9D9"/>
-              <w:right w:val="single" w:sz="4" w:color="D9D9D9"/>
-            </w:tcBorders>
+            <w:tcMar>
+              <w:top w:w="100" w:type="dxa"/>
+              <w:start w:w="120" w:type="dxa"/>
+              <w:bottom w:w="100" w:type="dxa"/>
+              <w:end w:w="120" w:type="dxa"/>
+            </w:tcMar>
           </w:tcPr>
           <w:p>
             <w:pPr>
-              <w:spacing w:before="80" w:after="80"/>
+              <w:spacing w:after="40" w:before="40"/>
             </w:pPr>
             <w:r>
               <w:rPr>
-                <w:b w:val="0"/>
-                <w:sz w:val="20"/>
+                <w:rFonts w:ascii="Arial" w:hAnsi="Arial"/>
+                <w:sz w:val="19"/>
               </w:rPr>
-              <w:t>Solicitar Turno</w:t>
+              <w:t>No puede existir más de un turno activo para la misma fecha y hora.</w:t>
+            </w:r>
+          </w:p>
+        </w:tc>
+      </w:tr>
+      <w:tr>
+        <w:tc>
+          <w:tcPr>
+            <w:tcW w:type="dxa" w:w="1152"/>
+            <w:vAlign w:val="center"/>
+            <w:tcMar>
+              <w:top w:w="100" w:type="dxa"/>
+              <w:start w:w="120" w:type="dxa"/>
+              <w:bottom w:w="100" w:type="dxa"/>
+              <w:end w:w="120" w:type="dxa"/>
+            </w:tcMar>
+            <w:shd w:fill="EAF2F8"/>
+          </w:tcPr>
+          <w:p>
+            <w:pPr>
+              <w:spacing w:after="40" w:before="40"/>
+            </w:pPr>
+            <w:r>
+              <w:rPr>
+                <w:rFonts w:ascii="Arial" w:hAnsi="Arial"/>
+                <w:sz w:val="19"/>
+              </w:rPr>
+              <w:t>RN-02</w:t>
             </w:r>
           </w:p>
         </w:tc>
         <w:tc>
           <w:tcPr>
-            <w:tcW w:type="dxa" w:w="4392"/>
+            <w:tcW w:type="dxa" w:w="8928"/>
             <w:vAlign w:val="center"/>
-            <w:shd w:fill="FFFFFF"/>
-            <w:tcBorders>
-              <w:top w:val="single" w:sz="4" w:color="D9D9D9"/>
-              <w:left w:val="single" w:sz="4" w:color="D9D9D9"/>
-              <w:bottom w:val="single" w:sz="4" w:color="D9D9D9"/>
-              <w:right w:val="single" w:sz="4" w:color="D9D9D9"/>
-            </w:tcBorders>
+            <w:tcMar>
+              <w:top w:w="100" w:type="dxa"/>
+              <w:start w:w="120" w:type="dxa"/>
+              <w:bottom w:w="100" w:type="dxa"/>
+              <w:end w:w="120" w:type="dxa"/>
+            </w:tcMar>
+            <w:shd w:fill="EAF2F8"/>
           </w:tcPr>
           <w:p>
             <w:pPr>
-              <w:spacing w:before="80" w:after="80"/>
+              <w:spacing w:after="40" w:before="40"/>
             </w:pPr>
             <w:r>
               <w:rPr>
-                <w:b w:val="0"/>
-                <w:sz w:val="20"/>
+                <w:rFonts w:ascii="Arial" w:hAnsi="Arial"/>
+                <w:sz w:val="19"/>
+              </w:rPr>
+              <w:t>Todo turno referencia un servicio existente y activo.</w:t>
+            </w:r>
+          </w:p>
+        </w:tc>
+      </w:tr>
+      <w:tr>
+        <w:tc>
+          <w:tcPr>
+            <w:tcW w:type="dxa" w:w="1152"/>
+            <w:vAlign w:val="center"/>
+            <w:tcMar>
+              <w:top w:w="100" w:type="dxa"/>
+              <w:start w:w="120" w:type="dxa"/>
+              <w:bottom w:w="100" w:type="dxa"/>
+              <w:end w:w="120" w:type="dxa"/>
+            </w:tcMar>
+          </w:tcPr>
+          <w:p>
+            <w:pPr>
+              <w:spacing w:after="40" w:before="40"/>
+            </w:pPr>
+            <w:r>
+              <w:rPr>
+                <w:rFonts w:ascii="Arial" w:hAnsi="Arial"/>
+                <w:sz w:val="19"/>
+              </w:rPr>
+              <w:t>RN-03</w:t>
+            </w:r>
+          </w:p>
+        </w:tc>
+        <w:tc>
+          <w:tcPr>
+            <w:tcW w:type="dxa" w:w="8928"/>
+            <w:vAlign w:val="center"/>
+            <w:tcMar>
+              <w:top w:w="100" w:type="dxa"/>
+              <w:start w:w="120" w:type="dxa"/>
+              <w:bottom w:w="100" w:type="dxa"/>
+              <w:end w:w="120" w:type="dxa"/>
+            </w:tcMar>
+          </w:tcPr>
+          <w:p>
+            <w:pPr>
+              <w:spacing w:after="40" w:before="40"/>
+            </w:pPr>
+            <w:r>
+              <w:rPr>
+                <w:rFonts w:ascii="Arial" w:hAnsi="Arial"/>
+                <w:sz w:val="19"/>
+              </w:rPr>
+              <w:t>Todo turno referencia un cliente existente.</w:t>
+            </w:r>
+          </w:p>
+        </w:tc>
+      </w:tr>
+      <w:tr>
+        <w:tc>
+          <w:tcPr>
+            <w:tcW w:type="dxa" w:w="1152"/>
+            <w:vAlign w:val="center"/>
+            <w:tcMar>
+              <w:top w:w="100" w:type="dxa"/>
+              <w:start w:w="120" w:type="dxa"/>
+              <w:bottom w:w="100" w:type="dxa"/>
+              <w:end w:w="120" w:type="dxa"/>
+            </w:tcMar>
+            <w:shd w:fill="EAF2F8"/>
+          </w:tcPr>
+          <w:p>
+            <w:pPr>
+              <w:spacing w:after="40" w:before="40"/>
+            </w:pPr>
+            <w:r>
+              <w:rPr>
+                <w:rFonts w:ascii="Arial" w:hAnsi="Arial"/>
+                <w:sz w:val="19"/>
+              </w:rPr>
+              <w:t>RN-04</w:t>
+            </w:r>
+          </w:p>
+        </w:tc>
+        <w:tc>
+          <w:tcPr>
+            <w:tcW w:type="dxa" w:w="8928"/>
+            <w:vAlign w:val="center"/>
+            <w:tcMar>
+              <w:top w:w="100" w:type="dxa"/>
+              <w:start w:w="120" w:type="dxa"/>
+              <w:bottom w:w="100" w:type="dxa"/>
+              <w:end w:w="120" w:type="dxa"/>
+            </w:tcMar>
+            <w:shd w:fill="EAF2F8"/>
+          </w:tcPr>
+          <w:p>
+            <w:pPr>
+              <w:spacing w:after="40" w:before="40"/>
+            </w:pPr>
+            <w:r>
+              <w:rPr>
+                <w:rFonts w:ascii="Arial" w:hAnsi="Arial"/>
+                <w:sz w:val="19"/>
+              </w:rPr>
+              <w:t>El cliente necesita un medio de contacto válido para recibir un recordatorio.</w:t>
+            </w:r>
+          </w:p>
+        </w:tc>
+      </w:tr>
+      <w:tr>
+        <w:tc>
+          <w:tcPr>
+            <w:tcW w:type="dxa" w:w="1152"/>
+            <w:vAlign w:val="center"/>
+            <w:tcMar>
+              <w:top w:w="100" w:type="dxa"/>
+              <w:start w:w="120" w:type="dxa"/>
+              <w:bottom w:w="100" w:type="dxa"/>
+              <w:end w:w="120" w:type="dxa"/>
+            </w:tcMar>
+          </w:tcPr>
+          <w:p>
+            <w:pPr>
+              <w:spacing w:after="40" w:before="40"/>
+            </w:pPr>
+            <w:r>
+              <w:rPr>
+                <w:rFonts w:ascii="Arial" w:hAnsi="Arial"/>
+                <w:sz w:val="19"/>
+              </w:rPr>
+              <w:t>RN-05</w:t>
+            </w:r>
+          </w:p>
+        </w:tc>
+        <w:tc>
+          <w:tcPr>
+            <w:tcW w:type="dxa" w:w="8928"/>
+            <w:vAlign w:val="center"/>
+            <w:tcMar>
+              <w:top w:w="100" w:type="dxa"/>
+              <w:start w:w="120" w:type="dxa"/>
+              <w:bottom w:w="100" w:type="dxa"/>
+              <w:end w:w="120" w:type="dxa"/>
+            </w:tcMar>
+          </w:tcPr>
+          <w:p>
+            <w:pPr>
+              <w:spacing w:after="40" w:before="40"/>
+            </w:pPr>
+            <w:r>
+              <w:rPr>
+                <w:rFonts w:ascii="Arial" w:hAnsi="Arial"/>
+                <w:sz w:val="19"/>
+              </w:rPr>
+              <w:t>No se envían recordatorios si las notificaciones están desactivadas o el turno no está activo.</w:t>
+            </w:r>
+          </w:p>
+        </w:tc>
+      </w:tr>
+      <w:tr>
+        <w:tc>
+          <w:tcPr>
+            <w:tcW w:type="dxa" w:w="1152"/>
+            <w:vAlign w:val="center"/>
+            <w:tcMar>
+              <w:top w:w="100" w:type="dxa"/>
+              <w:start w:w="120" w:type="dxa"/>
+              <w:bottom w:w="100" w:type="dxa"/>
+              <w:end w:w="120" w:type="dxa"/>
+            </w:tcMar>
+            <w:shd w:fill="EAF2F8"/>
+          </w:tcPr>
+          <w:p>
+            <w:pPr>
+              <w:spacing w:after="40" w:before="40"/>
+            </w:pPr>
+            <w:r>
+              <w:rPr>
+                <w:rFonts w:ascii="Arial" w:hAnsi="Arial"/>
+                <w:sz w:val="19"/>
+              </w:rPr>
+              <w:t>RN-06</w:t>
+            </w:r>
+          </w:p>
+        </w:tc>
+        <w:tc>
+          <w:tcPr>
+            <w:tcW w:type="dxa" w:w="8928"/>
+            <w:vAlign w:val="center"/>
+            <w:tcMar>
+              <w:top w:w="100" w:type="dxa"/>
+              <w:start w:w="120" w:type="dxa"/>
+              <w:bottom w:w="100" w:type="dxa"/>
+              <w:end w:w="120" w:type="dxa"/>
+            </w:tcMar>
+            <w:shd w:fill="EAF2F8"/>
+          </w:tcPr>
+          <w:p>
+            <w:pPr>
+              <w:spacing w:after="40" w:before="40"/>
+            </w:pPr>
+            <w:r>
+              <w:rPr>
+                <w:rFonts w:ascii="Arial" w:hAnsi="Arial"/>
+                <w:sz w:val="19"/>
+              </w:rPr>
+              <w:t>Solamente se modifican o cancelan turnos activos y futuros.</w:t>
+            </w:r>
+          </w:p>
+        </w:tc>
+      </w:tr>
+      <w:tr>
+        <w:tc>
+          <w:tcPr>
+            <w:tcW w:type="dxa" w:w="1152"/>
+            <w:vAlign w:val="center"/>
+            <w:tcMar>
+              <w:top w:w="100" w:type="dxa"/>
+              <w:start w:w="120" w:type="dxa"/>
+              <w:bottom w:w="100" w:type="dxa"/>
+              <w:end w:w="120" w:type="dxa"/>
+            </w:tcMar>
+          </w:tcPr>
+          <w:p>
+            <w:pPr>
+              <w:spacing w:after="40" w:before="40"/>
+            </w:pPr>
+            <w:r>
+              <w:rPr>
+                <w:rFonts w:ascii="Arial" w:hAnsi="Arial"/>
+                <w:sz w:val="19"/>
+              </w:rPr>
+              <w:t>RN-07</w:t>
+            </w:r>
+          </w:p>
+        </w:tc>
+        <w:tc>
+          <w:tcPr>
+            <w:tcW w:type="dxa" w:w="8928"/>
+            <w:vAlign w:val="center"/>
+            <w:tcMar>
+              <w:top w:w="100" w:type="dxa"/>
+              <w:start w:w="120" w:type="dxa"/>
+              <w:bottom w:w="100" w:type="dxa"/>
+              <w:end w:w="120" w:type="dxa"/>
+            </w:tcMar>
+          </w:tcPr>
+          <w:p>
+            <w:pPr>
+              <w:spacing w:after="40" w:before="40"/>
+            </w:pPr>
+            <w:r>
+              <w:rPr>
+                <w:rFonts w:ascii="Arial" w:hAnsi="Arial"/>
+                <w:sz w:val="19"/>
+              </w:rPr>
+              <w:t>El nombre normalizado del servicio es único.</w:t>
+            </w:r>
+          </w:p>
+        </w:tc>
+      </w:tr>
+      <w:tr>
+        <w:tc>
+          <w:tcPr>
+            <w:tcW w:type="dxa" w:w="1152"/>
+            <w:vAlign w:val="center"/>
+            <w:tcMar>
+              <w:top w:w="100" w:type="dxa"/>
+              <w:start w:w="120" w:type="dxa"/>
+              <w:bottom w:w="100" w:type="dxa"/>
+              <w:end w:w="120" w:type="dxa"/>
+            </w:tcMar>
+            <w:shd w:fill="EAF2F8"/>
+          </w:tcPr>
+          <w:p>
+            <w:pPr>
+              <w:spacing w:after="40" w:before="40"/>
+            </w:pPr>
+            <w:r>
+              <w:rPr>
+                <w:rFonts w:ascii="Arial" w:hAnsi="Arial"/>
+                <w:sz w:val="19"/>
+              </w:rPr>
+              <w:t>RN-08</w:t>
+            </w:r>
+          </w:p>
+        </w:tc>
+        <w:tc>
+          <w:tcPr>
+            <w:tcW w:type="dxa" w:w="8928"/>
+            <w:vAlign w:val="center"/>
+            <w:tcMar>
+              <w:top w:w="100" w:type="dxa"/>
+              <w:start w:w="120" w:type="dxa"/>
+              <w:bottom w:w="100" w:type="dxa"/>
+              <w:end w:w="120" w:type="dxa"/>
+            </w:tcMar>
+            <w:shd w:fill="EAF2F8"/>
+          </w:tcPr>
+          <w:p>
+            <w:pPr>
+              <w:spacing w:after="40" w:before="40"/>
+            </w:pPr>
+            <w:r>
+              <w:rPr>
+                <w:rFonts w:ascii="Arial" w:hAnsi="Arial"/>
+                <w:sz w:val="19"/>
+              </w:rPr>
+              <w:t>El importe de un servicio debe ser mayor que cero.</w:t>
+            </w:r>
+          </w:p>
+        </w:tc>
+      </w:tr>
+      <w:tr>
+        <w:tc>
+          <w:tcPr>
+            <w:tcW w:type="dxa" w:w="1152"/>
+            <w:vAlign w:val="center"/>
+            <w:tcMar>
+              <w:top w:w="100" w:type="dxa"/>
+              <w:start w:w="120" w:type="dxa"/>
+              <w:bottom w:w="100" w:type="dxa"/>
+              <w:end w:w="120" w:type="dxa"/>
+            </w:tcMar>
+          </w:tcPr>
+          <w:p>
+            <w:pPr>
+              <w:spacing w:after="40" w:before="40"/>
+            </w:pPr>
+            <w:r>
+              <w:rPr>
+                <w:rFonts w:ascii="Arial" w:hAnsi="Arial"/>
+                <w:sz w:val="19"/>
+              </w:rPr>
+              <w:t>RN-09</w:t>
+            </w:r>
+          </w:p>
+        </w:tc>
+        <w:tc>
+          <w:tcPr>
+            <w:tcW w:type="dxa" w:w="8928"/>
+            <w:vAlign w:val="center"/>
+            <w:tcMar>
+              <w:top w:w="100" w:type="dxa"/>
+              <w:start w:w="120" w:type="dxa"/>
+              <w:bottom w:w="100" w:type="dxa"/>
+              <w:end w:w="120" w:type="dxa"/>
+            </w:tcMar>
+          </w:tcPr>
+          <w:p>
+            <w:pPr>
+              <w:spacing w:after="40" w:before="40"/>
+            </w:pPr>
+            <w:r>
+              <w:rPr>
+                <w:rFonts w:ascii="Arial" w:hAnsi="Arial"/>
+                <w:sz w:val="19"/>
+              </w:rPr>
+              <w:t>No puede eliminarse un servicio relacionado con turnos.</w:t>
+            </w:r>
+          </w:p>
+        </w:tc>
+      </w:tr>
+      <w:tr>
+        <w:tc>
+          <w:tcPr>
+            <w:tcW w:type="dxa" w:w="1152"/>
+            <w:vAlign w:val="center"/>
+            <w:tcMar>
+              <w:top w:w="100" w:type="dxa"/>
+              <w:start w:w="120" w:type="dxa"/>
+              <w:bottom w:w="100" w:type="dxa"/>
+              <w:end w:w="120" w:type="dxa"/>
+            </w:tcMar>
+            <w:shd w:fill="EAF2F8"/>
+          </w:tcPr>
+          <w:p>
+            <w:pPr>
+              <w:spacing w:after="40" w:before="40"/>
+            </w:pPr>
+            <w:r>
+              <w:rPr>
+                <w:rFonts w:ascii="Arial" w:hAnsi="Arial"/>
+                <w:sz w:val="19"/>
+              </w:rPr>
+              <w:t>RN-10</w:t>
+            </w:r>
+          </w:p>
+        </w:tc>
+        <w:tc>
+          <w:tcPr>
+            <w:tcW w:type="dxa" w:w="8928"/>
+            <w:vAlign w:val="center"/>
+            <w:tcMar>
+              <w:top w:w="100" w:type="dxa"/>
+              <w:start w:w="120" w:type="dxa"/>
+              <w:bottom w:w="100" w:type="dxa"/>
+              <w:end w:w="120" w:type="dxa"/>
+            </w:tcMar>
+            <w:shd w:fill="EAF2F8"/>
+          </w:tcPr>
+          <w:p>
+            <w:pPr>
+              <w:spacing w:after="40" w:before="40"/>
+            </w:pPr>
+            <w:r>
+              <w:rPr>
+                <w:rFonts w:ascii="Arial" w:hAnsi="Arial"/>
+                <w:sz w:val="19"/>
+              </w:rPr>
+              <w:t>El cliente solo opera sobre sus turnos; empleados y administradores pueden operar sobre cualquiera.</w:t>
+            </w:r>
+          </w:p>
+        </w:tc>
+      </w:tr>
+      <w:tr>
+        <w:tc>
+          <w:tcPr>
+            <w:tcW w:type="dxa" w:w="1152"/>
+            <w:vAlign w:val="center"/>
+            <w:tcMar>
+              <w:top w:w="100" w:type="dxa"/>
+              <w:start w:w="120" w:type="dxa"/>
+              <w:bottom w:w="100" w:type="dxa"/>
+              <w:end w:w="120" w:type="dxa"/>
+            </w:tcMar>
+          </w:tcPr>
+          <w:p>
+            <w:pPr>
+              <w:spacing w:after="40" w:before="40"/>
+            </w:pPr>
+            <w:r>
+              <w:rPr>
+                <w:rFonts w:ascii="Arial" w:hAnsi="Arial"/>
+                <w:sz w:val="19"/>
+              </w:rPr>
+              <w:t>RN-11</w:t>
+            </w:r>
+          </w:p>
+        </w:tc>
+        <w:tc>
+          <w:tcPr>
+            <w:tcW w:type="dxa" w:w="8928"/>
+            <w:vAlign w:val="center"/>
+            <w:tcMar>
+              <w:top w:w="100" w:type="dxa"/>
+              <w:start w:w="120" w:type="dxa"/>
+              <w:bottom w:w="100" w:type="dxa"/>
+              <w:end w:w="120" w:type="dxa"/>
+            </w:tcMar>
+          </w:tcPr>
+          <w:p>
+            <w:pPr>
+              <w:spacing w:after="40" w:before="40"/>
+            </w:pPr>
+            <w:r>
+              <w:rPr>
+                <w:rFonts w:ascii="Arial" w:hAnsi="Arial"/>
+                <w:sz w:val="19"/>
+              </w:rPr>
+              <w:t>Los turnos nuevos o reprogramados deben tener fecha y hora futuras.</w:t>
+            </w:r>
+          </w:p>
+        </w:tc>
+      </w:tr>
+    </w:tbl>
+    <w:p/>
+    <w:p>
+      <w:r>
+        <w:br w:type="page"/>
+      </w:r>
+    </w:p>
+    <w:p>
+      <w:pPr>
+        <w:pStyle w:val="Heading1"/>
+      </w:pPr>
+      <w:r>
+        <w:t>CU-01 Solicitar Turno</w:t>
+      </w:r>
+    </w:p>
+    <w:tbl>
+      <w:tblPr>
+        <w:tblStyle w:val="TableGrid"/>
+        <w:tblW w:type="auto" w:w="0"/>
+        <w:jc w:val="center"/>
+        <w:tblLook w:firstColumn="1" w:firstRow="1" w:lastColumn="0" w:lastRow="0" w:noHBand="0" w:noVBand="1" w:val="04A0"/>
+      </w:tblPr>
+      <w:tblGrid>
+        <w:gridCol w:w="5040"/>
+        <w:gridCol w:w="5040"/>
+      </w:tblGrid>
+      <w:tr>
+        <w:trPr>
+          <w:tblHeader w:val="true"/>
+        </w:trPr>
+        <w:tc>
+          <w:tcPr>
+            <w:tcW w:type="dxa" w:w="2376"/>
+            <w:vAlign w:val="center"/>
+            <w:tcMar>
+              <w:top w:w="100" w:type="dxa"/>
+              <w:start w:w="120" w:type="dxa"/>
+              <w:bottom w:w="100" w:type="dxa"/>
+              <w:end w:w="120" w:type="dxa"/>
+            </w:tcMar>
+            <w:shd w:fill="1F4E78"/>
+          </w:tcPr>
+          <w:p>
+            <w:pPr>
+              <w:spacing w:after="40" w:before="40"/>
+            </w:pPr>
+            <w:r>
+              <w:rPr>
+                <w:rFonts w:ascii="Arial" w:hAnsi="Arial"/>
+                <w:b/>
+                <w:color w:val="FFFFFF"/>
+                <w:sz w:val="19"/>
+              </w:rPr>
+              <w:t>Campo</w:t>
+            </w:r>
+          </w:p>
+        </w:tc>
+        <w:tc>
+          <w:tcPr>
+            <w:tcW w:type="dxa" w:w="7704"/>
+            <w:vAlign w:val="center"/>
+            <w:tcMar>
+              <w:top w:w="100" w:type="dxa"/>
+              <w:start w:w="120" w:type="dxa"/>
+              <w:bottom w:w="100" w:type="dxa"/>
+              <w:end w:w="120" w:type="dxa"/>
+            </w:tcMar>
+            <w:shd w:fill="1F4E78"/>
+          </w:tcPr>
+          <w:p>
+            <w:pPr>
+              <w:spacing w:after="40" w:before="40"/>
+            </w:pPr>
+            <w:r>
+              <w:rPr>
+                <w:rFonts w:ascii="Arial" w:hAnsi="Arial"/>
+                <w:b/>
+                <w:color w:val="FFFFFF"/>
+                <w:sz w:val="19"/>
+              </w:rPr>
+              <w:t>Definición</w:t>
+            </w:r>
+          </w:p>
+        </w:tc>
+      </w:tr>
+      <w:tr>
+        <w:tc>
+          <w:tcPr>
+            <w:tcW w:type="dxa" w:w="2376"/>
+            <w:vAlign w:val="center"/>
+            <w:tcMar>
+              <w:top w:w="100" w:type="dxa"/>
+              <w:start w:w="120" w:type="dxa"/>
+              <w:bottom w:w="100" w:type="dxa"/>
+              <w:end w:w="120" w:type="dxa"/>
+            </w:tcMar>
+          </w:tcPr>
+          <w:p>
+            <w:pPr>
+              <w:spacing w:after="40" w:before="40"/>
+            </w:pPr>
+            <w:r>
+              <w:rPr>
+                <w:rFonts w:ascii="Arial" w:hAnsi="Arial"/>
+                <w:sz w:val="19"/>
+              </w:rPr>
+              <w:t>Actor principal</w:t>
+            </w:r>
+          </w:p>
+        </w:tc>
+        <w:tc>
+          <w:tcPr>
+            <w:tcW w:type="dxa" w:w="7704"/>
+            <w:vAlign w:val="center"/>
+            <w:tcMar>
+              <w:top w:w="100" w:type="dxa"/>
+              <w:start w:w="120" w:type="dxa"/>
+              <w:bottom w:w="100" w:type="dxa"/>
+              <w:end w:w="120" w:type="dxa"/>
+            </w:tcMar>
+          </w:tcPr>
+          <w:p>
+            <w:pPr>
+              <w:spacing w:after="40" w:before="40"/>
+            </w:pPr>
+            <w:r>
+              <w:rPr>
+                <w:rFonts w:ascii="Arial" w:hAnsi="Arial"/>
+                <w:sz w:val="19"/>
               </w:rPr>
               <w:t>Cliente</w:t>
             </w:r>
@@ -519,76 +1335,51 @@
       <w:tr>
         <w:tc>
           <w:tcPr>
-            <w:tcW w:type="dxa" w:w="936"/>
+            <w:tcW w:type="dxa" w:w="2376"/>
             <w:vAlign w:val="center"/>
-            <w:shd w:fill="FFFFFF"/>
-            <w:tcBorders>
-              <w:top w:val="single" w:sz="4" w:color="D9D9D9"/>
-              <w:left w:val="single" w:sz="4" w:color="D9D9D9"/>
-              <w:bottom w:val="single" w:sz="4" w:color="D9D9D9"/>
-              <w:right w:val="single" w:sz="4" w:color="D9D9D9"/>
-            </w:tcBorders>
+            <w:tcMar>
+              <w:top w:w="100" w:type="dxa"/>
+              <w:start w:w="120" w:type="dxa"/>
+              <w:bottom w:w="100" w:type="dxa"/>
+              <w:end w:w="120" w:type="dxa"/>
+            </w:tcMar>
+            <w:shd w:fill="EAF2F8"/>
           </w:tcPr>
           <w:p>
             <w:pPr>
-              <w:spacing w:before="80" w:after="80"/>
+              <w:spacing w:after="40" w:before="40"/>
             </w:pPr>
             <w:r>
               <w:rPr>
-                <w:b w:val="0"/>
-                <w:sz w:val="20"/>
+                <w:rFonts w:ascii="Arial" w:hAnsi="Arial"/>
+                <w:sz w:val="19"/>
               </w:rPr>
-              <w:t>CU-02</w:t>
+              <w:t>Objetivo</w:t>
             </w:r>
           </w:p>
         </w:tc>
         <w:tc>
           <w:tcPr>
-            <w:tcW w:type="dxa" w:w="4608"/>
+            <w:tcW w:type="dxa" w:w="7704"/>
             <w:vAlign w:val="center"/>
-            <w:shd w:fill="FFFFFF"/>
-            <w:tcBorders>
-              <w:top w:val="single" w:sz="4" w:color="D9D9D9"/>
-              <w:left w:val="single" w:sz="4" w:color="D9D9D9"/>
-              <w:bottom w:val="single" w:sz="4" w:color="D9D9D9"/>
-              <w:right w:val="single" w:sz="4" w:color="D9D9D9"/>
-            </w:tcBorders>
+            <w:tcMar>
+              <w:top w:w="100" w:type="dxa"/>
+              <w:start w:w="120" w:type="dxa"/>
+              <w:bottom w:w="100" w:type="dxa"/>
+              <w:end w:w="120" w:type="dxa"/>
+            </w:tcMar>
+            <w:shd w:fill="EAF2F8"/>
           </w:tcPr>
           <w:p>
             <w:pPr>
-              <w:spacing w:before="80" w:after="80"/>
+              <w:spacing w:after="40" w:before="40"/>
             </w:pPr>
             <w:r>
               <w:rPr>
-                <w:b w:val="0"/>
-                <w:sz w:val="20"/>
+                <w:rFonts w:ascii="Arial" w:hAnsi="Arial"/>
+                <w:sz w:val="19"/>
               </w:rPr>
-              <w:t>Procesar Recordatorios</w:t>
-            </w:r>
-          </w:p>
-        </w:tc>
-        <w:tc>
-          <w:tcPr>
-            <w:tcW w:type="dxa" w:w="4392"/>
-            <w:vAlign w:val="center"/>
-            <w:shd w:fill="FFFFFF"/>
-            <w:tcBorders>
-              <w:top w:val="single" w:sz="4" w:color="D9D9D9"/>
-              <w:left w:val="single" w:sz="4" w:color="D9D9D9"/>
-              <w:bottom w:val="single" w:sz="4" w:color="D9D9D9"/>
-              <w:right w:val="single" w:sz="4" w:color="D9D9D9"/>
-            </w:tcBorders>
-          </w:tcPr>
-          <w:p>
-            <w:pPr>
-              <w:spacing w:before="80" w:after="80"/>
-            </w:pPr>
-            <w:r>
-              <w:rPr>
-                <w:b w:val="0"/>
-                <w:sz w:val="20"/>
-              </w:rPr>
-              <w:t>Proceso programado o Administrador</w:t>
+              <w:t>Reservar un horario para un servicio de lavado.</w:t>
             </w:r>
           </w:p>
         </w:tc>
@@ -596,74 +1387,784 @@
       <w:tr>
         <w:tc>
           <w:tcPr>
-            <w:tcW w:type="dxa" w:w="936"/>
+            <w:tcW w:type="dxa" w:w="2376"/>
             <w:vAlign w:val="center"/>
-            <w:shd w:fill="FFFFFF"/>
-            <w:tcBorders>
-              <w:top w:val="single" w:sz="4" w:color="D9D9D9"/>
-              <w:left w:val="single" w:sz="4" w:color="D9D9D9"/>
-              <w:bottom w:val="single" w:sz="4" w:color="D9D9D9"/>
-              <w:right w:val="single" w:sz="4" w:color="D9D9D9"/>
-            </w:tcBorders>
+            <w:tcMar>
+              <w:top w:w="100" w:type="dxa"/>
+              <w:start w:w="120" w:type="dxa"/>
+              <w:bottom w:w="100" w:type="dxa"/>
+              <w:end w:w="120" w:type="dxa"/>
+            </w:tcMar>
           </w:tcPr>
           <w:p>
             <w:pPr>
-              <w:spacing w:before="80" w:after="80"/>
+              <w:spacing w:after="40" w:before="40"/>
             </w:pPr>
             <w:r>
               <w:rPr>
-                <w:b w:val="0"/>
-                <w:sz w:val="20"/>
+                <w:rFonts w:ascii="Arial" w:hAnsi="Arial"/>
+                <w:sz w:val="19"/>
               </w:rPr>
-              <w:t>CU-03</w:t>
+              <w:t>Precondiciones</w:t>
             </w:r>
           </w:p>
         </w:tc>
         <w:tc>
           <w:tcPr>
-            <w:tcW w:type="dxa" w:w="4608"/>
+            <w:tcW w:type="dxa" w:w="7704"/>
             <w:vAlign w:val="center"/>
-            <w:shd w:fill="FFFFFF"/>
-            <w:tcBorders>
-              <w:top w:val="single" w:sz="4" w:color="D9D9D9"/>
-              <w:left w:val="single" w:sz="4" w:color="D9D9D9"/>
-              <w:bottom w:val="single" w:sz="4" w:color="D9D9D9"/>
-              <w:right w:val="single" w:sz="4" w:color="D9D9D9"/>
-            </w:tcBorders>
+            <w:tcMar>
+              <w:top w:w="100" w:type="dxa"/>
+              <w:start w:w="120" w:type="dxa"/>
+              <w:bottom w:w="100" w:type="dxa"/>
+              <w:end w:w="120" w:type="dxa"/>
+            </w:tcMar>
           </w:tcPr>
           <w:p>
             <w:pPr>
-              <w:spacing w:before="80" w:after="80"/>
+              <w:spacing w:after="40" w:before="40"/>
             </w:pPr>
             <w:r>
               <w:rPr>
-                <w:b w:val="0"/>
-                <w:sz w:val="20"/>
+                <w:rFonts w:ascii="Arial" w:hAnsi="Arial"/>
+                <w:sz w:val="19"/>
               </w:rPr>
-              <w:t>Crear Turno</w:t>
+              <w:t>Cliente registrado y autenticado; catálogo y agenda disponibles.</w:t>
+            </w:r>
+          </w:p>
+        </w:tc>
+      </w:tr>
+      <w:tr>
+        <w:tc>
+          <w:tcPr>
+            <w:tcW w:type="dxa" w:w="2376"/>
+            <w:vAlign w:val="center"/>
+            <w:tcMar>
+              <w:top w:w="100" w:type="dxa"/>
+              <w:start w:w="120" w:type="dxa"/>
+              <w:bottom w:w="100" w:type="dxa"/>
+              <w:end w:w="120" w:type="dxa"/>
+            </w:tcMar>
+            <w:shd w:fill="EAF2F8"/>
+          </w:tcPr>
+          <w:p>
+            <w:pPr>
+              <w:spacing w:after="40" w:before="40"/>
+            </w:pPr>
+            <w:r>
+              <w:rPr>
+                <w:rFonts w:ascii="Arial" w:hAnsi="Arial"/>
+                <w:sz w:val="19"/>
+              </w:rPr>
+              <w:t>Reglas relacionadas</w:t>
             </w:r>
           </w:p>
         </w:tc>
         <w:tc>
           <w:tcPr>
-            <w:tcW w:type="dxa" w:w="4392"/>
+            <w:tcW w:type="dxa" w:w="7704"/>
             <w:vAlign w:val="center"/>
-            <w:shd w:fill="FFFFFF"/>
-            <w:tcBorders>
-              <w:top w:val="single" w:sz="4" w:color="D9D9D9"/>
-              <w:left w:val="single" w:sz="4" w:color="D9D9D9"/>
-              <w:bottom w:val="single" w:sz="4" w:color="D9D9D9"/>
-              <w:right w:val="single" w:sz="4" w:color="D9D9D9"/>
-            </w:tcBorders>
+            <w:tcMar>
+              <w:top w:w="100" w:type="dxa"/>
+              <w:start w:w="120" w:type="dxa"/>
+              <w:bottom w:w="100" w:type="dxa"/>
+              <w:end w:w="120" w:type="dxa"/>
+            </w:tcMar>
+            <w:shd w:fill="EAF2F8"/>
           </w:tcPr>
           <w:p>
             <w:pPr>
-              <w:spacing w:before="80" w:after="80"/>
+              <w:spacing w:after="40" w:before="40"/>
             </w:pPr>
             <w:r>
               <w:rPr>
-                <w:b w:val="0"/>
-                <w:sz w:val="20"/>
+                <w:rFonts w:ascii="Arial" w:hAnsi="Arial"/>
+                <w:sz w:val="19"/>
+              </w:rPr>
+              <w:t>RN-01, RN-02, RN-03, RN-10 y RN-11.</w:t>
+            </w:r>
+          </w:p>
+        </w:tc>
+      </w:tr>
+    </w:tbl>
+    <w:p/>
+    <w:p>
+      <w:pPr>
+        <w:pStyle w:val="Heading2"/>
+      </w:pPr>
+      <w:r>
+        <w:t>Flujo principal</w:t>
+      </w:r>
+    </w:p>
+    <w:p>
+      <w:pPr>
+        <w:spacing w:after="60"/>
+        <w:ind w:left="360" w:hanging="360"/>
+      </w:pPr>
+      <w:r>
+        <w:t>1.  El cliente consulta los servicios y horarios disponibles.</w:t>
+      </w:r>
+    </w:p>
+    <w:p>
+      <w:pPr>
+        <w:spacing w:after="60"/>
+        <w:ind w:left="360" w:hanging="360"/>
+      </w:pPr>
+      <w:r>
+        <w:t>2.  Selecciona un servicio, una fecha y una hora.</w:t>
+      </w:r>
+    </w:p>
+    <w:p>
+      <w:pPr>
+        <w:spacing w:after="60"/>
+        <w:ind w:left="360" w:hanging="360"/>
+      </w:pPr>
+      <w:r>
+        <w:t>3.  El sistema identifica al cliente autenticado y valida servicio, fecha y disponibilidad.</w:t>
+      </w:r>
+    </w:p>
+    <w:p>
+      <w:pPr>
+        <w:spacing w:after="60"/>
+        <w:ind w:left="360" w:hanging="360"/>
+      </w:pPr>
+      <w:r>
+        <w:t>4.  El sistema registra el turno con estado Confirmado y comunica el resultado.</w:t>
+      </w:r>
+    </w:p>
+    <w:p>
+      <w:pPr>
+        <w:pStyle w:val="Heading2"/>
+      </w:pPr>
+      <w:r>
+        <w:t>Flujos alternativos</w:t>
+      </w:r>
+    </w:p>
+    <w:p>
+      <w:pPr>
+        <w:pStyle w:val="ListBullet"/>
+        <w:spacing w:after="80"/>
+      </w:pPr>
+      <w:r>
+        <w:rPr>
+          <w:b/>
+        </w:rPr>
+        <w:t xml:space="preserve">Horario ocupado: </w:t>
+      </w:r>
+      <w:r>
+        <w:t>el sistema informa el conflicto y permite elegir otro horario.</w:t>
+      </w:r>
+    </w:p>
+    <w:p>
+      <w:pPr>
+        <w:pStyle w:val="ListBullet"/>
+        <w:spacing w:after="80"/>
+      </w:pPr>
+      <w:r>
+        <w:rPr>
+          <w:b/>
+        </w:rPr>
+        <w:t xml:space="preserve">Servicio inexistente o inactivo: </w:t>
+      </w:r>
+      <w:r>
+        <w:t>el sistema rechaza la solicitud.</w:t>
+      </w:r>
+    </w:p>
+    <w:p>
+      <w:pPr>
+        <w:pStyle w:val="ListBullet"/>
+        <w:spacing w:after="80"/>
+      </w:pPr>
+      <w:r>
+        <w:rPr>
+          <w:b/>
+        </w:rPr>
+        <w:t xml:space="preserve">Fecha pasada: </w:t>
+      </w:r>
+      <w:r>
+        <w:t>el sistema informa que el turno debe ser futuro.</w:t>
+      </w:r>
+    </w:p>
+    <w:p>
+      <w:pPr>
+        <w:pStyle w:val="ListBullet"/>
+        <w:spacing w:after="80"/>
+      </w:pPr>
+      <w:r>
+        <w:rPr>
+          <w:b/>
+        </w:rPr>
+        <w:t xml:space="preserve">Operación cancelada: </w:t>
+      </w:r>
+      <w:r>
+        <w:t>no se registra ningún turno.</w:t>
+      </w:r>
+    </w:p>
+    <w:p>
+      <w:pPr>
+        <w:pStyle w:val="Heading2"/>
+      </w:pPr>
+      <w:r>
+        <w:t>Postcondiciones</w:t>
+      </w:r>
+    </w:p>
+    <w:p>
+      <w:pPr>
+        <w:pStyle w:val="ListBullet"/>
+        <w:spacing w:after="60"/>
+      </w:pPr>
+      <w:r>
+        <w:t>El turno queda confirmado.</w:t>
+      </w:r>
+    </w:p>
+    <w:p>
+      <w:pPr>
+        <w:pStyle w:val="ListBullet"/>
+        <w:spacing w:after="60"/>
+      </w:pPr>
+      <w:r>
+        <w:t>La fecha y hora dejan de estar disponibles.</w:t>
+      </w:r>
+    </w:p>
+    <w:p>
+      <w:r>
+        <w:br w:type="page"/>
+      </w:r>
+    </w:p>
+    <w:p>
+      <w:pPr>
+        <w:pStyle w:val="Heading1"/>
+      </w:pPr>
+      <w:r>
+        <w:t>CU-02 Procesar Recordatorios</w:t>
+      </w:r>
+    </w:p>
+    <w:tbl>
+      <w:tblPr>
+        <w:tblStyle w:val="TableGrid"/>
+        <w:tblW w:type="auto" w:w="0"/>
+        <w:jc w:val="center"/>
+        <w:tblLook w:firstColumn="1" w:firstRow="1" w:lastColumn="0" w:lastRow="0" w:noHBand="0" w:noVBand="1" w:val="04A0"/>
+      </w:tblPr>
+      <w:tblGrid>
+        <w:gridCol w:w="5040"/>
+        <w:gridCol w:w="5040"/>
+      </w:tblGrid>
+      <w:tr>
+        <w:trPr>
+          <w:tblHeader w:val="true"/>
+        </w:trPr>
+        <w:tc>
+          <w:tcPr>
+            <w:tcW w:type="dxa" w:w="2376"/>
+            <w:vAlign w:val="center"/>
+            <w:tcMar>
+              <w:top w:w="100" w:type="dxa"/>
+              <w:start w:w="120" w:type="dxa"/>
+              <w:bottom w:w="100" w:type="dxa"/>
+              <w:end w:w="120" w:type="dxa"/>
+            </w:tcMar>
+            <w:shd w:fill="1F4E78"/>
+          </w:tcPr>
+          <w:p>
+            <w:pPr>
+              <w:spacing w:after="40" w:before="40"/>
+            </w:pPr>
+            <w:r>
+              <w:rPr>
+                <w:rFonts w:ascii="Arial" w:hAnsi="Arial"/>
+                <w:b/>
+                <w:color w:val="FFFFFF"/>
+                <w:sz w:val="19"/>
+              </w:rPr>
+              <w:t>Campo</w:t>
+            </w:r>
+          </w:p>
+        </w:tc>
+        <w:tc>
+          <w:tcPr>
+            <w:tcW w:type="dxa" w:w="7704"/>
+            <w:vAlign w:val="center"/>
+            <w:tcMar>
+              <w:top w:w="100" w:type="dxa"/>
+              <w:start w:w="120" w:type="dxa"/>
+              <w:bottom w:w="100" w:type="dxa"/>
+              <w:end w:w="120" w:type="dxa"/>
+            </w:tcMar>
+            <w:shd w:fill="1F4E78"/>
+          </w:tcPr>
+          <w:p>
+            <w:pPr>
+              <w:spacing w:after="40" w:before="40"/>
+            </w:pPr>
+            <w:r>
+              <w:rPr>
+                <w:rFonts w:ascii="Arial" w:hAnsi="Arial"/>
+                <w:b/>
+                <w:color w:val="FFFFFF"/>
+                <w:sz w:val="19"/>
+              </w:rPr>
+              <w:t>Definición</w:t>
+            </w:r>
+          </w:p>
+        </w:tc>
+      </w:tr>
+      <w:tr>
+        <w:tc>
+          <w:tcPr>
+            <w:tcW w:type="dxa" w:w="2376"/>
+            <w:vAlign w:val="center"/>
+            <w:tcMar>
+              <w:top w:w="100" w:type="dxa"/>
+              <w:start w:w="120" w:type="dxa"/>
+              <w:bottom w:w="100" w:type="dxa"/>
+              <w:end w:w="120" w:type="dxa"/>
+            </w:tcMar>
+          </w:tcPr>
+          <w:p>
+            <w:pPr>
+              <w:spacing w:after="40" w:before="40"/>
+            </w:pPr>
+            <w:r>
+              <w:rPr>
+                <w:rFonts w:ascii="Arial" w:hAnsi="Arial"/>
+                <w:sz w:val="19"/>
+              </w:rPr>
+              <w:t>Actor principal</w:t>
+            </w:r>
+          </w:p>
+        </w:tc>
+        <w:tc>
+          <w:tcPr>
+            <w:tcW w:type="dxa" w:w="7704"/>
+            <w:vAlign w:val="center"/>
+            <w:tcMar>
+              <w:top w:w="100" w:type="dxa"/>
+              <w:start w:w="120" w:type="dxa"/>
+              <w:bottom w:w="100" w:type="dxa"/>
+              <w:end w:w="120" w:type="dxa"/>
+            </w:tcMar>
+          </w:tcPr>
+          <w:p>
+            <w:pPr>
+              <w:spacing w:after="40" w:before="40"/>
+            </w:pPr>
+            <w:r>
+              <w:rPr>
+                <w:rFonts w:ascii="Arial" w:hAnsi="Arial"/>
+                <w:sz w:val="19"/>
+              </w:rPr>
+              <w:t>Proceso programado del sistema</w:t>
+            </w:r>
+          </w:p>
+        </w:tc>
+      </w:tr>
+      <w:tr>
+        <w:tc>
+          <w:tcPr>
+            <w:tcW w:type="dxa" w:w="2376"/>
+            <w:vAlign w:val="center"/>
+            <w:tcMar>
+              <w:top w:w="100" w:type="dxa"/>
+              <w:start w:w="120" w:type="dxa"/>
+              <w:bottom w:w="100" w:type="dxa"/>
+              <w:end w:w="120" w:type="dxa"/>
+            </w:tcMar>
+            <w:shd w:fill="EAF2F8"/>
+          </w:tcPr>
+          <w:p>
+            <w:pPr>
+              <w:spacing w:after="40" w:before="40"/>
+            </w:pPr>
+            <w:r>
+              <w:rPr>
+                <w:rFonts w:ascii="Arial" w:hAnsi="Arial"/>
+                <w:sz w:val="19"/>
+              </w:rPr>
+              <w:t>Objetivo</w:t>
+            </w:r>
+          </w:p>
+        </w:tc>
+        <w:tc>
+          <w:tcPr>
+            <w:tcW w:type="dxa" w:w="7704"/>
+            <w:vAlign w:val="center"/>
+            <w:tcMar>
+              <w:top w:w="100" w:type="dxa"/>
+              <w:start w:w="120" w:type="dxa"/>
+              <w:bottom w:w="100" w:type="dxa"/>
+              <w:end w:w="120" w:type="dxa"/>
+            </w:tcMar>
+            <w:shd w:fill="EAF2F8"/>
+          </w:tcPr>
+          <w:p>
+            <w:pPr>
+              <w:spacing w:after="40" w:before="40"/>
+            </w:pPr>
+            <w:r>
+              <w:rPr>
+                <w:rFonts w:ascii="Arial" w:hAnsi="Arial"/>
+                <w:sz w:val="19"/>
+              </w:rPr>
+              <w:t>Recordar a los clientes sus turnos próximos.</w:t>
+            </w:r>
+          </w:p>
+        </w:tc>
+      </w:tr>
+      <w:tr>
+        <w:tc>
+          <w:tcPr>
+            <w:tcW w:type="dxa" w:w="2376"/>
+            <w:vAlign w:val="center"/>
+            <w:tcMar>
+              <w:top w:w="100" w:type="dxa"/>
+              <w:start w:w="120" w:type="dxa"/>
+              <w:bottom w:w="100" w:type="dxa"/>
+              <w:end w:w="120" w:type="dxa"/>
+            </w:tcMar>
+          </w:tcPr>
+          <w:p>
+            <w:pPr>
+              <w:spacing w:after="40" w:before="40"/>
+            </w:pPr>
+            <w:r>
+              <w:rPr>
+                <w:rFonts w:ascii="Arial" w:hAnsi="Arial"/>
+                <w:sz w:val="19"/>
+              </w:rPr>
+              <w:t>Precondiciones</w:t>
+            </w:r>
+          </w:p>
+        </w:tc>
+        <w:tc>
+          <w:tcPr>
+            <w:tcW w:type="dxa" w:w="7704"/>
+            <w:vAlign w:val="center"/>
+            <w:tcMar>
+              <w:top w:w="100" w:type="dxa"/>
+              <w:start w:w="120" w:type="dxa"/>
+              <w:bottom w:w="100" w:type="dxa"/>
+              <w:end w:w="120" w:type="dxa"/>
+            </w:tcMar>
+          </w:tcPr>
+          <w:p>
+            <w:pPr>
+              <w:spacing w:after="40" w:before="40"/>
+            </w:pPr>
+            <w:r>
+              <w:rPr>
+                <w:rFonts w:ascii="Arial" w:hAnsi="Arial"/>
+                <w:sz w:val="19"/>
+              </w:rPr>
+              <w:t>Existe un turno próximo confirmado y el cliente posee un medio de contacto.</w:t>
+            </w:r>
+          </w:p>
+        </w:tc>
+      </w:tr>
+      <w:tr>
+        <w:tc>
+          <w:tcPr>
+            <w:tcW w:type="dxa" w:w="2376"/>
+            <w:vAlign w:val="center"/>
+            <w:tcMar>
+              <w:top w:w="100" w:type="dxa"/>
+              <w:start w:w="120" w:type="dxa"/>
+              <w:bottom w:w="100" w:type="dxa"/>
+              <w:end w:w="120" w:type="dxa"/>
+            </w:tcMar>
+            <w:shd w:fill="EAF2F8"/>
+          </w:tcPr>
+          <w:p>
+            <w:pPr>
+              <w:spacing w:after="40" w:before="40"/>
+            </w:pPr>
+            <w:r>
+              <w:rPr>
+                <w:rFonts w:ascii="Arial" w:hAnsi="Arial"/>
+                <w:sz w:val="19"/>
+              </w:rPr>
+              <w:t>Reglas relacionadas</w:t>
+            </w:r>
+          </w:p>
+        </w:tc>
+        <w:tc>
+          <w:tcPr>
+            <w:tcW w:type="dxa" w:w="7704"/>
+            <w:vAlign w:val="center"/>
+            <w:tcMar>
+              <w:top w:w="100" w:type="dxa"/>
+              <w:start w:w="120" w:type="dxa"/>
+              <w:bottom w:w="100" w:type="dxa"/>
+              <w:end w:w="120" w:type="dxa"/>
+            </w:tcMar>
+            <w:shd w:fill="EAF2F8"/>
+          </w:tcPr>
+          <w:p>
+            <w:pPr>
+              <w:spacing w:after="40" w:before="40"/>
+            </w:pPr>
+            <w:r>
+              <w:rPr>
+                <w:rFonts w:ascii="Arial" w:hAnsi="Arial"/>
+                <w:sz w:val="19"/>
+              </w:rPr>
+              <w:t>RN-04 y RN-05.</w:t>
+            </w:r>
+          </w:p>
+        </w:tc>
+      </w:tr>
+    </w:tbl>
+    <w:p/>
+    <w:p>
+      <w:pPr>
+        <w:pStyle w:val="Heading2"/>
+      </w:pPr>
+      <w:r>
+        <w:t>Flujo principal</w:t>
+      </w:r>
+    </w:p>
+    <w:p>
+      <w:pPr>
+        <w:spacing w:after="60"/>
+        <w:ind w:left="360" w:hanging="360"/>
+      </w:pPr>
+      <w:r>
+        <w:t>1.  El proceso programado identifica los turnos próximos sin recordatorio procesado.</w:t>
+      </w:r>
+    </w:p>
+    <w:p>
+      <w:pPr>
+        <w:spacing w:after="60"/>
+        <w:ind w:left="360" w:hanging="360"/>
+      </w:pPr>
+      <w:r>
+        <w:t>2.  El sistema valida el estado del turno y las preferencias del cliente.</w:t>
+      </w:r>
+    </w:p>
+    <w:p>
+      <w:pPr>
+        <w:spacing w:after="60"/>
+        <w:ind w:left="360" w:hanging="360"/>
+      </w:pPr>
+      <w:r>
+        <w:t>3.  El servicio de notificaciones realiza el envío.</w:t>
+      </w:r>
+    </w:p>
+    <w:p>
+      <w:pPr>
+        <w:spacing w:after="60"/>
+        <w:ind w:left="360" w:hanging="360"/>
+      </w:pPr>
+      <w:r>
+        <w:t>4.  El sistema registra el resultado del intento.</w:t>
+      </w:r>
+    </w:p>
+    <w:p>
+      <w:pPr>
+        <w:pStyle w:val="Heading2"/>
+      </w:pPr>
+      <w:r>
+        <w:t>Flujos alternativos</w:t>
+      </w:r>
+    </w:p>
+    <w:p>
+      <w:pPr>
+        <w:pStyle w:val="ListBullet"/>
+        <w:spacing w:after="80"/>
+      </w:pPr>
+      <w:r>
+        <w:rPr>
+          <w:b/>
+        </w:rPr>
+        <w:t xml:space="preserve">Turno cancelado: </w:t>
+      </w:r>
+      <w:r>
+        <w:t>no se envía el recordatorio.</w:t>
+      </w:r>
+    </w:p>
+    <w:p>
+      <w:pPr>
+        <w:pStyle w:val="ListBullet"/>
+        <w:spacing w:after="80"/>
+      </w:pPr>
+      <w:r>
+        <w:rPr>
+          <w:b/>
+        </w:rPr>
+        <w:t xml:space="preserve">Contacto inválido: </w:t>
+      </w:r>
+      <w:r>
+        <w:t>se registra el intento fallido y continúa el proceso.</w:t>
+      </w:r>
+    </w:p>
+    <w:p>
+      <w:pPr>
+        <w:pStyle w:val="ListBullet"/>
+        <w:spacing w:after="80"/>
+      </w:pPr>
+      <w:r>
+        <w:rPr>
+          <w:b/>
+        </w:rPr>
+        <w:t xml:space="preserve">Notificaciones desactivadas: </w:t>
+      </w:r>
+      <w:r>
+        <w:t>se respeta la preferencia y no se envía.</w:t>
+      </w:r>
+    </w:p>
+    <w:p>
+      <w:pPr>
+        <w:pStyle w:val="Heading2"/>
+      </w:pPr>
+      <w:r>
+        <w:t>Postcondiciones</w:t>
+      </w:r>
+    </w:p>
+    <w:p>
+      <w:pPr>
+        <w:pStyle w:val="ListBullet"/>
+        <w:spacing w:after="60"/>
+      </w:pPr>
+      <w:r>
+        <w:t>El intento queda registrado.</w:t>
+      </w:r>
+    </w:p>
+    <w:p>
+      <w:pPr>
+        <w:pStyle w:val="ListBullet"/>
+        <w:spacing w:after="60"/>
+      </w:pPr>
+      <w:r>
+        <w:t>Un recordatorio procesado no vuelve a enviarse.</w:t>
+      </w:r>
+    </w:p>
+    <w:p>
+      <w:r>
+        <w:br w:type="page"/>
+      </w:r>
+    </w:p>
+    <w:p>
+      <w:pPr>
+        <w:pStyle w:val="Heading1"/>
+      </w:pPr>
+      <w:r>
+        <w:t>CU-03 Crear Turno</w:t>
+      </w:r>
+    </w:p>
+    <w:tbl>
+      <w:tblPr>
+        <w:tblStyle w:val="TableGrid"/>
+        <w:tblW w:type="auto" w:w="0"/>
+        <w:jc w:val="center"/>
+        <w:tblLook w:firstColumn="1" w:firstRow="1" w:lastColumn="0" w:lastRow="0" w:noHBand="0" w:noVBand="1" w:val="04A0"/>
+      </w:tblPr>
+      <w:tblGrid>
+        <w:gridCol w:w="5040"/>
+        <w:gridCol w:w="5040"/>
+      </w:tblGrid>
+      <w:tr>
+        <w:trPr>
+          <w:tblHeader w:val="true"/>
+        </w:trPr>
+        <w:tc>
+          <w:tcPr>
+            <w:tcW w:type="dxa" w:w="2376"/>
+            <w:vAlign w:val="center"/>
+            <w:tcMar>
+              <w:top w:w="100" w:type="dxa"/>
+              <w:start w:w="120" w:type="dxa"/>
+              <w:bottom w:w="100" w:type="dxa"/>
+              <w:end w:w="120" w:type="dxa"/>
+            </w:tcMar>
+            <w:shd w:fill="1F4E78"/>
+          </w:tcPr>
+          <w:p>
+            <w:pPr>
+              <w:spacing w:after="40" w:before="40"/>
+            </w:pPr>
+            <w:r>
+              <w:rPr>
+                <w:rFonts w:ascii="Arial" w:hAnsi="Arial"/>
+                <w:b/>
+                <w:color w:val="FFFFFF"/>
+                <w:sz w:val="19"/>
+              </w:rPr>
+              <w:t>Campo</w:t>
+            </w:r>
+          </w:p>
+        </w:tc>
+        <w:tc>
+          <w:tcPr>
+            <w:tcW w:type="dxa" w:w="7704"/>
+            <w:vAlign w:val="center"/>
+            <w:tcMar>
+              <w:top w:w="100" w:type="dxa"/>
+              <w:start w:w="120" w:type="dxa"/>
+              <w:bottom w:w="100" w:type="dxa"/>
+              <w:end w:w="120" w:type="dxa"/>
+            </w:tcMar>
+            <w:shd w:fill="1F4E78"/>
+          </w:tcPr>
+          <w:p>
+            <w:pPr>
+              <w:spacing w:after="40" w:before="40"/>
+            </w:pPr>
+            <w:r>
+              <w:rPr>
+                <w:rFonts w:ascii="Arial" w:hAnsi="Arial"/>
+                <w:b/>
+                <w:color w:val="FFFFFF"/>
+                <w:sz w:val="19"/>
+              </w:rPr>
+              <w:t>Definición</w:t>
+            </w:r>
+          </w:p>
+        </w:tc>
+      </w:tr>
+      <w:tr>
+        <w:tc>
+          <w:tcPr>
+            <w:tcW w:type="dxa" w:w="2376"/>
+            <w:vAlign w:val="center"/>
+            <w:tcMar>
+              <w:top w:w="100" w:type="dxa"/>
+              <w:start w:w="120" w:type="dxa"/>
+              <w:bottom w:w="100" w:type="dxa"/>
+              <w:end w:w="120" w:type="dxa"/>
+            </w:tcMar>
+          </w:tcPr>
+          <w:p>
+            <w:pPr>
+              <w:spacing w:after="40" w:before="40"/>
+            </w:pPr>
+            <w:r>
+              <w:rPr>
+                <w:rFonts w:ascii="Arial" w:hAnsi="Arial"/>
+                <w:sz w:val="19"/>
+              </w:rPr>
+              <w:t>Actor principal</w:t>
+            </w:r>
+          </w:p>
+        </w:tc>
+        <w:tc>
+          <w:tcPr>
+            <w:tcW w:type="dxa" w:w="7704"/>
+            <w:vAlign w:val="center"/>
+            <w:tcMar>
+              <w:top w:w="100" w:type="dxa"/>
+              <w:start w:w="120" w:type="dxa"/>
+              <w:bottom w:w="100" w:type="dxa"/>
+              <w:end w:w="120" w:type="dxa"/>
+            </w:tcMar>
+          </w:tcPr>
+          <w:p>
+            <w:pPr>
+              <w:spacing w:after="40" w:before="40"/>
+            </w:pPr>
+            <w:r>
+              <w:rPr>
+                <w:rFonts w:ascii="Arial" w:hAnsi="Arial"/>
+                <w:sz w:val="19"/>
               </w:rPr>
               <w:t>Empleado o Administrador</w:t>
             </w:r>
@@ -673,76 +2174,51 @@
       <w:tr>
         <w:tc>
           <w:tcPr>
-            <w:tcW w:type="dxa" w:w="936"/>
+            <w:tcW w:type="dxa" w:w="2376"/>
             <w:vAlign w:val="center"/>
-            <w:shd w:fill="FFFFFF"/>
-            <w:tcBorders>
-              <w:top w:val="single" w:sz="4" w:color="D9D9D9"/>
-              <w:left w:val="single" w:sz="4" w:color="D9D9D9"/>
-              <w:bottom w:val="single" w:sz="4" w:color="D9D9D9"/>
-              <w:right w:val="single" w:sz="4" w:color="D9D9D9"/>
-            </w:tcBorders>
+            <w:tcMar>
+              <w:top w:w="100" w:type="dxa"/>
+              <w:start w:w="120" w:type="dxa"/>
+              <w:bottom w:w="100" w:type="dxa"/>
+              <w:end w:w="120" w:type="dxa"/>
+            </w:tcMar>
+            <w:shd w:fill="EAF2F8"/>
           </w:tcPr>
           <w:p>
             <w:pPr>
-              <w:spacing w:before="80" w:after="80"/>
+              <w:spacing w:after="40" w:before="40"/>
             </w:pPr>
             <w:r>
               <w:rPr>
-                <w:b w:val="0"/>
-                <w:sz w:val="20"/>
+                <w:rFonts w:ascii="Arial" w:hAnsi="Arial"/>
+                <w:sz w:val="19"/>
               </w:rPr>
-              <w:t>CU-04</w:t>
+              <w:t>Objetivo</w:t>
             </w:r>
           </w:p>
         </w:tc>
         <w:tc>
           <w:tcPr>
-            <w:tcW w:type="dxa" w:w="4608"/>
+            <w:tcW w:type="dxa" w:w="7704"/>
             <w:vAlign w:val="center"/>
-            <w:shd w:fill="FFFFFF"/>
-            <w:tcBorders>
-              <w:top w:val="single" w:sz="4" w:color="D9D9D9"/>
-              <w:left w:val="single" w:sz="4" w:color="D9D9D9"/>
-              <w:bottom w:val="single" w:sz="4" w:color="D9D9D9"/>
-              <w:right w:val="single" w:sz="4" w:color="D9D9D9"/>
-            </w:tcBorders>
+            <w:tcMar>
+              <w:top w:w="100" w:type="dxa"/>
+              <w:start w:w="120" w:type="dxa"/>
+              <w:bottom w:w="100" w:type="dxa"/>
+              <w:end w:w="120" w:type="dxa"/>
+            </w:tcMar>
+            <w:shd w:fill="EAF2F8"/>
           </w:tcPr>
           <w:p>
             <w:pPr>
-              <w:spacing w:before="80" w:after="80"/>
+              <w:spacing w:after="40" w:before="40"/>
             </w:pPr>
             <w:r>
               <w:rPr>
-                <w:b w:val="0"/>
-                <w:sz w:val="20"/>
+                <w:rFonts w:ascii="Arial" w:hAnsi="Arial"/>
+                <w:sz w:val="19"/>
               </w:rPr>
-              <w:t>Modificar Turno</w:t>
-            </w:r>
-          </w:p>
-        </w:tc>
-        <w:tc>
-          <w:tcPr>
-            <w:tcW w:type="dxa" w:w="4392"/>
-            <w:vAlign w:val="center"/>
-            <w:shd w:fill="FFFFFF"/>
-            <w:tcBorders>
-              <w:top w:val="single" w:sz="4" w:color="D9D9D9"/>
-              <w:left w:val="single" w:sz="4" w:color="D9D9D9"/>
-              <w:bottom w:val="single" w:sz="4" w:color="D9D9D9"/>
-              <w:right w:val="single" w:sz="4" w:color="D9D9D9"/>
-            </w:tcBorders>
-          </w:tcPr>
-          <w:p>
-            <w:pPr>
-              <w:spacing w:before="80" w:after="80"/>
-            </w:pPr>
-            <w:r>
-              <w:rPr>
-                <w:b w:val="0"/>
-                <w:sz w:val="20"/>
-              </w:rPr>
-              <w:t>Cliente o Personal</w:t>
+              <w:t>Registrar un turno en nombre de un cliente.</w:t>
             </w:r>
           </w:p>
         </w:tc>
@@ -750,76 +2226,49 @@
       <w:tr>
         <w:tc>
           <w:tcPr>
-            <w:tcW w:type="dxa" w:w="936"/>
+            <w:tcW w:type="dxa" w:w="2376"/>
             <w:vAlign w:val="center"/>
-            <w:shd w:fill="FFFFFF"/>
-            <w:tcBorders>
-              <w:top w:val="single" w:sz="4" w:color="D9D9D9"/>
-              <w:left w:val="single" w:sz="4" w:color="D9D9D9"/>
-              <w:bottom w:val="single" w:sz="4" w:color="D9D9D9"/>
-              <w:right w:val="single" w:sz="4" w:color="D9D9D9"/>
-            </w:tcBorders>
+            <w:tcMar>
+              <w:top w:w="100" w:type="dxa"/>
+              <w:start w:w="120" w:type="dxa"/>
+              <w:bottom w:w="100" w:type="dxa"/>
+              <w:end w:w="120" w:type="dxa"/>
+            </w:tcMar>
           </w:tcPr>
           <w:p>
             <w:pPr>
-              <w:spacing w:before="80" w:after="80"/>
+              <w:spacing w:after="40" w:before="40"/>
             </w:pPr>
             <w:r>
               <w:rPr>
-                <w:b w:val="0"/>
-                <w:sz w:val="20"/>
+                <w:rFonts w:ascii="Arial" w:hAnsi="Arial"/>
+                <w:sz w:val="19"/>
               </w:rPr>
-              <w:t>CU-05</w:t>
+              <w:t>Precondiciones</w:t>
             </w:r>
           </w:p>
         </w:tc>
         <w:tc>
           <w:tcPr>
-            <w:tcW w:type="dxa" w:w="4608"/>
+            <w:tcW w:type="dxa" w:w="7704"/>
             <w:vAlign w:val="center"/>
-            <w:shd w:fill="FFFFFF"/>
-            <w:tcBorders>
-              <w:top w:val="single" w:sz="4" w:color="D9D9D9"/>
-              <w:left w:val="single" w:sz="4" w:color="D9D9D9"/>
-              <w:bottom w:val="single" w:sz="4" w:color="D9D9D9"/>
-              <w:right w:val="single" w:sz="4" w:color="D9D9D9"/>
-            </w:tcBorders>
+            <w:tcMar>
+              <w:top w:w="100" w:type="dxa"/>
+              <w:start w:w="120" w:type="dxa"/>
+              <w:bottom w:w="100" w:type="dxa"/>
+              <w:end w:w="120" w:type="dxa"/>
+            </w:tcMar>
           </w:tcPr>
           <w:p>
             <w:pPr>
-              <w:spacing w:before="80" w:after="80"/>
+              <w:spacing w:after="40" w:before="40"/>
             </w:pPr>
             <w:r>
               <w:rPr>
-                <w:b w:val="0"/>
-                <w:sz w:val="20"/>
+                <w:rFonts w:ascii="Arial" w:hAnsi="Arial"/>
+                <w:sz w:val="19"/>
               </w:rPr>
-              <w:t>Cancelar Turno</w:t>
-            </w:r>
-          </w:p>
-        </w:tc>
-        <w:tc>
-          <w:tcPr>
-            <w:tcW w:type="dxa" w:w="4392"/>
-            <w:vAlign w:val="center"/>
-            <w:shd w:fill="FFFFFF"/>
-            <w:tcBorders>
-              <w:top w:val="single" w:sz="4" w:color="D9D9D9"/>
-              <w:left w:val="single" w:sz="4" w:color="D9D9D9"/>
-              <w:bottom w:val="single" w:sz="4" w:color="D9D9D9"/>
-              <w:right w:val="single" w:sz="4" w:color="D9D9D9"/>
-            </w:tcBorders>
-          </w:tcPr>
-          <w:p>
-            <w:pPr>
-              <w:spacing w:before="80" w:after="80"/>
-            </w:pPr>
-            <w:r>
-              <w:rPr>
-                <w:b w:val="0"/>
-                <w:sz w:val="20"/>
-              </w:rPr>
-              <w:t>Cliente o Personal</w:t>
+              <w:t>Personal autenticado; cliente registrado.</w:t>
             </w:r>
           </w:p>
         </w:tc>
@@ -827,74 +2276,1161 @@
       <w:tr>
         <w:tc>
           <w:tcPr>
-            <w:tcW w:type="dxa" w:w="936"/>
+            <w:tcW w:type="dxa" w:w="2376"/>
             <w:vAlign w:val="center"/>
-            <w:shd w:fill="FFFFFF"/>
-            <w:tcBorders>
-              <w:top w:val="single" w:sz="4" w:color="D9D9D9"/>
-              <w:left w:val="single" w:sz="4" w:color="D9D9D9"/>
-              <w:bottom w:val="single" w:sz="4" w:color="D9D9D9"/>
-              <w:right w:val="single" w:sz="4" w:color="D9D9D9"/>
-            </w:tcBorders>
+            <w:tcMar>
+              <w:top w:w="100" w:type="dxa"/>
+              <w:start w:w="120" w:type="dxa"/>
+              <w:bottom w:w="100" w:type="dxa"/>
+              <w:end w:w="120" w:type="dxa"/>
+            </w:tcMar>
+            <w:shd w:fill="EAF2F8"/>
           </w:tcPr>
           <w:p>
             <w:pPr>
-              <w:spacing w:before="80" w:after="80"/>
+              <w:spacing w:after="40" w:before="40"/>
             </w:pPr>
             <w:r>
               <w:rPr>
-                <w:b w:val="0"/>
-                <w:sz w:val="20"/>
+                <w:rFonts w:ascii="Arial" w:hAnsi="Arial"/>
+                <w:sz w:val="19"/>
               </w:rPr>
-              <w:t>CU-06</w:t>
+              <w:t>Reglas relacionadas</w:t>
             </w:r>
           </w:p>
         </w:tc>
         <w:tc>
           <w:tcPr>
-            <w:tcW w:type="dxa" w:w="4608"/>
+            <w:tcW w:type="dxa" w:w="7704"/>
             <w:vAlign w:val="center"/>
-            <w:shd w:fill="FFFFFF"/>
-            <w:tcBorders>
-              <w:top w:val="single" w:sz="4" w:color="D9D9D9"/>
-              <w:left w:val="single" w:sz="4" w:color="D9D9D9"/>
-              <w:bottom w:val="single" w:sz="4" w:color="D9D9D9"/>
-              <w:right w:val="single" w:sz="4" w:color="D9D9D9"/>
-            </w:tcBorders>
+            <w:tcMar>
+              <w:top w:w="100" w:type="dxa"/>
+              <w:start w:w="120" w:type="dxa"/>
+              <w:bottom w:w="100" w:type="dxa"/>
+              <w:end w:w="120" w:type="dxa"/>
+            </w:tcMar>
+            <w:shd w:fill="EAF2F8"/>
           </w:tcPr>
           <w:p>
             <w:pPr>
-              <w:spacing w:before="80" w:after="80"/>
+              <w:spacing w:after="40" w:before="40"/>
             </w:pPr>
             <w:r>
               <w:rPr>
-                <w:b w:val="0"/>
-                <w:sz w:val="20"/>
+                <w:rFonts w:ascii="Arial" w:hAnsi="Arial"/>
+                <w:sz w:val="19"/>
               </w:rPr>
-              <w:t>Gestionar Servicios</w:t>
+              <w:t>RN-01, RN-02, RN-03 y RN-11.</w:t>
+            </w:r>
+          </w:p>
+        </w:tc>
+      </w:tr>
+    </w:tbl>
+    <w:p/>
+    <w:p>
+      <w:pPr>
+        <w:pStyle w:val="Heading2"/>
+      </w:pPr>
+      <w:r>
+        <w:t>Flujo principal</w:t>
+      </w:r>
+    </w:p>
+    <w:p>
+      <w:pPr>
+        <w:spacing w:after="60"/>
+        <w:ind w:left="360" w:hanging="360"/>
+      </w:pPr>
+      <w:r>
+        <w:t>1.  El actor busca y selecciona al cliente.</w:t>
+      </w:r>
+    </w:p>
+    <w:p>
+      <w:pPr>
+        <w:spacing w:after="60"/>
+        <w:ind w:left="360" w:hanging="360"/>
+      </w:pPr>
+      <w:r>
+        <w:t>2.  Selecciona el servicio, la fecha y la hora.</w:t>
+      </w:r>
+    </w:p>
+    <w:p>
+      <w:pPr>
+        <w:spacing w:after="60"/>
+        <w:ind w:left="360" w:hanging="360"/>
+      </w:pPr>
+      <w:r>
+        <w:t>3.  El sistema valida cliente, servicio, fecha y disponibilidad.</w:t>
+      </w:r>
+    </w:p>
+    <w:p>
+      <w:pPr>
+        <w:spacing w:after="60"/>
+        <w:ind w:left="360" w:hanging="360"/>
+      </w:pPr>
+      <w:r>
+        <w:t>4.  El sistema registra el turno y confirma la creación.</w:t>
+      </w:r>
+    </w:p>
+    <w:p>
+      <w:pPr>
+        <w:pStyle w:val="Heading2"/>
+      </w:pPr>
+      <w:r>
+        <w:t>Flujos alternativos</w:t>
+      </w:r>
+    </w:p>
+    <w:p>
+      <w:pPr>
+        <w:pStyle w:val="ListBullet"/>
+        <w:spacing w:after="80"/>
+      </w:pPr>
+      <w:r>
+        <w:rPr>
+          <w:b/>
+        </w:rPr>
+        <w:t xml:space="preserve">Cliente inexistente: </w:t>
+      </w:r>
+      <w:r>
+        <w:t>el sistema rechaza la operación y permite registrarlo por separado.</w:t>
+      </w:r>
+    </w:p>
+    <w:p>
+      <w:pPr>
+        <w:pStyle w:val="ListBullet"/>
+        <w:spacing w:after="80"/>
+      </w:pPr>
+      <w:r>
+        <w:rPr>
+          <w:b/>
+        </w:rPr>
+        <w:t xml:space="preserve">Horario ocupado: </w:t>
+      </w:r>
+      <w:r>
+        <w:t>el sistema informa el conflicto.</w:t>
+      </w:r>
+    </w:p>
+    <w:p>
+      <w:pPr>
+        <w:pStyle w:val="ListBullet"/>
+        <w:spacing w:after="80"/>
+      </w:pPr>
+      <w:r>
+        <w:rPr>
+          <w:b/>
+        </w:rPr>
+        <w:t xml:space="preserve">Servicio inválido: </w:t>
+      </w:r>
+      <w:r>
+        <w:t>el sistema rechaza la operación.</w:t>
+      </w:r>
+    </w:p>
+    <w:p>
+      <w:pPr>
+        <w:pStyle w:val="ListBullet"/>
+        <w:spacing w:after="80"/>
+      </w:pPr>
+      <w:r>
+        <w:rPr>
+          <w:b/>
+        </w:rPr>
+        <w:t xml:space="preserve">Fecha pasada: </w:t>
+      </w:r>
+      <w:r>
+        <w:t>el sistema exige una fecha futura.</w:t>
+      </w:r>
+    </w:p>
+    <w:p>
+      <w:pPr>
+        <w:pStyle w:val="Heading2"/>
+      </w:pPr>
+      <w:r>
+        <w:t>Postcondiciones</w:t>
+      </w:r>
+    </w:p>
+    <w:p>
+      <w:pPr>
+        <w:pStyle w:val="ListBullet"/>
+        <w:spacing w:after="60"/>
+      </w:pPr>
+      <w:r>
+        <w:t>El turno queda confirmado para el cliente seleccionado.</w:t>
+      </w:r>
+    </w:p>
+    <w:p>
+      <w:pPr>
+        <w:pStyle w:val="ListBullet"/>
+        <w:spacing w:after="60"/>
+      </w:pPr>
+      <w:r>
+        <w:t>El horario queda ocupado.</w:t>
+      </w:r>
+    </w:p>
+    <w:p>
+      <w:r>
+        <w:br w:type="page"/>
+      </w:r>
+    </w:p>
+    <w:p>
+      <w:pPr>
+        <w:pStyle w:val="Heading1"/>
+      </w:pPr>
+      <w:r>
+        <w:t>CU-04 Modificar Turno</w:t>
+      </w:r>
+    </w:p>
+    <w:tbl>
+      <w:tblPr>
+        <w:tblStyle w:val="TableGrid"/>
+        <w:tblW w:type="auto" w:w="0"/>
+        <w:jc w:val="center"/>
+        <w:tblLook w:firstColumn="1" w:firstRow="1" w:lastColumn="0" w:lastRow="0" w:noHBand="0" w:noVBand="1" w:val="04A0"/>
+      </w:tblPr>
+      <w:tblGrid>
+        <w:gridCol w:w="5040"/>
+        <w:gridCol w:w="5040"/>
+      </w:tblGrid>
+      <w:tr>
+        <w:trPr>
+          <w:tblHeader w:val="true"/>
+        </w:trPr>
+        <w:tc>
+          <w:tcPr>
+            <w:tcW w:type="dxa" w:w="2376"/>
+            <w:vAlign w:val="center"/>
+            <w:tcMar>
+              <w:top w:w="100" w:type="dxa"/>
+              <w:start w:w="120" w:type="dxa"/>
+              <w:bottom w:w="100" w:type="dxa"/>
+              <w:end w:w="120" w:type="dxa"/>
+            </w:tcMar>
+            <w:shd w:fill="1F4E78"/>
+          </w:tcPr>
+          <w:p>
+            <w:pPr>
+              <w:spacing w:after="40" w:before="40"/>
+            </w:pPr>
+            <w:r>
+              <w:rPr>
+                <w:rFonts w:ascii="Arial" w:hAnsi="Arial"/>
+                <w:b/>
+                <w:color w:val="FFFFFF"/>
+                <w:sz w:val="19"/>
+              </w:rPr>
+              <w:t>Campo</w:t>
             </w:r>
           </w:p>
         </w:tc>
         <w:tc>
           <w:tcPr>
-            <w:tcW w:type="dxa" w:w="4392"/>
+            <w:tcW w:type="dxa" w:w="7704"/>
             <w:vAlign w:val="center"/>
-            <w:shd w:fill="FFFFFF"/>
-            <w:tcBorders>
-              <w:top w:val="single" w:sz="4" w:color="D9D9D9"/>
-              <w:left w:val="single" w:sz="4" w:color="D9D9D9"/>
-              <w:bottom w:val="single" w:sz="4" w:color="D9D9D9"/>
-              <w:right w:val="single" w:sz="4" w:color="D9D9D9"/>
-            </w:tcBorders>
+            <w:tcMar>
+              <w:top w:w="100" w:type="dxa"/>
+              <w:start w:w="120" w:type="dxa"/>
+              <w:bottom w:w="100" w:type="dxa"/>
+              <w:end w:w="120" w:type="dxa"/>
+            </w:tcMar>
+            <w:shd w:fill="1F4E78"/>
           </w:tcPr>
           <w:p>
             <w:pPr>
-              <w:spacing w:before="80" w:after="80"/>
+              <w:spacing w:after="40" w:before="40"/>
             </w:pPr>
             <w:r>
               <w:rPr>
-                <w:b w:val="0"/>
-                <w:sz w:val="20"/>
+                <w:rFonts w:ascii="Arial" w:hAnsi="Arial"/>
+                <w:b/>
+                <w:color w:val="FFFFFF"/>
+                <w:sz w:val="19"/>
+              </w:rPr>
+              <w:t>Definición</w:t>
+            </w:r>
+          </w:p>
+        </w:tc>
+      </w:tr>
+      <w:tr>
+        <w:tc>
+          <w:tcPr>
+            <w:tcW w:type="dxa" w:w="2376"/>
+            <w:vAlign w:val="center"/>
+            <w:tcMar>
+              <w:top w:w="100" w:type="dxa"/>
+              <w:start w:w="120" w:type="dxa"/>
+              <w:bottom w:w="100" w:type="dxa"/>
+              <w:end w:w="120" w:type="dxa"/>
+            </w:tcMar>
+          </w:tcPr>
+          <w:p>
+            <w:pPr>
+              <w:spacing w:after="40" w:before="40"/>
+            </w:pPr>
+            <w:r>
+              <w:rPr>
+                <w:rFonts w:ascii="Arial" w:hAnsi="Arial"/>
+                <w:sz w:val="19"/>
+              </w:rPr>
+              <w:t>Actor principal</w:t>
+            </w:r>
+          </w:p>
+        </w:tc>
+        <w:tc>
+          <w:tcPr>
+            <w:tcW w:type="dxa" w:w="7704"/>
+            <w:vAlign w:val="center"/>
+            <w:tcMar>
+              <w:top w:w="100" w:type="dxa"/>
+              <w:start w:w="120" w:type="dxa"/>
+              <w:bottom w:w="100" w:type="dxa"/>
+              <w:end w:w="120" w:type="dxa"/>
+            </w:tcMar>
+          </w:tcPr>
+          <w:p>
+            <w:pPr>
+              <w:spacing w:after="40" w:before="40"/>
+            </w:pPr>
+            <w:r>
+              <w:rPr>
+                <w:rFonts w:ascii="Arial" w:hAnsi="Arial"/>
+                <w:sz w:val="19"/>
+              </w:rPr>
+              <w:t>Cliente, Empleado o Administrador</w:t>
+            </w:r>
+          </w:p>
+        </w:tc>
+      </w:tr>
+      <w:tr>
+        <w:tc>
+          <w:tcPr>
+            <w:tcW w:type="dxa" w:w="2376"/>
+            <w:vAlign w:val="center"/>
+            <w:tcMar>
+              <w:top w:w="100" w:type="dxa"/>
+              <w:start w:w="120" w:type="dxa"/>
+              <w:bottom w:w="100" w:type="dxa"/>
+              <w:end w:w="120" w:type="dxa"/>
+            </w:tcMar>
+            <w:shd w:fill="EAF2F8"/>
+          </w:tcPr>
+          <w:p>
+            <w:pPr>
+              <w:spacing w:after="40" w:before="40"/>
+            </w:pPr>
+            <w:r>
+              <w:rPr>
+                <w:rFonts w:ascii="Arial" w:hAnsi="Arial"/>
+                <w:sz w:val="19"/>
+              </w:rPr>
+              <w:t>Objetivo</w:t>
+            </w:r>
+          </w:p>
+        </w:tc>
+        <w:tc>
+          <w:tcPr>
+            <w:tcW w:type="dxa" w:w="7704"/>
+            <w:vAlign w:val="center"/>
+            <w:tcMar>
+              <w:top w:w="100" w:type="dxa"/>
+              <w:start w:w="120" w:type="dxa"/>
+              <w:bottom w:w="100" w:type="dxa"/>
+              <w:end w:w="120" w:type="dxa"/>
+            </w:tcMar>
+            <w:shd w:fill="EAF2F8"/>
+          </w:tcPr>
+          <w:p>
+            <w:pPr>
+              <w:spacing w:after="40" w:before="40"/>
+            </w:pPr>
+            <w:r>
+              <w:rPr>
+                <w:rFonts w:ascii="Arial" w:hAnsi="Arial"/>
+                <w:sz w:val="19"/>
+              </w:rPr>
+              <w:t>Cambiar la fecha, hora o servicio de un turno existente.</w:t>
+            </w:r>
+          </w:p>
+        </w:tc>
+      </w:tr>
+      <w:tr>
+        <w:tc>
+          <w:tcPr>
+            <w:tcW w:type="dxa" w:w="2376"/>
+            <w:vAlign w:val="center"/>
+            <w:tcMar>
+              <w:top w:w="100" w:type="dxa"/>
+              <w:start w:w="120" w:type="dxa"/>
+              <w:bottom w:w="100" w:type="dxa"/>
+              <w:end w:w="120" w:type="dxa"/>
+            </w:tcMar>
+          </w:tcPr>
+          <w:p>
+            <w:pPr>
+              <w:spacing w:after="40" w:before="40"/>
+            </w:pPr>
+            <w:r>
+              <w:rPr>
+                <w:rFonts w:ascii="Arial" w:hAnsi="Arial"/>
+                <w:sz w:val="19"/>
+              </w:rPr>
+              <w:t>Precondiciones</w:t>
+            </w:r>
+          </w:p>
+        </w:tc>
+        <w:tc>
+          <w:tcPr>
+            <w:tcW w:type="dxa" w:w="7704"/>
+            <w:vAlign w:val="center"/>
+            <w:tcMar>
+              <w:top w:w="100" w:type="dxa"/>
+              <w:start w:w="120" w:type="dxa"/>
+              <w:bottom w:w="100" w:type="dxa"/>
+              <w:end w:w="120" w:type="dxa"/>
+            </w:tcMar>
+          </w:tcPr>
+          <w:p>
+            <w:pPr>
+              <w:spacing w:after="40" w:before="40"/>
+            </w:pPr>
+            <w:r>
+              <w:rPr>
+                <w:rFonts w:ascii="Arial" w:hAnsi="Arial"/>
+                <w:sz w:val="19"/>
+              </w:rPr>
+              <w:t>Turno activo y futuro; actor autenticado. El cliente solo accede a un turno propio.</w:t>
+            </w:r>
+          </w:p>
+        </w:tc>
+      </w:tr>
+      <w:tr>
+        <w:tc>
+          <w:tcPr>
+            <w:tcW w:type="dxa" w:w="2376"/>
+            <w:vAlign w:val="center"/>
+            <w:tcMar>
+              <w:top w:w="100" w:type="dxa"/>
+              <w:start w:w="120" w:type="dxa"/>
+              <w:bottom w:w="100" w:type="dxa"/>
+              <w:end w:w="120" w:type="dxa"/>
+            </w:tcMar>
+            <w:shd w:fill="EAF2F8"/>
+          </w:tcPr>
+          <w:p>
+            <w:pPr>
+              <w:spacing w:after="40" w:before="40"/>
+            </w:pPr>
+            <w:r>
+              <w:rPr>
+                <w:rFonts w:ascii="Arial" w:hAnsi="Arial"/>
+                <w:sz w:val="19"/>
+              </w:rPr>
+              <w:t>Reglas relacionadas</w:t>
+            </w:r>
+          </w:p>
+        </w:tc>
+        <w:tc>
+          <w:tcPr>
+            <w:tcW w:type="dxa" w:w="7704"/>
+            <w:vAlign w:val="center"/>
+            <w:tcMar>
+              <w:top w:w="100" w:type="dxa"/>
+              <w:start w:w="120" w:type="dxa"/>
+              <w:bottom w:w="100" w:type="dxa"/>
+              <w:end w:w="120" w:type="dxa"/>
+            </w:tcMar>
+            <w:shd w:fill="EAF2F8"/>
+          </w:tcPr>
+          <w:p>
+            <w:pPr>
+              <w:spacing w:after="40" w:before="40"/>
+            </w:pPr>
+            <w:r>
+              <w:rPr>
+                <w:rFonts w:ascii="Arial" w:hAnsi="Arial"/>
+                <w:sz w:val="19"/>
+              </w:rPr>
+              <w:t>RN-01, RN-02, RN-06, RN-10 y RN-11.</w:t>
+            </w:r>
+          </w:p>
+        </w:tc>
+      </w:tr>
+    </w:tbl>
+    <w:p/>
+    <w:p>
+      <w:pPr>
+        <w:pStyle w:val="Heading2"/>
+      </w:pPr>
+      <w:r>
+        <w:t>Flujo principal</w:t>
+      </w:r>
+    </w:p>
+    <w:p>
+      <w:pPr>
+        <w:spacing w:after="60"/>
+        <w:ind w:left="360" w:hanging="360"/>
+      </w:pPr>
+      <w:r>
+        <w:t>1.  El actor selecciona un turno permitido.</w:t>
+      </w:r>
+    </w:p>
+    <w:p>
+      <w:pPr>
+        <w:spacing w:after="60"/>
+        <w:ind w:left="360" w:hanging="360"/>
+      </w:pPr>
+      <w:r>
+        <w:t>2.  Indica la nueva fecha, hora o servicio.</w:t>
+      </w:r>
+    </w:p>
+    <w:p>
+      <w:pPr>
+        <w:spacing w:after="60"/>
+        <w:ind w:left="360" w:hanging="360"/>
+      </w:pPr>
+      <w:r>
+        <w:t>3.  El sistema verifica permisos, estado, servicio y disponibilidad.</w:t>
+      </w:r>
+    </w:p>
+    <w:p>
+      <w:pPr>
+        <w:spacing w:after="60"/>
+        <w:ind w:left="360" w:hanging="360"/>
+      </w:pPr>
+      <w:r>
+        <w:t>4.  El sistema actualiza el turno y confirma el cambio.</w:t>
+      </w:r>
+    </w:p>
+    <w:p>
+      <w:pPr>
+        <w:pStyle w:val="Heading2"/>
+      </w:pPr>
+      <w:r>
+        <w:t>Flujos alternativos</w:t>
+      </w:r>
+    </w:p>
+    <w:p>
+      <w:pPr>
+        <w:pStyle w:val="ListBullet"/>
+        <w:spacing w:after="80"/>
+      </w:pPr>
+      <w:r>
+        <w:rPr>
+          <w:b/>
+        </w:rPr>
+        <w:t xml:space="preserve">Turno ajeno: </w:t>
+      </w:r>
+      <w:r>
+        <w:t>si el actor es cliente, el sistema deniega el acceso.</w:t>
+      </w:r>
+    </w:p>
+    <w:p>
+      <w:pPr>
+        <w:pStyle w:val="ListBullet"/>
+        <w:spacing w:after="80"/>
+      </w:pPr>
+      <w:r>
+        <w:rPr>
+          <w:b/>
+        </w:rPr>
+        <w:t xml:space="preserve">Turno vencido o cancelado: </w:t>
+      </w:r>
+      <w:r>
+        <w:t>el sistema no permite modificarlo.</w:t>
+      </w:r>
+    </w:p>
+    <w:p>
+      <w:pPr>
+        <w:pStyle w:val="ListBullet"/>
+        <w:spacing w:after="80"/>
+      </w:pPr>
+      <w:r>
+        <w:rPr>
+          <w:b/>
+        </w:rPr>
+        <w:t xml:space="preserve">Horario ocupado: </w:t>
+      </w:r>
+      <w:r>
+        <w:t>el turno original se mantiene sin cambios.</w:t>
+      </w:r>
+    </w:p>
+    <w:p>
+      <w:pPr>
+        <w:pStyle w:val="ListBullet"/>
+        <w:spacing w:after="80"/>
+      </w:pPr>
+      <w:r>
+        <w:rPr>
+          <w:b/>
+        </w:rPr>
+        <w:t xml:space="preserve">Operación cancelada: </w:t>
+      </w:r>
+      <w:r>
+        <w:t>el turno original se conserva.</w:t>
+      </w:r>
+    </w:p>
+    <w:p>
+      <w:pPr>
+        <w:pStyle w:val="Heading2"/>
+      </w:pPr>
+      <w:r>
+        <w:t>Postcondiciones</w:t>
+      </w:r>
+    </w:p>
+    <w:p>
+      <w:pPr>
+        <w:pStyle w:val="ListBullet"/>
+        <w:spacing w:after="60"/>
+      </w:pPr>
+      <w:r>
+        <w:t>El turno queda actualizado.</w:t>
+      </w:r>
+    </w:p>
+    <w:p>
+      <w:pPr>
+        <w:pStyle w:val="ListBullet"/>
+        <w:spacing w:after="60"/>
+      </w:pPr>
+      <w:r>
+        <w:t>El horario anterior se libera y el nuevo queda ocupado.</w:t>
+      </w:r>
+    </w:p>
+    <w:p>
+      <w:r>
+        <w:br w:type="page"/>
+      </w:r>
+    </w:p>
+    <w:p>
+      <w:pPr>
+        <w:pStyle w:val="Heading1"/>
+      </w:pPr>
+      <w:r>
+        <w:t>CU-05 Cancelar Turno</w:t>
+      </w:r>
+    </w:p>
+    <w:tbl>
+      <w:tblPr>
+        <w:tblStyle w:val="TableGrid"/>
+        <w:tblW w:type="auto" w:w="0"/>
+        <w:jc w:val="center"/>
+        <w:tblLook w:firstColumn="1" w:firstRow="1" w:lastColumn="0" w:lastRow="0" w:noHBand="0" w:noVBand="1" w:val="04A0"/>
+      </w:tblPr>
+      <w:tblGrid>
+        <w:gridCol w:w="5040"/>
+        <w:gridCol w:w="5040"/>
+      </w:tblGrid>
+      <w:tr>
+        <w:trPr>
+          <w:tblHeader w:val="true"/>
+        </w:trPr>
+        <w:tc>
+          <w:tcPr>
+            <w:tcW w:type="dxa" w:w="2376"/>
+            <w:vAlign w:val="center"/>
+            <w:tcMar>
+              <w:top w:w="100" w:type="dxa"/>
+              <w:start w:w="120" w:type="dxa"/>
+              <w:bottom w:w="100" w:type="dxa"/>
+              <w:end w:w="120" w:type="dxa"/>
+            </w:tcMar>
+            <w:shd w:fill="1F4E78"/>
+          </w:tcPr>
+          <w:p>
+            <w:pPr>
+              <w:spacing w:after="40" w:before="40"/>
+            </w:pPr>
+            <w:r>
+              <w:rPr>
+                <w:rFonts w:ascii="Arial" w:hAnsi="Arial"/>
+                <w:b/>
+                <w:color w:val="FFFFFF"/>
+                <w:sz w:val="19"/>
+              </w:rPr>
+              <w:t>Campo</w:t>
+            </w:r>
+          </w:p>
+        </w:tc>
+        <w:tc>
+          <w:tcPr>
+            <w:tcW w:type="dxa" w:w="7704"/>
+            <w:vAlign w:val="center"/>
+            <w:tcMar>
+              <w:top w:w="100" w:type="dxa"/>
+              <w:start w:w="120" w:type="dxa"/>
+              <w:bottom w:w="100" w:type="dxa"/>
+              <w:end w:w="120" w:type="dxa"/>
+            </w:tcMar>
+            <w:shd w:fill="1F4E78"/>
+          </w:tcPr>
+          <w:p>
+            <w:pPr>
+              <w:spacing w:after="40" w:before="40"/>
+            </w:pPr>
+            <w:r>
+              <w:rPr>
+                <w:rFonts w:ascii="Arial" w:hAnsi="Arial"/>
+                <w:b/>
+                <w:color w:val="FFFFFF"/>
+                <w:sz w:val="19"/>
+              </w:rPr>
+              <w:t>Definición</w:t>
+            </w:r>
+          </w:p>
+        </w:tc>
+      </w:tr>
+      <w:tr>
+        <w:tc>
+          <w:tcPr>
+            <w:tcW w:type="dxa" w:w="2376"/>
+            <w:vAlign w:val="center"/>
+            <w:tcMar>
+              <w:top w:w="100" w:type="dxa"/>
+              <w:start w:w="120" w:type="dxa"/>
+              <w:bottom w:w="100" w:type="dxa"/>
+              <w:end w:w="120" w:type="dxa"/>
+            </w:tcMar>
+          </w:tcPr>
+          <w:p>
+            <w:pPr>
+              <w:spacing w:after="40" w:before="40"/>
+            </w:pPr>
+            <w:r>
+              <w:rPr>
+                <w:rFonts w:ascii="Arial" w:hAnsi="Arial"/>
+                <w:sz w:val="19"/>
+              </w:rPr>
+              <w:t>Actor principal</w:t>
+            </w:r>
+          </w:p>
+        </w:tc>
+        <w:tc>
+          <w:tcPr>
+            <w:tcW w:type="dxa" w:w="7704"/>
+            <w:vAlign w:val="center"/>
+            <w:tcMar>
+              <w:top w:w="100" w:type="dxa"/>
+              <w:start w:w="120" w:type="dxa"/>
+              <w:bottom w:w="100" w:type="dxa"/>
+              <w:end w:w="120" w:type="dxa"/>
+            </w:tcMar>
+          </w:tcPr>
+          <w:p>
+            <w:pPr>
+              <w:spacing w:after="40" w:before="40"/>
+            </w:pPr>
+            <w:r>
+              <w:rPr>
+                <w:rFonts w:ascii="Arial" w:hAnsi="Arial"/>
+                <w:sz w:val="19"/>
+              </w:rPr>
+              <w:t>Cliente, Empleado o Administrador</w:t>
+            </w:r>
+          </w:p>
+        </w:tc>
+      </w:tr>
+      <w:tr>
+        <w:tc>
+          <w:tcPr>
+            <w:tcW w:type="dxa" w:w="2376"/>
+            <w:vAlign w:val="center"/>
+            <w:tcMar>
+              <w:top w:w="100" w:type="dxa"/>
+              <w:start w:w="120" w:type="dxa"/>
+              <w:bottom w:w="100" w:type="dxa"/>
+              <w:end w:w="120" w:type="dxa"/>
+            </w:tcMar>
+            <w:shd w:fill="EAF2F8"/>
+          </w:tcPr>
+          <w:p>
+            <w:pPr>
+              <w:spacing w:after="40" w:before="40"/>
+            </w:pPr>
+            <w:r>
+              <w:rPr>
+                <w:rFonts w:ascii="Arial" w:hAnsi="Arial"/>
+                <w:sz w:val="19"/>
+              </w:rPr>
+              <w:t>Objetivo</w:t>
+            </w:r>
+          </w:p>
+        </w:tc>
+        <w:tc>
+          <w:tcPr>
+            <w:tcW w:type="dxa" w:w="7704"/>
+            <w:vAlign w:val="center"/>
+            <w:tcMar>
+              <w:top w:w="100" w:type="dxa"/>
+              <w:start w:w="120" w:type="dxa"/>
+              <w:bottom w:w="100" w:type="dxa"/>
+              <w:end w:w="120" w:type="dxa"/>
+            </w:tcMar>
+            <w:shd w:fill="EAF2F8"/>
+          </w:tcPr>
+          <w:p>
+            <w:pPr>
+              <w:spacing w:after="40" w:before="40"/>
+            </w:pPr>
+            <w:r>
+              <w:rPr>
+                <w:rFonts w:ascii="Arial" w:hAnsi="Arial"/>
+                <w:sz w:val="19"/>
+              </w:rPr>
+              <w:t>Cancelar un turno y liberar su horario sin borrar su historial.</w:t>
+            </w:r>
+          </w:p>
+        </w:tc>
+      </w:tr>
+      <w:tr>
+        <w:tc>
+          <w:tcPr>
+            <w:tcW w:type="dxa" w:w="2376"/>
+            <w:vAlign w:val="center"/>
+            <w:tcMar>
+              <w:top w:w="100" w:type="dxa"/>
+              <w:start w:w="120" w:type="dxa"/>
+              <w:bottom w:w="100" w:type="dxa"/>
+              <w:end w:w="120" w:type="dxa"/>
+            </w:tcMar>
+          </w:tcPr>
+          <w:p>
+            <w:pPr>
+              <w:spacing w:after="40" w:before="40"/>
+            </w:pPr>
+            <w:r>
+              <w:rPr>
+                <w:rFonts w:ascii="Arial" w:hAnsi="Arial"/>
+                <w:sz w:val="19"/>
+              </w:rPr>
+              <w:t>Precondiciones</w:t>
+            </w:r>
+          </w:p>
+        </w:tc>
+        <w:tc>
+          <w:tcPr>
+            <w:tcW w:type="dxa" w:w="7704"/>
+            <w:vAlign w:val="center"/>
+            <w:tcMar>
+              <w:top w:w="100" w:type="dxa"/>
+              <w:start w:w="120" w:type="dxa"/>
+              <w:bottom w:w="100" w:type="dxa"/>
+              <w:end w:w="120" w:type="dxa"/>
+            </w:tcMar>
+          </w:tcPr>
+          <w:p>
+            <w:pPr>
+              <w:spacing w:after="40" w:before="40"/>
+            </w:pPr>
+            <w:r>
+              <w:rPr>
+                <w:rFonts w:ascii="Arial" w:hAnsi="Arial"/>
+                <w:sz w:val="19"/>
+              </w:rPr>
+              <w:t>Turno activo y futuro; actor autenticado. El cliente solo accede a un turno propio.</w:t>
+            </w:r>
+          </w:p>
+        </w:tc>
+      </w:tr>
+      <w:tr>
+        <w:tc>
+          <w:tcPr>
+            <w:tcW w:type="dxa" w:w="2376"/>
+            <w:vAlign w:val="center"/>
+            <w:tcMar>
+              <w:top w:w="100" w:type="dxa"/>
+              <w:start w:w="120" w:type="dxa"/>
+              <w:bottom w:w="100" w:type="dxa"/>
+              <w:end w:w="120" w:type="dxa"/>
+            </w:tcMar>
+            <w:shd w:fill="EAF2F8"/>
+          </w:tcPr>
+          <w:p>
+            <w:pPr>
+              <w:spacing w:after="40" w:before="40"/>
+            </w:pPr>
+            <w:r>
+              <w:rPr>
+                <w:rFonts w:ascii="Arial" w:hAnsi="Arial"/>
+                <w:sz w:val="19"/>
+              </w:rPr>
+              <w:t>Reglas relacionadas</w:t>
+            </w:r>
+          </w:p>
+        </w:tc>
+        <w:tc>
+          <w:tcPr>
+            <w:tcW w:type="dxa" w:w="7704"/>
+            <w:vAlign w:val="center"/>
+            <w:tcMar>
+              <w:top w:w="100" w:type="dxa"/>
+              <w:start w:w="120" w:type="dxa"/>
+              <w:bottom w:w="100" w:type="dxa"/>
+              <w:end w:w="120" w:type="dxa"/>
+            </w:tcMar>
+            <w:shd w:fill="EAF2F8"/>
+          </w:tcPr>
+          <w:p>
+            <w:pPr>
+              <w:spacing w:after="40" w:before="40"/>
+            </w:pPr>
+            <w:r>
+              <w:rPr>
+                <w:rFonts w:ascii="Arial" w:hAnsi="Arial"/>
+                <w:sz w:val="19"/>
+              </w:rPr>
+              <w:t>RN-06 y RN-10.</w:t>
+            </w:r>
+          </w:p>
+        </w:tc>
+      </w:tr>
+    </w:tbl>
+    <w:p/>
+    <w:p>
+      <w:pPr>
+        <w:pStyle w:val="Heading2"/>
+      </w:pPr>
+      <w:r>
+        <w:t>Flujo principal</w:t>
+      </w:r>
+    </w:p>
+    <w:p>
+      <w:pPr>
+        <w:spacing w:after="60"/>
+        <w:ind w:left="360" w:hanging="360"/>
+      </w:pPr>
+      <w:r>
+        <w:t>1.  El actor selecciona el turno y confirma la cancelación.</w:t>
+      </w:r>
+    </w:p>
+    <w:p>
+      <w:pPr>
+        <w:spacing w:after="60"/>
+        <w:ind w:left="360" w:hanging="360"/>
+      </w:pPr>
+      <w:r>
+        <w:t>2.  El sistema verifica existencia, permisos, estado y fecha.</w:t>
+      </w:r>
+    </w:p>
+    <w:p>
+      <w:pPr>
+        <w:spacing w:after="60"/>
+        <w:ind w:left="360" w:hanging="360"/>
+      </w:pPr>
+      <w:r>
+        <w:t>3.  El sistema cambia el estado a Cancelado.</w:t>
+      </w:r>
+    </w:p>
+    <w:p>
+      <w:pPr>
+        <w:spacing w:after="60"/>
+        <w:ind w:left="360" w:hanging="360"/>
+      </w:pPr>
+      <w:r>
+        <w:t>4.  El sistema confirma la operación y libera el horario.</w:t>
+      </w:r>
+    </w:p>
+    <w:p>
+      <w:pPr>
+        <w:pStyle w:val="Heading2"/>
+      </w:pPr>
+      <w:r>
+        <w:t>Flujos alternativos</w:t>
+      </w:r>
+    </w:p>
+    <w:p>
+      <w:pPr>
+        <w:pStyle w:val="ListBullet"/>
+        <w:spacing w:after="80"/>
+      </w:pPr>
+      <w:r>
+        <w:rPr>
+          <w:b/>
+        </w:rPr>
+        <w:t xml:space="preserve">Turno ajeno: </w:t>
+      </w:r>
+      <w:r>
+        <w:t>si el actor es cliente, el sistema deniega el acceso.</w:t>
+      </w:r>
+    </w:p>
+    <w:p>
+      <w:pPr>
+        <w:pStyle w:val="ListBullet"/>
+        <w:spacing w:after="80"/>
+      </w:pPr>
+      <w:r>
+        <w:rPr>
+          <w:b/>
+        </w:rPr>
+        <w:t xml:space="preserve">Turno vencido o no activo: </w:t>
+      </w:r>
+      <w:r>
+        <w:t>el sistema no permite cancelarlo.</w:t>
+      </w:r>
+    </w:p>
+    <w:p>
+      <w:pPr>
+        <w:pStyle w:val="ListBullet"/>
+        <w:spacing w:after="80"/>
+      </w:pPr>
+      <w:r>
+        <w:rPr>
+          <w:b/>
+        </w:rPr>
+        <w:t xml:space="preserve">Cancelación no confirmada: </w:t>
+      </w:r>
+      <w:r>
+        <w:t>no se realiza ninguna petición ni cambio.</w:t>
+      </w:r>
+    </w:p>
+    <w:p>
+      <w:pPr>
+        <w:pStyle w:val="Heading2"/>
+      </w:pPr>
+      <w:r>
+        <w:t>Postcondiciones</w:t>
+      </w:r>
+    </w:p>
+    <w:p>
+      <w:pPr>
+        <w:pStyle w:val="ListBullet"/>
+        <w:spacing w:after="60"/>
+      </w:pPr>
+      <w:r>
+        <w:t>El turno permanece registrado con estado Cancelado.</w:t>
+      </w:r>
+    </w:p>
+    <w:p>
+      <w:pPr>
+        <w:pStyle w:val="ListBullet"/>
+        <w:spacing w:after="60"/>
+      </w:pPr>
+      <w:r>
+        <w:t>El horario vuelve a estar disponible.</w:t>
+      </w:r>
+    </w:p>
+    <w:p>
+      <w:r>
+        <w:br w:type="page"/>
+      </w:r>
+    </w:p>
+    <w:p>
+      <w:pPr>
+        <w:pStyle w:val="Heading1"/>
+      </w:pPr>
+      <w:r>
+        <w:t>CU-06 Gestionar Servicios</w:t>
+      </w:r>
+    </w:p>
+    <w:tbl>
+      <w:tblPr>
+        <w:tblStyle w:val="TableGrid"/>
+        <w:tblW w:type="auto" w:w="0"/>
+        <w:jc w:val="center"/>
+        <w:tblLook w:firstColumn="1" w:firstRow="1" w:lastColumn="0" w:lastRow="0" w:noHBand="0" w:noVBand="1" w:val="04A0"/>
+      </w:tblPr>
+      <w:tblGrid>
+        <w:gridCol w:w="5040"/>
+        <w:gridCol w:w="5040"/>
+      </w:tblGrid>
+      <w:tr>
+        <w:trPr>
+          <w:tblHeader w:val="true"/>
+        </w:trPr>
+        <w:tc>
+          <w:tcPr>
+            <w:tcW w:type="dxa" w:w="2376"/>
+            <w:vAlign w:val="center"/>
+            <w:tcMar>
+              <w:top w:w="100" w:type="dxa"/>
+              <w:start w:w="120" w:type="dxa"/>
+              <w:bottom w:w="100" w:type="dxa"/>
+              <w:end w:w="120" w:type="dxa"/>
+            </w:tcMar>
+            <w:shd w:fill="1F4E78"/>
+          </w:tcPr>
+          <w:p>
+            <w:pPr>
+              <w:spacing w:after="40" w:before="40"/>
+            </w:pPr>
+            <w:r>
+              <w:rPr>
+                <w:rFonts w:ascii="Arial" w:hAnsi="Arial"/>
+                <w:b/>
+                <w:color w:val="FFFFFF"/>
+                <w:sz w:val="19"/>
+              </w:rPr>
+              <w:t>Campo</w:t>
+            </w:r>
+          </w:p>
+        </w:tc>
+        <w:tc>
+          <w:tcPr>
+            <w:tcW w:type="dxa" w:w="7704"/>
+            <w:vAlign w:val="center"/>
+            <w:tcMar>
+              <w:top w:w="100" w:type="dxa"/>
+              <w:start w:w="120" w:type="dxa"/>
+              <w:bottom w:w="100" w:type="dxa"/>
+              <w:end w:w="120" w:type="dxa"/>
+            </w:tcMar>
+            <w:shd w:fill="1F4E78"/>
+          </w:tcPr>
+          <w:p>
+            <w:pPr>
+              <w:spacing w:after="40" w:before="40"/>
+            </w:pPr>
+            <w:r>
+              <w:rPr>
+                <w:rFonts w:ascii="Arial" w:hAnsi="Arial"/>
+                <w:b/>
+                <w:color w:val="FFFFFF"/>
+                <w:sz w:val="19"/>
+              </w:rPr>
+              <w:t>Definición</w:t>
+            </w:r>
+          </w:p>
+        </w:tc>
+      </w:tr>
+      <w:tr>
+        <w:tc>
+          <w:tcPr>
+            <w:tcW w:type="dxa" w:w="2376"/>
+            <w:vAlign w:val="center"/>
+            <w:tcMar>
+              <w:top w:w="100" w:type="dxa"/>
+              <w:start w:w="120" w:type="dxa"/>
+              <w:bottom w:w="100" w:type="dxa"/>
+              <w:end w:w="120" w:type="dxa"/>
+            </w:tcMar>
+          </w:tcPr>
+          <w:p>
+            <w:pPr>
+              <w:spacing w:after="40" w:before="40"/>
+            </w:pPr>
+            <w:r>
+              <w:rPr>
+                <w:rFonts w:ascii="Arial" w:hAnsi="Arial"/>
+                <w:sz w:val="19"/>
+              </w:rPr>
+              <w:t>Actor principal</w:t>
+            </w:r>
+          </w:p>
+        </w:tc>
+        <w:tc>
+          <w:tcPr>
+            <w:tcW w:type="dxa" w:w="7704"/>
+            <w:vAlign w:val="center"/>
+            <w:tcMar>
+              <w:top w:w="100" w:type="dxa"/>
+              <w:start w:w="120" w:type="dxa"/>
+              <w:bottom w:w="100" w:type="dxa"/>
+              <w:end w:w="120" w:type="dxa"/>
+            </w:tcMar>
+          </w:tcPr>
+          <w:p>
+            <w:pPr>
+              <w:spacing w:after="40" w:before="40"/>
+            </w:pPr>
+            <w:r>
+              <w:rPr>
+                <w:rFonts w:ascii="Arial" w:hAnsi="Arial"/>
+                <w:sz w:val="19"/>
               </w:rPr>
               <w:t>Administrador</w:t>
             </w:r>
@@ -904,76 +3440,51 @@
       <w:tr>
         <w:tc>
           <w:tcPr>
-            <w:tcW w:type="dxa" w:w="936"/>
+            <w:tcW w:type="dxa" w:w="2376"/>
             <w:vAlign w:val="center"/>
-            <w:shd w:fill="FFFFFF"/>
-            <w:tcBorders>
-              <w:top w:val="single" w:sz="4" w:color="D9D9D9"/>
-              <w:left w:val="single" w:sz="4" w:color="D9D9D9"/>
-              <w:bottom w:val="single" w:sz="4" w:color="D9D9D9"/>
-              <w:right w:val="single" w:sz="4" w:color="D9D9D9"/>
-            </w:tcBorders>
+            <w:tcMar>
+              <w:top w:w="100" w:type="dxa"/>
+              <w:start w:w="120" w:type="dxa"/>
+              <w:bottom w:w="100" w:type="dxa"/>
+              <w:end w:w="120" w:type="dxa"/>
+            </w:tcMar>
+            <w:shd w:fill="EAF2F8"/>
           </w:tcPr>
           <w:p>
             <w:pPr>
-              <w:spacing w:before="80" w:after="80"/>
+              <w:spacing w:after="40" w:before="40"/>
             </w:pPr>
             <w:r>
               <w:rPr>
-                <w:b w:val="0"/>
-                <w:sz w:val="20"/>
+                <w:rFonts w:ascii="Arial" w:hAnsi="Arial"/>
+                <w:sz w:val="19"/>
               </w:rPr>
-              <w:t>CU-07</w:t>
+              <w:t>Objetivo</w:t>
             </w:r>
           </w:p>
         </w:tc>
         <w:tc>
           <w:tcPr>
-            <w:tcW w:type="dxa" w:w="4608"/>
+            <w:tcW w:type="dxa" w:w="7704"/>
             <w:vAlign w:val="center"/>
-            <w:shd w:fill="FFFFFF"/>
-            <w:tcBorders>
-              <w:top w:val="single" w:sz="4" w:color="D9D9D9"/>
-              <w:left w:val="single" w:sz="4" w:color="D9D9D9"/>
-              <w:bottom w:val="single" w:sz="4" w:color="D9D9D9"/>
-              <w:right w:val="single" w:sz="4" w:color="D9D9D9"/>
-            </w:tcBorders>
+            <w:tcMar>
+              <w:top w:w="100" w:type="dxa"/>
+              <w:start w:w="120" w:type="dxa"/>
+              <w:bottom w:w="100" w:type="dxa"/>
+              <w:end w:w="120" w:type="dxa"/>
+            </w:tcMar>
+            <w:shd w:fill="EAF2F8"/>
           </w:tcPr>
           <w:p>
             <w:pPr>
-              <w:spacing w:before="80" w:after="80"/>
+              <w:spacing w:after="40" w:before="40"/>
             </w:pPr>
             <w:r>
               <w:rPr>
-                <w:b w:val="0"/>
-                <w:sz w:val="20"/>
+                <w:rFonts w:ascii="Arial" w:hAnsi="Arial"/>
+                <w:sz w:val="19"/>
               </w:rPr>
-              <w:t>Registrar Cliente</w:t>
-            </w:r>
-          </w:p>
-        </w:tc>
-        <w:tc>
-          <w:tcPr>
-            <w:tcW w:type="dxa" w:w="4392"/>
-            <w:vAlign w:val="center"/>
-            <w:shd w:fill="FFFFFF"/>
-            <w:tcBorders>
-              <w:top w:val="single" w:sz="4" w:color="D9D9D9"/>
-              <w:left w:val="single" w:sz="4" w:color="D9D9D9"/>
-              <w:bottom w:val="single" w:sz="4" w:color="D9D9D9"/>
-              <w:right w:val="single" w:sz="4" w:color="D9D9D9"/>
-            </w:tcBorders>
-          </w:tcPr>
-          <w:p>
-            <w:pPr>
-              <w:spacing w:before="80" w:after="80"/>
-            </w:pPr>
-            <w:r>
-              <w:rPr>
-                <w:b w:val="0"/>
-                <w:sz w:val="20"/>
-              </w:rPr>
-              <w:t>Persona que desea registrarse</w:t>
+              <w:t>Agregar, modificar o eliminar servicios y establecer sus importes.</w:t>
             </w:r>
           </w:p>
         </w:tc>
@@ -981,76 +3492,49 @@
       <w:tr>
         <w:tc>
           <w:tcPr>
-            <w:tcW w:type="dxa" w:w="936"/>
+            <w:tcW w:type="dxa" w:w="2376"/>
             <w:vAlign w:val="center"/>
-            <w:shd w:fill="FFFFFF"/>
-            <w:tcBorders>
-              <w:top w:val="single" w:sz="4" w:color="D9D9D9"/>
-              <w:left w:val="single" w:sz="4" w:color="D9D9D9"/>
-              <w:bottom w:val="single" w:sz="4" w:color="D9D9D9"/>
-              <w:right w:val="single" w:sz="4" w:color="D9D9D9"/>
-            </w:tcBorders>
+            <w:tcMar>
+              <w:top w:w="100" w:type="dxa"/>
+              <w:start w:w="120" w:type="dxa"/>
+              <w:bottom w:w="100" w:type="dxa"/>
+              <w:end w:w="120" w:type="dxa"/>
+            </w:tcMar>
           </w:tcPr>
           <w:p>
             <w:pPr>
-              <w:spacing w:before="80" w:after="80"/>
+              <w:spacing w:after="40" w:before="40"/>
             </w:pPr>
             <w:r>
               <w:rPr>
-                <w:b w:val="0"/>
-                <w:sz w:val="20"/>
+                <w:rFonts w:ascii="Arial" w:hAnsi="Arial"/>
+                <w:sz w:val="19"/>
               </w:rPr>
-              <w:t>CU-08</w:t>
+              <w:t>Precondiciones</w:t>
             </w:r>
           </w:p>
         </w:tc>
         <w:tc>
           <w:tcPr>
-            <w:tcW w:type="dxa" w:w="4608"/>
+            <w:tcW w:type="dxa" w:w="7704"/>
             <w:vAlign w:val="center"/>
-            <w:shd w:fill="FFFFFF"/>
-            <w:tcBorders>
-              <w:top w:val="single" w:sz="4" w:color="D9D9D9"/>
-              <w:left w:val="single" w:sz="4" w:color="D9D9D9"/>
-              <w:bottom w:val="single" w:sz="4" w:color="D9D9D9"/>
-              <w:right w:val="single" w:sz="4" w:color="D9D9D9"/>
-            </w:tcBorders>
+            <w:tcMar>
+              <w:top w:w="100" w:type="dxa"/>
+              <w:start w:w="120" w:type="dxa"/>
+              <w:bottom w:w="100" w:type="dxa"/>
+              <w:end w:w="120" w:type="dxa"/>
+            </w:tcMar>
           </w:tcPr>
           <w:p>
             <w:pPr>
-              <w:spacing w:before="80" w:after="80"/>
+              <w:spacing w:after="40" w:before="40"/>
             </w:pPr>
             <w:r>
               <w:rPr>
-                <w:b w:val="0"/>
-                <w:sz w:val="20"/>
+                <w:rFonts w:ascii="Arial" w:hAnsi="Arial"/>
+                <w:sz w:val="19"/>
               </w:rPr>
-              <w:t>Iniciar Sesión</w:t>
-            </w:r>
-          </w:p>
-        </w:tc>
-        <w:tc>
-          <w:tcPr>
-            <w:tcW w:type="dxa" w:w="4392"/>
-            <w:vAlign w:val="center"/>
-            <w:shd w:fill="FFFFFF"/>
-            <w:tcBorders>
-              <w:top w:val="single" w:sz="4" w:color="D9D9D9"/>
-              <w:left w:val="single" w:sz="4" w:color="D9D9D9"/>
-              <w:bottom w:val="single" w:sz="4" w:color="D9D9D9"/>
-              <w:right w:val="single" w:sz="4" w:color="D9D9D9"/>
-            </w:tcBorders>
-          </w:tcPr>
-          <w:p>
-            <w:pPr>
-              <w:spacing w:before="80" w:after="80"/>
-            </w:pPr>
-            <w:r>
-              <w:rPr>
-                <w:b w:val="0"/>
-                <w:sz w:val="20"/>
-              </w:rPr>
-              <w:t>Cliente o Personal</w:t>
+              <w:t>Administrador autenticado con permisos sobre el catálogo.</w:t>
             </w:r>
           </w:p>
         </w:tc>
@@ -1058,384 +3542,51 @@
       <w:tr>
         <w:tc>
           <w:tcPr>
-            <w:tcW w:type="dxa" w:w="936"/>
+            <w:tcW w:type="dxa" w:w="2376"/>
             <w:vAlign w:val="center"/>
-            <w:shd w:fill="FFFFFF"/>
-            <w:tcBorders>
-              <w:top w:val="single" w:sz="4" w:color="D9D9D9"/>
-              <w:left w:val="single" w:sz="4" w:color="D9D9D9"/>
-              <w:bottom w:val="single" w:sz="4" w:color="D9D9D9"/>
-              <w:right w:val="single" w:sz="4" w:color="D9D9D9"/>
-            </w:tcBorders>
+            <w:tcMar>
+              <w:top w:w="100" w:type="dxa"/>
+              <w:start w:w="120" w:type="dxa"/>
+              <w:bottom w:w="100" w:type="dxa"/>
+              <w:end w:w="120" w:type="dxa"/>
+            </w:tcMar>
+            <w:shd w:fill="EAF2F8"/>
           </w:tcPr>
           <w:p>
             <w:pPr>
-              <w:spacing w:before="80" w:after="80"/>
+              <w:spacing w:after="40" w:before="40"/>
             </w:pPr>
             <w:r>
               <w:rPr>
-                <w:b w:val="0"/>
-                <w:sz w:val="20"/>
+                <w:rFonts w:ascii="Arial" w:hAnsi="Arial"/>
+                <w:sz w:val="19"/>
               </w:rPr>
-              <w:t>CU-09</w:t>
+              <w:t>Reglas relacionadas</w:t>
             </w:r>
           </w:p>
         </w:tc>
         <w:tc>
           <w:tcPr>
-            <w:tcW w:type="dxa" w:w="4608"/>
+            <w:tcW w:type="dxa" w:w="7704"/>
             <w:vAlign w:val="center"/>
-            <w:shd w:fill="FFFFFF"/>
-            <w:tcBorders>
-              <w:top w:val="single" w:sz="4" w:color="D9D9D9"/>
-              <w:left w:val="single" w:sz="4" w:color="D9D9D9"/>
-              <w:bottom w:val="single" w:sz="4" w:color="D9D9D9"/>
-              <w:right w:val="single" w:sz="4" w:color="D9D9D9"/>
-            </w:tcBorders>
+            <w:tcMar>
+              <w:top w:w="100" w:type="dxa"/>
+              <w:start w:w="120" w:type="dxa"/>
+              <w:bottom w:w="100" w:type="dxa"/>
+              <w:end w:w="120" w:type="dxa"/>
+            </w:tcMar>
+            <w:shd w:fill="EAF2F8"/>
           </w:tcPr>
           <w:p>
             <w:pPr>
-              <w:spacing w:before="80" w:after="80"/>
+              <w:spacing w:after="40" w:before="40"/>
             </w:pPr>
             <w:r>
               <w:rPr>
-                <w:b w:val="0"/>
-                <w:sz w:val="20"/>
+                <w:rFonts w:ascii="Arial" w:hAnsi="Arial"/>
+                <w:sz w:val="19"/>
               </w:rPr>
-              <w:t>Consultar Disponibilidad</w:t>
-            </w:r>
-          </w:p>
-        </w:tc>
-        <w:tc>
-          <w:tcPr>
-            <w:tcW w:type="dxa" w:w="4392"/>
-            <w:vAlign w:val="center"/>
-            <w:shd w:fill="FFFFFF"/>
-            <w:tcBorders>
-              <w:top w:val="single" w:sz="4" w:color="D9D9D9"/>
-              <w:left w:val="single" w:sz="4" w:color="D9D9D9"/>
-              <w:bottom w:val="single" w:sz="4" w:color="D9D9D9"/>
-              <w:right w:val="single" w:sz="4" w:color="D9D9D9"/>
-            </w:tcBorders>
-          </w:tcPr>
-          <w:p>
-            <w:pPr>
-              <w:spacing w:before="80" w:after="80"/>
-            </w:pPr>
-            <w:r>
-              <w:rPr>
-                <w:b w:val="0"/>
-                <w:sz w:val="20"/>
-              </w:rPr>
-              <w:t>Cliente o Personal</w:t>
-            </w:r>
-          </w:p>
-        </w:tc>
-      </w:tr>
-      <w:tr>
-        <w:tc>
-          <w:tcPr>
-            <w:tcW w:type="dxa" w:w="936"/>
-            <w:vAlign w:val="center"/>
-            <w:shd w:fill="FFFFFF"/>
-            <w:tcBorders>
-              <w:top w:val="single" w:sz="4" w:color="D9D9D9"/>
-              <w:left w:val="single" w:sz="4" w:color="D9D9D9"/>
-              <w:bottom w:val="single" w:sz="4" w:color="D9D9D9"/>
-              <w:right w:val="single" w:sz="4" w:color="D9D9D9"/>
-            </w:tcBorders>
-          </w:tcPr>
-          <w:p>
-            <w:pPr>
-              <w:spacing w:before="80" w:after="80"/>
-            </w:pPr>
-            <w:r>
-              <w:rPr>
-                <w:b w:val="0"/>
-                <w:sz w:val="20"/>
-              </w:rPr>
-              <w:t>CU-10</w:t>
-            </w:r>
-          </w:p>
-        </w:tc>
-        <w:tc>
-          <w:tcPr>
-            <w:tcW w:type="dxa" w:w="4608"/>
-            <w:vAlign w:val="center"/>
-            <w:shd w:fill="FFFFFF"/>
-            <w:tcBorders>
-              <w:top w:val="single" w:sz="4" w:color="D9D9D9"/>
-              <w:left w:val="single" w:sz="4" w:color="D9D9D9"/>
-              <w:bottom w:val="single" w:sz="4" w:color="D9D9D9"/>
-              <w:right w:val="single" w:sz="4" w:color="D9D9D9"/>
-            </w:tcBorders>
-          </w:tcPr>
-          <w:p>
-            <w:pPr>
-              <w:spacing w:before="80" w:after="80"/>
-            </w:pPr>
-            <w:r>
-              <w:rPr>
-                <w:b w:val="0"/>
-                <w:sz w:val="20"/>
-              </w:rPr>
-              <w:t>Consultar Turnos Propios</w:t>
-            </w:r>
-          </w:p>
-        </w:tc>
-        <w:tc>
-          <w:tcPr>
-            <w:tcW w:type="dxa" w:w="4392"/>
-            <w:vAlign w:val="center"/>
-            <w:shd w:fill="FFFFFF"/>
-            <w:tcBorders>
-              <w:top w:val="single" w:sz="4" w:color="D9D9D9"/>
-              <w:left w:val="single" w:sz="4" w:color="D9D9D9"/>
-              <w:bottom w:val="single" w:sz="4" w:color="D9D9D9"/>
-              <w:right w:val="single" w:sz="4" w:color="D9D9D9"/>
-            </w:tcBorders>
-          </w:tcPr>
-          <w:p>
-            <w:pPr>
-              <w:spacing w:before="80" w:after="80"/>
-            </w:pPr>
-            <w:r>
-              <w:rPr>
-                <w:b w:val="0"/>
-                <w:sz w:val="20"/>
-              </w:rPr>
-              <w:t>Cliente</w:t>
-            </w:r>
-          </w:p>
-        </w:tc>
-      </w:tr>
-      <w:tr>
-        <w:tc>
-          <w:tcPr>
-            <w:tcW w:type="dxa" w:w="936"/>
-            <w:vAlign w:val="center"/>
-            <w:shd w:fill="FFFFFF"/>
-            <w:tcBorders>
-              <w:top w:val="single" w:sz="4" w:color="D9D9D9"/>
-              <w:left w:val="single" w:sz="4" w:color="D9D9D9"/>
-              <w:bottom w:val="single" w:sz="4" w:color="D9D9D9"/>
-              <w:right w:val="single" w:sz="4" w:color="D9D9D9"/>
-            </w:tcBorders>
-          </w:tcPr>
-          <w:p>
-            <w:pPr>
-              <w:spacing w:before="80" w:after="80"/>
-            </w:pPr>
-            <w:r>
-              <w:rPr>
-                <w:b w:val="0"/>
-                <w:sz w:val="20"/>
-              </w:rPr>
-              <w:t>CU-11</w:t>
-            </w:r>
-          </w:p>
-        </w:tc>
-        <w:tc>
-          <w:tcPr>
-            <w:tcW w:type="dxa" w:w="4608"/>
-            <w:vAlign w:val="center"/>
-            <w:shd w:fill="FFFFFF"/>
-            <w:tcBorders>
-              <w:top w:val="single" w:sz="4" w:color="D9D9D9"/>
-              <w:left w:val="single" w:sz="4" w:color="D9D9D9"/>
-              <w:bottom w:val="single" w:sz="4" w:color="D9D9D9"/>
-              <w:right w:val="single" w:sz="4" w:color="D9D9D9"/>
-            </w:tcBorders>
-          </w:tcPr>
-          <w:p>
-            <w:pPr>
-              <w:spacing w:before="80" w:after="80"/>
-            </w:pPr>
-            <w:r>
-              <w:rPr>
-                <w:b w:val="0"/>
-                <w:sz w:val="20"/>
-              </w:rPr>
-              <w:t>Consultar Agenda Diaria</w:t>
-            </w:r>
-          </w:p>
-        </w:tc>
-        <w:tc>
-          <w:tcPr>
-            <w:tcW w:type="dxa" w:w="4392"/>
-            <w:vAlign w:val="center"/>
-            <w:shd w:fill="FFFFFF"/>
-            <w:tcBorders>
-              <w:top w:val="single" w:sz="4" w:color="D9D9D9"/>
-              <w:left w:val="single" w:sz="4" w:color="D9D9D9"/>
-              <w:bottom w:val="single" w:sz="4" w:color="D9D9D9"/>
-              <w:right w:val="single" w:sz="4" w:color="D9D9D9"/>
-            </w:tcBorders>
-          </w:tcPr>
-          <w:p>
-            <w:pPr>
-              <w:spacing w:before="80" w:after="80"/>
-            </w:pPr>
-            <w:r>
-              <w:rPr>
-                <w:b w:val="0"/>
-                <w:sz w:val="20"/>
-              </w:rPr>
-              <w:t>Empleado o Administrador</w:t>
-            </w:r>
-          </w:p>
-        </w:tc>
-      </w:tr>
-      <w:tr>
-        <w:tc>
-          <w:tcPr>
-            <w:tcW w:type="dxa" w:w="936"/>
-            <w:vAlign w:val="center"/>
-            <w:shd w:fill="FFFFFF"/>
-            <w:tcBorders>
-              <w:top w:val="single" w:sz="4" w:color="D9D9D9"/>
-              <w:left w:val="single" w:sz="4" w:color="D9D9D9"/>
-              <w:bottom w:val="single" w:sz="4" w:color="D9D9D9"/>
-              <w:right w:val="single" w:sz="4" w:color="D9D9D9"/>
-            </w:tcBorders>
-          </w:tcPr>
-          <w:p>
-            <w:pPr>
-              <w:spacing w:before="80" w:after="80"/>
-            </w:pPr>
-            <w:r>
-              <w:rPr>
-                <w:b w:val="0"/>
-                <w:sz w:val="20"/>
-              </w:rPr>
-              <w:t>CU-12</w:t>
-            </w:r>
-          </w:p>
-        </w:tc>
-        <w:tc>
-          <w:tcPr>
-            <w:tcW w:type="dxa" w:w="4608"/>
-            <w:vAlign w:val="center"/>
-            <w:shd w:fill="FFFFFF"/>
-            <w:tcBorders>
-              <w:top w:val="single" w:sz="4" w:color="D9D9D9"/>
-              <w:left w:val="single" w:sz="4" w:color="D9D9D9"/>
-              <w:bottom w:val="single" w:sz="4" w:color="D9D9D9"/>
-              <w:right w:val="single" w:sz="4" w:color="D9D9D9"/>
-            </w:tcBorders>
-          </w:tcPr>
-          <w:p>
-            <w:pPr>
-              <w:spacing w:before="80" w:after="80"/>
-            </w:pPr>
-            <w:r>
-              <w:rPr>
-                <w:b w:val="0"/>
-                <w:sz w:val="20"/>
-              </w:rPr>
-              <w:t>Gestionar Clientes</w:t>
-            </w:r>
-          </w:p>
-        </w:tc>
-        <w:tc>
-          <w:tcPr>
-            <w:tcW w:type="dxa" w:w="4392"/>
-            <w:vAlign w:val="center"/>
-            <w:shd w:fill="FFFFFF"/>
-            <w:tcBorders>
-              <w:top w:val="single" w:sz="4" w:color="D9D9D9"/>
-              <w:left w:val="single" w:sz="4" w:color="D9D9D9"/>
-              <w:bottom w:val="single" w:sz="4" w:color="D9D9D9"/>
-              <w:right w:val="single" w:sz="4" w:color="D9D9D9"/>
-            </w:tcBorders>
-          </w:tcPr>
-          <w:p>
-            <w:pPr>
-              <w:spacing w:before="80" w:after="80"/>
-            </w:pPr>
-            <w:r>
-              <w:rPr>
-                <w:b w:val="0"/>
-                <w:sz w:val="20"/>
-              </w:rPr>
-              <w:t>Personal y Cliente propietario</w:t>
-            </w:r>
-          </w:p>
-        </w:tc>
-      </w:tr>
-      <w:tr>
-        <w:tc>
-          <w:tcPr>
-            <w:tcW w:type="dxa" w:w="936"/>
-            <w:vAlign w:val="center"/>
-            <w:shd w:fill="FFFFFF"/>
-            <w:tcBorders>
-              <w:top w:val="single" w:sz="4" w:color="D9D9D9"/>
-              <w:left w:val="single" w:sz="4" w:color="D9D9D9"/>
-              <w:bottom w:val="single" w:sz="4" w:color="D9D9D9"/>
-              <w:right w:val="single" w:sz="4" w:color="D9D9D9"/>
-            </w:tcBorders>
-          </w:tcPr>
-          <w:p>
-            <w:pPr>
-              <w:spacing w:before="80" w:after="80"/>
-            </w:pPr>
-            <w:r>
-              <w:rPr>
-                <w:b w:val="0"/>
-                <w:sz w:val="20"/>
-              </w:rPr>
-              <w:t>CU-13</w:t>
-            </w:r>
-          </w:p>
-        </w:tc>
-        <w:tc>
-          <w:tcPr>
-            <w:tcW w:type="dxa" w:w="4608"/>
-            <w:vAlign w:val="center"/>
-            <w:shd w:fill="FFFFFF"/>
-            <w:tcBorders>
-              <w:top w:val="single" w:sz="4" w:color="D9D9D9"/>
-              <w:left w:val="single" w:sz="4" w:color="D9D9D9"/>
-              <w:bottom w:val="single" w:sz="4" w:color="D9D9D9"/>
-              <w:right w:val="single" w:sz="4" w:color="D9D9D9"/>
-            </w:tcBorders>
-          </w:tcPr>
-          <w:p>
-            <w:pPr>
-              <w:spacing w:before="80" w:after="80"/>
-            </w:pPr>
-            <w:r>
-              <w:rPr>
-                <w:b w:val="0"/>
-                <w:sz w:val="20"/>
-              </w:rPr>
-              <w:t>Consultar Servicios</w:t>
-            </w:r>
-          </w:p>
-        </w:tc>
-        <w:tc>
-          <w:tcPr>
-            <w:tcW w:type="dxa" w:w="4392"/>
-            <w:vAlign w:val="center"/>
-            <w:shd w:fill="FFFFFF"/>
-            <w:tcBorders>
-              <w:top w:val="single" w:sz="4" w:color="D9D9D9"/>
-              <w:left w:val="single" w:sz="4" w:color="D9D9D9"/>
-              <w:bottom w:val="single" w:sz="4" w:color="D9D9D9"/>
-              <w:right w:val="single" w:sz="4" w:color="D9D9D9"/>
-            </w:tcBorders>
-          </w:tcPr>
-          <w:p>
-            <w:pPr>
-              <w:spacing w:before="80" w:after="80"/>
-            </w:pPr>
-            <w:r>
-              <w:rPr>
-                <w:b w:val="0"/>
-                <w:sz w:val="20"/>
-              </w:rPr>
-              <w:t>Cliente o Personal</w:t>
+              <w:t>RN-07, RN-08 y RN-09.</w:t>
             </w:r>
           </w:p>
         </w:tc>
@@ -1444,38 +3595,154 @@
     <w:p/>
     <w:p>
       <w:pPr>
-        <w:pStyle w:val="Heading1"/>
+        <w:pStyle w:val="Heading2"/>
       </w:pPr>
       <w:r>
-        <w:t>Reglas comunes</w:t>
-      </w:r>
-    </w:p>
-    <w:p>
-      <w:r>
-        <w:t>Los turnos deben ser futuros y no compartir fecha y hora con otro turno confirmado. Cada turno referencia un cliente existente y un servicio activo. Solo se modifican o cancelan turnos confirmados y futuros. Los clientes operan exclusivamente sobre sus propios turnos.</w:t>
-      </w:r>
-    </w:p>
-    <w:p>
-      <w:r>
-        <w:t>El administrador gestiona servicios con nombres únicos e importes positivos. Un servicio relacionado con turnos no se elimina. Los avisos respetan las preferencias de notificación y requieren un correo válido.</w:t>
+        <w:t>Flujo principal</w:t>
       </w:r>
     </w:p>
     <w:p>
       <w:pPr>
-        <w:pStyle w:val="Heading1"/>
+        <w:spacing w:after="60"/>
+        <w:ind w:left="360" w:hanging="360"/>
       </w:pPr>
       <w:r>
-        <w:t>Documentación de referencia</w:t>
+        <w:t>1.  El administrador consulta el catálogo.</w:t>
       </w:r>
     </w:p>
     <w:p>
+      <w:pPr>
+        <w:spacing w:after="60"/>
+        <w:ind w:left="360" w:hanging="360"/>
+      </w:pPr>
       <w:r>
-        <w:t>Consultar README.md, Alcance del Sistema.md, Reglas de Negocio.md y TRAZABILIDAD.md en Documentos/Entregas TP. Para ejecutar la API y configurar SMTP, consultar Documentos/GUIA-TECNICA.md y Documentos/RECORDATORIOS.md.</w:t>
+        <w:t>2.  Selecciona alta, modificación o eliminación.</w:t>
+      </w:r>
+    </w:p>
+    <w:p>
+      <w:pPr>
+        <w:spacing w:after="60"/>
+        <w:ind w:left="360" w:hanging="360"/>
+      </w:pPr>
+      <w:r>
+        <w:t>3.  Ingresa o modifica el nombre y el importe.</w:t>
+      </w:r>
+    </w:p>
+    <w:p>
+      <w:pPr>
+        <w:spacing w:after="60"/>
+        <w:ind w:left="360" w:hanging="360"/>
+      </w:pPr>
+      <w:r>
+        <w:t>4.  El sistema valida unicidad, importe y relaciones antes de guardar.</w:t>
+      </w:r>
+    </w:p>
+    <w:p>
+      <w:pPr>
+        <w:spacing w:after="60"/>
+        <w:ind w:left="360" w:hanging="360"/>
+      </w:pPr>
+      <w:r>
+        <w:t>5.  El sistema confirma la operación.</w:t>
+      </w:r>
+    </w:p>
+    <w:p>
+      <w:pPr>
+        <w:pStyle w:val="Heading2"/>
+      </w:pPr>
+      <w:r>
+        <w:t>Flujos alternativos</w:t>
+      </w:r>
+    </w:p>
+    <w:p>
+      <w:pPr>
+        <w:pStyle w:val="ListBullet"/>
+        <w:spacing w:after="80"/>
+      </w:pPr>
+      <w:r>
+        <w:rPr>
+          <w:b/>
+        </w:rPr>
+        <w:t xml:space="preserve">Nombre duplicado: </w:t>
+      </w:r>
+      <w:r>
+        <w:t>el sistema informa el conflicto.</w:t>
+      </w:r>
+    </w:p>
+    <w:p>
+      <w:pPr>
+        <w:pStyle w:val="ListBullet"/>
+        <w:spacing w:after="80"/>
+      </w:pPr>
+      <w:r>
+        <w:rPr>
+          <w:b/>
+        </w:rPr>
+        <w:t xml:space="preserve">Importe inválido: </w:t>
+      </w:r>
+      <w:r>
+        <w:t>el sistema exige un valor mayor que cero.</w:t>
+      </w:r>
+    </w:p>
+    <w:p>
+      <w:pPr>
+        <w:pStyle w:val="ListBullet"/>
+        <w:spacing w:after="80"/>
+      </w:pPr>
+      <w:r>
+        <w:rPr>
+          <w:b/>
+        </w:rPr>
+        <w:t xml:space="preserve">Servicio con turnos: </w:t>
+      </w:r>
+      <w:r>
+        <w:t>el sistema impide su eliminación para conservar la integridad.</w:t>
+      </w:r>
+    </w:p>
+    <w:p>
+      <w:pPr>
+        <w:pStyle w:val="ListBullet"/>
+        <w:spacing w:after="80"/>
+      </w:pPr>
+      <w:r>
+        <w:rPr>
+          <w:b/>
+        </w:rPr>
+        <w:t xml:space="preserve">Operación cancelada: </w:t>
+      </w:r>
+      <w:r>
+        <w:t>el catálogo permanece sin cambios.</w:t>
+      </w:r>
+    </w:p>
+    <w:p>
+      <w:pPr>
+        <w:pStyle w:val="Heading2"/>
+      </w:pPr>
+      <w:r>
+        <w:t>Postcondiciones</w:t>
+      </w:r>
+    </w:p>
+    <w:p>
+      <w:pPr>
+        <w:pStyle w:val="ListBullet"/>
+        <w:spacing w:after="60"/>
+      </w:pPr>
+      <w:r>
+        <w:t>El catálogo queda actualizado.</w:t>
+      </w:r>
+    </w:p>
+    <w:p>
+      <w:pPr>
+        <w:pStyle w:val="ListBullet"/>
+        <w:spacing w:after="60"/>
+      </w:pPr>
+      <w:r>
+        <w:t>Los cambios son visibles al consultar o reservar turnos.</w:t>
       </w:r>
     </w:p>
     <w:sectPr>
       <w:pgSz w:w="12240" w:h="15840"/>
-      <w:pgMar w:top="1080" w:right="1152" w:bottom="1080" w:left="1152" w:header="720" w:footer="720" w:gutter="0"/>
+      <w:pgMar w:top="1008" w:right="1080" w:bottom="1008" w:left="1080" w:header="720" w:footer="720" w:gutter="0"/>
       <w:cols w:space="720"/>
       <w:docGrid w:linePitch="360"/>
     </w:sectPr>
@@ -1850,7 +4117,7 @@
       <w:spacing w:after="120" w:line="259" w:lineRule="auto"/>
     </w:pPr>
     <w:rPr>
-      <w:rFonts w:ascii="Calibri" w:hAnsi="Calibri"/>
+      <w:rFonts w:ascii="Arial" w:hAnsi="Arial"/>
       <w:color w:val="000000"/>
       <w:sz w:val="21"/>
     </w:rPr>
@@ -1914,11 +4181,11 @@
       <w:outlineLvl w:val="0"/>
     </w:pPr>
     <w:rPr>
-      <w:rFonts w:asciiTheme="majorHAnsi" w:eastAsiaTheme="majorEastAsia" w:hAnsiTheme="majorHAnsi" w:cstheme="majorBidi" w:ascii="Calibri" w:hAnsi="Calibri"/>
+      <w:rFonts w:asciiTheme="majorHAnsi" w:eastAsiaTheme="majorEastAsia" w:hAnsiTheme="majorHAnsi" w:cstheme="majorBidi" w:ascii="Arial" w:hAnsi="Arial"/>
       <w:b/>
       <w:bCs/>
       <w:color w:val="000000"/>
-      <w:sz w:val="30"/>
+      <w:sz w:val="32"/>
       <w:szCs w:val="28"/>
     </w:rPr>
   </w:style>
@@ -1938,7 +4205,7 @@
       <w:outlineLvl w:val="1"/>
     </w:pPr>
     <w:rPr>
-      <w:rFonts w:asciiTheme="majorHAnsi" w:eastAsiaTheme="majorEastAsia" w:hAnsiTheme="majorHAnsi" w:cstheme="majorBidi" w:ascii="Calibri" w:hAnsi="Calibri"/>
+      <w:rFonts w:asciiTheme="majorHAnsi" w:eastAsiaTheme="majorEastAsia" w:hAnsiTheme="majorHAnsi" w:cstheme="majorBidi" w:ascii="Arial" w:hAnsi="Arial"/>
       <w:b/>
       <w:bCs/>
       <w:color w:val="000000"/>
@@ -2200,12 +4467,12 @@
       <w:contextualSpacing/>
     </w:pPr>
     <w:rPr>
-      <w:rFonts w:asciiTheme="majorHAnsi" w:eastAsiaTheme="majorEastAsia" w:hAnsiTheme="majorHAnsi" w:cstheme="majorBidi" w:ascii="Calibri" w:hAnsi="Calibri"/>
+      <w:rFonts w:asciiTheme="majorHAnsi" w:eastAsiaTheme="majorEastAsia" w:hAnsiTheme="majorHAnsi" w:cstheme="majorBidi" w:ascii="Arial" w:hAnsi="Arial"/>
       <w:b/>
       <w:color w:val="000000"/>
       <w:spacing w:val="5"/>
       <w:kern w:val="28"/>
-      <w:sz w:val="44"/>
+      <w:sz w:val="48"/>
       <w:szCs w:val="52"/>
     </w:rPr>
   </w:style>
@@ -2238,10 +4505,10 @@
       </w:numPr>
     </w:pPr>
     <w:rPr>
-      <w:rFonts w:asciiTheme="majorHAnsi" w:eastAsiaTheme="majorEastAsia" w:hAnsiTheme="majorHAnsi" w:cstheme="majorBidi" w:ascii="Calibri" w:hAnsi="Calibri"/>
+      <w:rFonts w:asciiTheme="majorHAnsi" w:eastAsiaTheme="majorEastAsia" w:hAnsiTheme="majorHAnsi" w:cstheme="majorBidi"/>
       <w:i/>
       <w:iCs/>
-      <w:color w:val="000000"/>
+      <w:color w:val="4F81BD" w:themeColor="accent1"/>
       <w:spacing w:val="15"/>
       <w:sz w:val="24"/>
       <w:szCs w:val="24"/>

</xml_diff>